<commit_message>
27P.2 — teleport purge: all register changes navigated; empty-thread + date-roll fixes; teleport auditor added to QA
</commit_message>
<xml_diff>
--- a/L5Y-Cue-Bible.docx
+++ b/L5Y-Cue-Bible.docx
@@ -7341,7 +7341,7 @@
           <w:sz w:val="19"/>
           <w:szCs w:val="19"/>
         </w:rPr>
-        <w:t xml:space="preserve">HER phone, still. He forwards her his own train receipt — that is how she finds out he is going back tomorrow night.</w:t>
+        <w:t xml:space="preserve">Still in Facebook when the banner drops over the likes: Fwd from Jamie. She leaves Facebook, opens Mail — his forward sits on top, unread.</w:t>
       </w:r>
     </w:p>
     <w:p>
@@ -7375,6 +7375,32 @@
           <w:sz w:val="18"/>
           <w:szCs w:val="18"/>
         </w:rPr>
+        <w:t xml:space="preserve">NOTIFICATION — Mail · Jamie (now): </w:t>
+      </w:r>
+      <w:r>
+        <w:rPr>
+          <w:rFonts w:ascii="Courier New" w:cs="Courier New" w:eastAsia="Courier New" w:hAnsi="Courier New"/>
+          <w:color w:val="1a1d26"/>
+          <w:sz w:val="18"/>
+          <w:szCs w:val="18"/>
+        </w:rPr>
+        <w:t xml:space="preserve">“Fwd: Your eTicket — TOMORROW 7:15 PM”</w:t>
+      </w:r>
+    </w:p>
+    <w:p>
+      <w:pPr>
+        <w:spacing w:after="14"/>
+        <w:ind w:left="280"/>
+      </w:pPr>
+      <w:r>
+        <w:rPr>
+          <w:rFonts w:ascii="Courier New" w:cs="Courier New" w:eastAsia="Courier New" w:hAnsi="Courier New"/>
+          <w:b/>
+          <w:bCs/>
+          <w:color w:val="1a1d26"/>
+          <w:sz w:val="18"/>
+          <w:szCs w:val="18"/>
+        </w:rPr>
         <w:t xml:space="preserve">INBOX — loads whole, the instant the app opens: </w:t>
       </w:r>
       <w:r>
@@ -7410,6 +7436,32 @@
           <w:sz w:val="18"/>
           <w:szCs w:val="18"/>
         </w:rPr>
+        <w:t xml:space="preserve">Jamie ● — Fwd: Your eTicket — TOMORROW 7:15 PM — Amtrak: CLE → NYP · 1 passenger · J. Wellerstein (now)</w:t>
+      </w:r>
+    </w:p>
+    <w:p>
+      <w:pPr>
+        <w:spacing w:after="14"/>
+        <w:ind w:left="280"/>
+      </w:pPr>
+      <w:r>
+        <w:rPr>
+          <w:rFonts w:ascii="Courier New" w:cs="Courier New" w:eastAsia="Courier New" w:hAnsi="Courier New"/>
+          <w:b/>
+          <w:bCs/>
+          <w:color w:val="1a1d26"/>
+          <w:sz w:val="18"/>
+          <w:szCs w:val="18"/>
+        </w:rPr>
+        <w:t xml:space="preserve">   · </w:t>
+      </w:r>
+      <w:r>
+        <w:rPr>
+          <w:rFonts w:ascii="Courier New" w:cs="Courier New" w:eastAsia="Courier New" w:hAnsi="Courier New"/>
+          <w:color w:val="1a1d26"/>
+          <w:sz w:val="18"/>
+          <w:szCs w:val="18"/>
+        </w:rPr>
         <w:t xml:space="preserve">Summer Season (Ohio) — Week 6 — rehearsal schedule — Company call 10 AM · fittings after… (Yesterday)</w:t>
       </w:r>
     </w:p>
@@ -7545,32 +7597,6 @@
     </w:p>
     <w:p>
       <w:pPr>
-        <w:spacing w:after="14"/>
-        <w:ind w:left="280"/>
-      </w:pPr>
-      <w:r>
-        <w:rPr>
-          <w:rFonts w:ascii="Courier New" w:cs="Courier New" w:eastAsia="Courier New" w:hAnsi="Courier New"/>
-          <w:b/>
-          <w:bCs/>
-          <w:color w:val="1a1d26"/>
-          <w:sz w:val="18"/>
-          <w:szCs w:val="18"/>
-        </w:rPr>
-        <w:t xml:space="preserve">NEW MAIL — arrives live at the TOP of the inbox: </w:t>
-      </w:r>
-      <w:r>
-        <w:rPr>
-          <w:rFonts w:ascii="Courier New" w:cs="Courier New" w:eastAsia="Courier New" w:hAnsi="Courier New"/>
-          <w:color w:val="1a1d26"/>
-          <w:sz w:val="18"/>
-          <w:szCs w:val="18"/>
-        </w:rPr>
-        <w:t xml:space="preserve">Jamie ● — Fwd: Your eTicket — TOMORROW 7:15 PM — Amtrak: CLE → NYP · 1 passenger · J. Wellerstein (now)</w:t>
-      </w:r>
-    </w:p>
-    <w:p>
-      <w:pPr>
         <w:keepNext/>
         <w:spacing w:after="20" w:before="30"/>
       </w:pPr>
@@ -7598,7 +7624,7 @@
           <w:sz w:val="18"/>
           <w:szCs w:val="18"/>
         </w:rPr>
-        <w:t xml:space="preserve">UNLOCK — the lock slides up and away → home screen · sound: unlock swish</w:t>
+        <w:t xml:space="preserve">sound: receive ding</w:t>
       </w:r>
     </w:p>
     <w:p>
@@ -7633,21 +7659,6 @@
     </w:p>
     <w:p>
       <w:pPr>
-        <w:spacing w:after="14"/>
-        <w:ind w:left="280"/>
-      </w:pPr>
-      <w:r>
-        <w:rPr>
-          <w:rFonts w:ascii="Georgia" w:cs="Georgia" w:eastAsia="Georgia" w:hAnsi="Georgia"/>
-          <w:color w:val="3a3f4d"/>
-          <w:sz w:val="18"/>
-          <w:szCs w:val="18"/>
-        </w:rPr>
-        <w:t xml:space="preserve">sound: receive ding — the new row fades in above everything already there</w:t>
-      </w:r>
-    </w:p>
-    <w:p>
-      <w:pPr>
         <w:keepNext/>
         <w:spacing w:after="20" w:before="26"/>
       </w:pPr>
@@ -7675,7 +7686,7 @@
           <w:sz w:val="18"/>
           <w:szCs w:val="18"/>
         </w:rPr>
-        <w:t xml:space="preserve">unlock swish</w:t>
+        <w:t xml:space="preserve">notification tri-tone (soft)</w:t>
       </w:r>
     </w:p>
     <w:p>
@@ -7728,7 +7739,7 @@
           <w:sz w:val="18"/>
           <w:szCs w:val="18"/>
         </w:rPr>
-        <w:t xml:space="preserve">She finds out the way anyone finds out: a forwarded receipt. Fire on the blocking, not the score.</w:t>
+        <w:t xml:space="preserve">She finds out the way anyone finds out: a forwarded receipt over something happy. Fire on the blocking, not the score.</w:t>
       </w:r>
     </w:p>
     <w:p>
@@ -7852,7 +7863,7 @@
           <w:sz w:val="18"/>
           <w:szCs w:val="18"/>
         </w:rPr>
-        <w:t xml:space="preserve">2:41 · Tuesday, September 14</w:t>
+        <w:t xml:space="preserve">2:41 · Tuesday, September 14, 2021</w:t>
       </w:r>
     </w:p>
     <w:p>
@@ -12580,7 +12591,7 @@
           <w:sz w:val="18"/>
           <w:szCs w:val="18"/>
         </w:rPr>
-        <w:t xml:space="preserve">cut to Messages (instant)</w:t>
+        <w:t xml:space="preserve">OPENS Messages — closes the current app if one is open, a beat on the home screen, the thumb travels to the icon, presses, the app opens · sound: tap</w:t>
       </w:r>
     </w:p>
     <w:p>
@@ -13038,7 +13049,7 @@
           <w:sz w:val="19"/>
           <w:szCs w:val="19"/>
         </w:rPr>
-        <w:t xml:space="preserve">He posts the news.</w:t>
+        <w:t xml:space="preserve">He leaves Messages and posts the news.</w:t>
       </w:r>
     </w:p>
     <w:p>
@@ -13165,7 +13176,7 @@
           <w:sz w:val="18"/>
           <w:szCs w:val="18"/>
         </w:rPr>
-        <w:t xml:space="preserve">cut to Facebook (instant)</w:t>
+        <w:t xml:space="preserve">OPENS Facebook — closes the current app if one is open, a beat on the home screen, the thumb travels to the icon, presses, the app opens · sound: tap</w:t>
       </w:r>
     </w:p>
     <w:p>
@@ -14548,21 +14559,6 @@
     </w:p>
     <w:p>
       <w:pPr>
-        <w:spacing w:after="14"/>
-        <w:ind w:left="280"/>
-      </w:pPr>
-      <w:r>
-        <w:rPr>
-          <w:rFonts w:ascii="Georgia" w:cs="Georgia" w:eastAsia="Georgia" w:hAnsi="Georgia"/>
-          <w:color w:val="3a3f4d"/>
-          <w:sz w:val="18"/>
-          <w:szCs w:val="18"/>
-        </w:rPr>
-        <w:t xml:space="preserve">cut to Messages (instant)</w:t>
-      </w:r>
-    </w:p>
-    <w:p>
-      <w:pPr>
         <w:spacing w:after="14" w:before="30"/>
       </w:pPr>
       <w:r>
@@ -15488,7 +15484,7 @@
           <w:sz w:val="19"/>
           <w:szCs w:val="19"/>
         </w:rPr>
-        <w:t xml:space="preserve">A reader has photographed the dedication page.</w:t>
+        <w:t xml:space="preserve">Back to Facebook — a reader has photographed the dedication page.</w:t>
       </w:r>
     </w:p>
     <w:p>
@@ -15615,7 +15611,7 @@
           <w:sz w:val="18"/>
           <w:szCs w:val="18"/>
         </w:rPr>
-        <w:t xml:space="preserve">cut to Facebook (instant)</w:t>
+        <w:t xml:space="preserve">OPENS Facebook — closes the current app if one is open, a beat on the home screen, the thumb travels to the icon, presses, the app opens · sound: tap</w:t>
       </w:r>
     </w:p>
     <w:p>
@@ -20008,7 +20004,7 @@
           <w:sz w:val="19"/>
           <w:szCs w:val="19"/>
         </w:rPr>
-        <w:t xml:space="preserve">Her bookstore selfie — their last uncomplicated public exchange.</w:t>
+        <w:t xml:space="preserve">She opens Facebook — the bookstore selfie, their last uncomplicated public exchange.</w:t>
       </w:r>
     </w:p>
     <w:p>
@@ -20135,7 +20131,7 @@
           <w:sz w:val="18"/>
           <w:szCs w:val="18"/>
         </w:rPr>
-        <w:t xml:space="preserve">cut to Facebook (instant)</w:t>
+        <w:t xml:space="preserve">OPENS Facebook — closes the current app if one is open, a beat on the home screen, the thumb travels to the icon, presses, the app opens · sound: tap</w:t>
       </w:r>
     </w:p>
     <w:p>
@@ -20481,7 +20477,7 @@
           <w:sz w:val="18"/>
           <w:szCs w:val="18"/>
         </w:rPr>
-        <w:t xml:space="preserve">cut to Mail (instant)</w:t>
+        <w:t xml:space="preserve">OPENS Mail — closes the current app if one is open, a beat on the home screen, the thumb travels to the icon, presses, the app opens · sound: tap</w:t>
       </w:r>
     </w:p>
     <w:p>
@@ -20677,7 +20673,7 @@
           <w:sz w:val="18"/>
           <w:szCs w:val="18"/>
         </w:rPr>
-        <w:t xml:space="preserve">cut to Messages (instant)</w:t>
+        <w:t xml:space="preserve">OPENS Messages — closes the current app if one is open, a beat on the home screen, the thumb travels to the icon, presses, the app opens · sound: tap</w:t>
       </w:r>
     </w:p>
     <w:p>
@@ -24514,7 +24510,7 @@
           <w:sz w:val="19"/>
           <w:szCs w:val="19"/>
         </w:rPr>
-        <w:t xml:space="preserve">THE 10 PM RULE FROM MOVING TOO FAST, PIERCED — the same real Focus screen, now with one allowed person: R.H. EDITS.</w:t>
+        <w:t xml:space="preserve">THE 10 PM RULE FROM MOVING TOO FAST, PIERCED — he opens Settings himself: the same real Focus screen, now with one allowed person: R.H. EDITS.</w:t>
       </w:r>
     </w:p>
     <w:p>
@@ -24641,7 +24637,7 @@
           <w:sz w:val="18"/>
           <w:szCs w:val="18"/>
         </w:rPr>
-        <w:t xml:space="preserve">cut to settings2 (instant)</w:t>
+        <w:t xml:space="preserve">OPENS Settings — closes the current app if one is open, a beat on the home screen, the thumb travels to the icon, presses, the app opens · sound: tap</w:t>
       </w:r>
     </w:p>
     <w:p>
@@ -26160,7 +26156,7 @@
           <w:sz w:val="18"/>
           <w:szCs w:val="18"/>
         </w:rPr>
-        <w:t xml:space="preserve">cut to Messages (instant)</w:t>
+        <w:t xml:space="preserve">OPENS Messages — closes the current app if one is open, a beat on the home screen, the thumb travels to the icon, presses, the app opens · sound: tap</w:t>
       </w:r>
     </w:p>
     <w:p>
@@ -28058,7 +28054,7 @@
           <w:sz w:val="19"/>
           <w:szCs w:val="19"/>
         </w:rPr>
-        <w:t xml:space="preserve">She is scrolling HIS press on her own phone. The review, going viral.</w:t>
+        <w:t xml:space="preserve">She closes Safari and scrolls HIS press instead. The review, going viral.</w:t>
       </w:r>
     </w:p>
     <w:p>
@@ -28159,7 +28155,7 @@
           <w:sz w:val="18"/>
           <w:szCs w:val="18"/>
         </w:rPr>
-        <w:t xml:space="preserve">cut to Facebook (instant)</w:t>
+        <w:t xml:space="preserve">OPENS Facebook — closes the current app if one is open, a beat on the home screen, the thumb travels to the icon, presses, the app opens · sound: tap</w:t>
       </w:r>
     </w:p>
     <w:p>
@@ -29077,7 +29073,7 @@
           <w:sz w:val="19"/>
           <w:szCs w:val="19"/>
         </w:rPr>
-        <w:t xml:space="preserve">Elise texts, mid-argument — over a thread that visibly has a past.</w:t>
+        <w:t xml:space="preserve">Elise texts, mid-argument — he opens the thread, and it visibly has a past.</w:t>
       </w:r>
     </w:p>
     <w:p>
@@ -29282,7 +29278,7 @@
           <w:sz w:val="18"/>
           <w:szCs w:val="18"/>
         </w:rPr>
-        <w:t xml:space="preserve">cut to Messages (instant)</w:t>
+        <w:t xml:space="preserve">OPENS Messages — closes the current app if one is open, a beat on the home screen, the thumb travels to the icon, presses, the app opens · sound: tap</w:t>
       </w:r>
     </w:p>
     <w:p>
@@ -31008,7 +31004,7 @@
           <w:sz w:val="19"/>
           <w:szCs w:val="19"/>
         </w:rPr>
-        <w:t xml:space="preserve">The collaborative playlist, on the real Music screen. He has already added three songs. The finale leaves it.</w:t>
+        <w:t xml:space="preserve">She switches to Music — the collaborative playlist, real screen. He has already added three songs. The finale leaves it.</w:t>
       </w:r>
     </w:p>
     <w:p>
@@ -31187,7 +31183,7 @@
           <w:sz w:val="18"/>
           <w:szCs w:val="18"/>
         </w:rPr>
-        <w:t xml:space="preserve">cut to music (instant)</w:t>
+        <w:t xml:space="preserve">OPENS Music — closes the current app if one is open, a beat on the home screen, the thumb travels to the icon, presses, the app opens · sound: tap</w:t>
       </w:r>
     </w:p>
     <w:p>
@@ -31267,7 +31263,7 @@
           <w:sz w:val="19"/>
           <w:szCs w:val="19"/>
         </w:rPr>
-        <w:t xml:space="preserve">Carolann’s settled life, scrolling past.</w:t>
+        <w:t xml:space="preserve">She opens Facebook — Carolann’s settled life, scrolling past.</w:t>
       </w:r>
     </w:p>
     <w:p>
@@ -31394,7 +31390,7 @@
           <w:sz w:val="18"/>
           <w:szCs w:val="18"/>
         </w:rPr>
-        <w:t xml:space="preserve">cut to Facebook (instant)</w:t>
+        <w:t xml:space="preserve">OPENS Facebook — closes the current app if one is open, a beat on the home screen, the thumb travels to the icon, presses, the app opens · sound: tap</w:t>
       </w:r>
     </w:p>
     <w:p>
@@ -31853,7 +31849,7 @@
           <w:sz w:val="19"/>
           <w:szCs w:val="19"/>
         </w:rPr>
-        <w:t xml:space="preserve">She kept the receipt — a screenshot in Photos, saved a year ago, caption and all.</w:t>
+        <w:t xml:space="preserve">She opens Photos — she kept the receipt: a screenshot saved a year ago, caption and all.</w:t>
       </w:r>
     </w:p>
     <w:p>
@@ -31980,7 +31976,7 @@
           <w:sz w:val="18"/>
           <w:szCs w:val="18"/>
         </w:rPr>
-        <w:t xml:space="preserve">cut to shot (instant)</w:t>
+        <w:t xml:space="preserve">OPENS Photos — closes the current app if one is open, a beat on the home screen, the thumb travels to the icon, presses, the app opens · sound: tap</w:t>
       </w:r>
     </w:p>
     <w:p>
@@ -32060,7 +32056,7 @@
           <w:sz w:val="19"/>
           <w:szCs w:val="19"/>
         </w:rPr>
-        <w:t xml:space="preserve">Two months of thread above — then three weeks of drafted courage. Draft one, October 12.</w:t>
+        <w:t xml:space="preserve">She opens his thread — two months deep — then three weeks of drafted courage begin. Draft one, October 12.</w:t>
       </w:r>
     </w:p>
     <w:p>
@@ -32369,7 +32365,7 @@
           <w:sz w:val="18"/>
           <w:szCs w:val="18"/>
         </w:rPr>
-        <w:t xml:space="preserve">cut to Messages (instant)</w:t>
+        <w:t xml:space="preserve">OPENS Messages — closes the current app if one is open, a beat on the home screen, the thumb travels to the icon, presses, the app opens · sound: tap</w:t>
       </w:r>
     </w:p>
     <w:p>
@@ -33200,7 +33196,7 @@
           <w:sz w:val="19"/>
           <w:szCs w:val="19"/>
         </w:rPr>
-        <w:t xml:space="preserve">Twelve minutes out. The nav says arriving; so does she.</w:t>
+        <w:t xml:space="preserve">Back to Maps. Twelve minutes out — the nav says arriving; so does she.</w:t>
       </w:r>
     </w:p>
     <w:p>
@@ -33301,7 +33297,7 @@
           <w:sz w:val="18"/>
           <w:szCs w:val="18"/>
         </w:rPr>
-        <w:t xml:space="preserve">cut to maps (instant)</w:t>
+        <w:t xml:space="preserve">OPENS Maps — closes the current app if one is open, a beat on the home screen, the thumb travels to the icon, presses, the app opens · sound: tap</w:t>
       </w:r>
     </w:p>
     <w:p>
@@ -34571,7 +34567,7 @@
           <w:sz w:val="19"/>
           <w:szCs w:val="19"/>
         </w:rPr>
-        <w:t xml:space="preserve">Find My. The confirmation asks if he is sure. He is. “Forever,” from Moving Too Fast, ends on a real button.</w:t>
+        <w:t xml:space="preserve">He opens Find My. The confirmation asks if he is sure. He is. “Forever,” from Moving Too Fast, ends on a real button.</w:t>
       </w:r>
     </w:p>
     <w:p>
@@ -34745,6 +34741,38 @@
           <w:szCs w:val="18"/>
         </w:rPr>
         <w:t xml:space="preserve">Cathy 💛: You stopped sharing your location</w:t>
+      </w:r>
+    </w:p>
+    <w:p>
+      <w:pPr>
+        <w:keepNext/>
+        <w:spacing w:after="20" w:before="30"/>
+      </w:pPr>
+      <w:r>
+        <w:rPr>
+          <w:rFonts w:ascii="Courier New" w:cs="Courier New" w:eastAsia="Courier New" w:hAnsi="Courier New"/>
+          <w:b/>
+          <w:bCs/>
+          <w:color w:val="6b7280"/>
+          <w:sz w:val="16"/>
+          <w:szCs w:val="16"/>
+        </w:rPr>
+        <w:t xml:space="preserve">PLAYS</w:t>
+      </w:r>
+    </w:p>
+    <w:p>
+      <w:pPr>
+        <w:spacing w:after="14"/>
+        <w:ind w:left="280"/>
+      </w:pPr>
+      <w:r>
+        <w:rPr>
+          <w:rFonts w:ascii="Georgia" w:cs="Georgia" w:eastAsia="Georgia" w:hAnsi="Georgia"/>
+          <w:color w:val="3a3f4d"/>
+          <w:sz w:val="18"/>
+          <w:szCs w:val="18"/>
+        </w:rPr>
+        <w:t xml:space="preserve">OPENS FindMy — closes the current app if one is open, a beat on the home screen, the thumb travels to the icon, presses, the app opens · sound: tap</w:t>
       </w:r>
     </w:p>
     <w:p>
@@ -34824,7 +34852,7 @@
           <w:sz w:val="19"/>
           <w:szCs w:val="19"/>
         </w:rPr>
-        <w:t xml:space="preserve">Her opening night on his real Calendar, three weeks out — ✓ Accepted, by him, in a life he is dismantling.</w:t>
+        <w:t xml:space="preserve">He opens Calendar — her opening night, three weeks out — ✓ Accepted, by him, in a life he is dismantling.</w:t>
       </w:r>
     </w:p>
     <w:p>
@@ -34925,7 +34953,7 @@
           <w:sz w:val="18"/>
           <w:szCs w:val="18"/>
         </w:rPr>
-        <w:t xml:space="preserve">cut to calevent (instant)</w:t>
+        <w:t xml:space="preserve">OPENS Calendar — closes the current app if one is open, a beat on the home screen, the thumb travels to the icon, presses, the app opens · sound: tap</w:t>
       </w:r>
     </w:p>
     <w:p>
@@ -35374,7 +35402,7 @@
           <w:sz w:val="19"/>
           <w:szCs w:val="19"/>
         </w:rPr>
-        <w:t xml:space="preserve">Settings → Battery. 9%, Low Power Mode, and the usage table that says where the night went.</w:t>
+        <w:t xml:space="preserve">He opens Settings → Battery. 9%, Low Power Mode, and the usage table that says where the night went.</w:t>
       </w:r>
     </w:p>
     <w:p>
@@ -35553,7 +35581,54 @@
           <w:sz w:val="18"/>
           <w:szCs w:val="18"/>
         </w:rPr>
-        <w:t xml:space="preserve">cut to settings2 (instant)</w:t>
+        <w:t xml:space="preserve">UNLOCK — the lock slides up and away → home screen · sound: unlock swish</w:t>
+      </w:r>
+    </w:p>
+    <w:p>
+      <w:pPr>
+        <w:spacing w:after="14"/>
+        <w:ind w:left="280"/>
+      </w:pPr>
+      <w:r>
+        <w:rPr>
+          <w:rFonts w:ascii="Georgia" w:cs="Georgia" w:eastAsia="Georgia" w:hAnsi="Georgia"/>
+          <w:color w:val="3a3f4d"/>
+          <w:sz w:val="18"/>
+          <w:szCs w:val="18"/>
+        </w:rPr>
+        <w:t xml:space="preserve">OPENS Settings — closes the current app if one is open, a beat on the home screen, the thumb travels to the icon, presses, the app opens · sound: tap</w:t>
+      </w:r>
+    </w:p>
+    <w:p>
+      <w:pPr>
+        <w:keepNext/>
+        <w:spacing w:after="20" w:before="26"/>
+      </w:pPr>
+      <w:r>
+        <w:rPr>
+          <w:rFonts w:ascii="Courier New" w:cs="Courier New" w:eastAsia="Courier New" w:hAnsi="Courier New"/>
+          <w:b/>
+          <w:bCs/>
+          <w:color w:val="6b7280"/>
+          <w:sz w:val="16"/>
+          <w:szCs w:val="16"/>
+        </w:rPr>
+        <w:t xml:space="preserve">SOUND</w:t>
+      </w:r>
+    </w:p>
+    <w:p>
+      <w:pPr>
+        <w:spacing w:after="14"/>
+        <w:ind w:left="280"/>
+      </w:pPr>
+      <w:r>
+        <w:rPr>
+          <w:rFonts w:ascii="Georgia" w:cs="Georgia" w:eastAsia="Georgia" w:hAnsi="Georgia"/>
+          <w:color w:val="6a5a20"/>
+          <w:sz w:val="18"/>
+          <w:szCs w:val="18"/>
+        </w:rPr>
+        <w:t xml:space="preserve">unlock swish</w:t>
       </w:r>
     </w:p>
     <w:p>
@@ -35633,7 +35708,7 @@
           <w:sz w:val="19"/>
           <w:szCs w:val="19"/>
         </w:rPr>
-        <w:t xml:space="preserve">A new, empty conversation. To: |</w:t>
+        <w:t xml:space="preserve">Back to Messages — a new, empty conversation. To: |</w:t>
       </w:r>
     </w:p>
     <w:p>
@@ -35665,7 +35740,7 @@
           <w:sz w:val="18"/>
           <w:szCs w:val="18"/>
         </w:rPr>
-        <w:t xml:space="preserve">cut to Messages (instant)</w:t>
+        <w:t xml:space="preserve">OPENS Messages — closes the current app if one is open, a beat on the home screen, the thumb travels to the icon, presses, the app opens · sound: tap</w:t>
       </w:r>
     </w:p>
     <w:p>
@@ -36196,7 +36271,7 @@
           <w:sz w:val="18"/>
           <w:szCs w:val="18"/>
         </w:rPr>
-        <w:t xml:space="preserve">cut to note (instant)</w:t>
+        <w:t xml:space="preserve">OPENS Notes — closes the current app if one is open, a beat on the home screen, the thumb travels to the icon, presses, the app opens · sound: tap</w:t>
       </w:r>
     </w:p>
     <w:p>
@@ -37703,7 +37778,7 @@
           <w:sz w:val="19"/>
           <w:szCs w:val="19"/>
         </w:rPr>
-        <w:t xml:space="preserve">The playlist from 2021, on the real Music screen. Leave “US”? — this button he CAN press.</w:t>
+        <w:t xml:space="preserve">He opens Music — the playlist from 2021. Leave “US”? — this button he CAN press.</w:t>
       </w:r>
     </w:p>
     <w:p>
@@ -37986,7 +38061,7 @@
           <w:sz w:val="18"/>
           <w:szCs w:val="18"/>
         </w:rPr>
-        <w:t xml:space="preserve">cut to music (instant)</w:t>
+        <w:t xml:space="preserve">OPENS Music — closes the current app if one is open, a beat on the home screen, the thumb travels to the icon, presses, the app opens · sound: tap</w:t>
       </w:r>
     </w:p>
     <w:p>
@@ -38193,7 +38268,7 @@
           <w:sz w:val="18"/>
           <w:szCs w:val="18"/>
         </w:rPr>
-        <w:t xml:space="preserve">cut to vm (instant)</w:t>
+        <w:t xml:space="preserve">OPENS Phone — closes the current app if one is open, a beat on the home screen, the thumb travels to the icon, presses, the app opens · sound: tap</w:t>
       </w:r>
     </w:p>
     <w:p>
@@ -38619,7 +38694,7 @@
           <w:sz w:val="19"/>
           <w:szCs w:val="19"/>
         </w:rPr>
-        <w:t xml:space="preserve">Her messages, from his side — the same thread the house read at 9:41 this morning, mirrored. All read. Never answered.</w:t>
+        <w:t xml:space="preserve">He opens her thread — the same messages the house read at 9:41 this morning, mirrored from his side. All read. Never answered.</w:t>
       </w:r>
     </w:p>
     <w:p>
@@ -38928,7 +39003,7 @@
           <w:sz w:val="18"/>
           <w:szCs w:val="18"/>
         </w:rPr>
-        <w:t xml:space="preserve">cut to Messages (instant)</w:t>
+        <w:t xml:space="preserve">OPENS Messages — closes the current app if one is open, a beat on the home screen, the thumb travels to the icon, presses, the app opens · sound: tap</w:t>
       </w:r>
     </w:p>
     <w:p>
@@ -39418,7 +39493,22 @@
           <w:sz w:val="18"/>
           <w:szCs w:val="18"/>
         </w:rPr>
-        <w:t xml:space="preserve">cut to Messages (instant)</w:t>
+        <w:t xml:space="preserve">UNLOCK — the lock slides up and away → home screen · sound: unlock swish</w:t>
+      </w:r>
+    </w:p>
+    <w:p>
+      <w:pPr>
+        <w:spacing w:after="14"/>
+        <w:ind w:left="280"/>
+      </w:pPr>
+      <w:r>
+        <w:rPr>
+          <w:rFonts w:ascii="Georgia" w:cs="Georgia" w:eastAsia="Georgia" w:hAnsi="Georgia"/>
+          <w:color w:val="3a3f4d"/>
+          <w:sz w:val="18"/>
+          <w:szCs w:val="18"/>
+        </w:rPr>
+        <w:t xml:space="preserve">OPENS Messages — closes the current app if one is open, a beat on the home screen, the thumb travels to the icon, presses, the app opens · sound: tap</w:t>
       </w:r>
     </w:p>
     <w:p>
@@ -39451,6 +39541,21 @@
           <w:szCs w:val="16"/>
         </w:rPr>
         <w:t xml:space="preserve">SOUND</w:t>
+      </w:r>
+    </w:p>
+    <w:p>
+      <w:pPr>
+        <w:spacing w:after="14"/>
+        <w:ind w:left="280"/>
+      </w:pPr>
+      <w:r>
+        <w:rPr>
+          <w:rFonts w:ascii="Georgia" w:cs="Georgia" w:eastAsia="Georgia" w:hAnsi="Georgia"/>
+          <w:color w:val="6a5a20"/>
+          <w:sz w:val="18"/>
+          <w:szCs w:val="18"/>
+        </w:rPr>
+        <w:t xml:space="preserve">unlock swish</w:t>
       </w:r>
     </w:p>
     <w:p>

</xml_diff>

<commit_message>
Cue Bible: song intros rewritten for the line-by-line build
Co-Authored-By: Claude Fable 5.1 <noreply@anthropic.com>
Claude-Session: https://claude.ai/code/session_01Y6sUkZbYffNPeDjzCChZiy
</commit_message>
<xml_diff>
--- a/L5Y-Cue-Bible.docx
+++ b/L5Y-Cue-Bible.docx
@@ -148,7 +148,7 @@
           <w:szCs w:val="19"/>
           <w:rFonts w:ascii="Georgia" w:cs="Georgia" w:eastAsia="Georgia" w:hAnsi="Georgia"/>
         </w:rPr>
-        <w:t xml:space="preserve">COLD OPEN. Her phone is the first actor on stage. The house learns the grammar wordlessly: a notification is tapped and the app is simply there; a list is already full; only what would truly arrive live ever arrives live. When she puts the phone down, the memories go full-bleed — non-diegetic, the frame gone.</w:t>
+        <w:t xml:space="preserve">COLD OPEN. Her phone is the first actor on stage, and the whole prologue plays from ONE GO: the Memories notification, the tap, four years in four cards. Black on the first bar. At the m.58 interlude she picks it up and sends her text — one GO, plays out on its own. On her later line the memories return full-bleed, the frame gone.</w:t>
       </w:r>
     </w:p>
     <w:p>
@@ -5316,7 +5316,7 @@
           <w:szCs w:val="19"/>
           <w:rFonts w:ascii="Georgia" w:cs="Georgia" w:eastAsia="Georgia" w:hAnsi="Georgia"/>
         </w:rPr>
-        <w:t xml:space="preserve">NEARLY EMPTY, BY DESIGN. One post and its climbing likes are the whole birthday; the screens stay black while she sings. Then his 2021 calls cut in — the agency cold call, the callback, and Rob (an outgoing dial, per the script) — and the house learns the projections can time-travel.</w:t>
+        <w:t xml:space="preserve">HER SONG, HIS CALLS. She has no phone in this number: the era holds center-stage while she sings. Then his 2021 calls cut in — the agent cold call, the callback, and Rob (he dials, per the script) — and each hang-up rolls the time home to her July. The house learns the projections can time-travel.</w:t>
       </w:r>
     </w:p>
     <w:p>
@@ -7225,7 +7225,7 @@
           <w:szCs w:val="19"/>
           <w:rFonts w:ascii="Georgia" w:cs="Georgia" w:eastAsia="Georgia" w:hAnsi="Georgia"/>
         </w:rPr>
-        <w:t xml:space="preserve">THE AVALANCHE, COMPRESSED. Her one professional call, politely deflected — then his lock screen wins five times in the exact order he sings them: the apartment, the Atlantic, the money, Columbia, Sonny. The happy infrastructure of the marriage installs itself so the back half can dismantle it.</w:t>
+        <w:t xml:space="preserve">THE AVALANCHE, COMPRESSED. Her one professional call — dial, connect, end, then his phone rolls back — and his lock screen wins five times in the exact order he sings them: the apartment, the Atlantic, the money, Columbia, Sonny. The happy infrastructure of the marriage installs itself so the back half can dismantle it.</w:t>
       </w:r>
     </w:p>
     <w:p>
@@ -8757,7 +8757,7 @@
           <w:szCs w:val="19"/>
           <w:rFonts w:ascii="Georgia" w:cs="Georgia" w:eastAsia="Georgia" w:hAnsi="Georgia"/>
         </w:rPr>
-        <w:t xml:space="preserve">HIS SILENCE, FROM HER SIDE. The party album has her as “and guest”; the repost crops her out; her texts sit Not Delivered under six hours of his Do Not Disturb. The 6:04 release — everything flips Delivered at once — is the quiet center of the song. Then a stranger’s photo of the dedication page.</w:t>
+        <w:t xml:space="preserve">ONE THING. The era holds while she sings; on her last phrase, as she picks up the book, her phone opens Books to the last page of his novel: “For Cathy.” Nothing else. The last image of the song.</w:t>
       </w:r>
     </w:p>
     <w:p>
@@ -9420,7 +9420,7 @@
           <w:szCs w:val="19"/>
           <w:rFonts w:ascii="Georgia" w:cs="Georgia" w:eastAsia="Georgia" w:hAnsi="Georgia"/>
         </w:rPr>
-        <w:t xml:space="preserve">STILLNESS, BY DIRECTION. One held Christmas image. No animation, no cueing inside the number — the kindest screen of the night, deliberately so; the generosity buys the betrayal its full price later. Not one Elise pixel anywhere in this song.</w:t>
+        <w:t xml:space="preserve">STILLNESS, BY DIRECTION. One held Christmas lock screen. No animation, no cueing inside the number — the kindest screen of the night, deliberately so; the generosity buys the betrayal its full price later. Not one Elise pixel anywhere in this song.</w:t>
       </w:r>
     </w:p>
     <w:p>
@@ -9831,7 +9831,7 @@
           <w:szCs w:val="19"/>
           <w:rFonts w:ascii="Georgia" w:cs="Georgia" w:eastAsia="Georgia" w:hAnsi="Georgia"/>
         </w:rPr>
-        <w:t xml:space="preserve">ONE CUE. The prerecorded FaceTime (V2) carries the entire number — Jamie at his desk, half-attending, writing, while Ohio sings to him. The engine draws only the FaceTime frame and the call chrome; everything alive in it is the video.</w:t>
+        <w:t xml:space="preserve">ONE CALL. Ringing on the vamp, he answers on her first line, the prerecorded FaceTime (V2) carries the entire number — Jamie at his desk, half-attending, writing, while Ohio sings to him — and Call Ended on the final chord. The engine draws only the FaceTime chrome and the ticking duration; everything alive in it is the video.</w:t>
       </w:r>
     </w:p>
     <w:p>
@@ -10452,7 +10452,7 @@
           <w:szCs w:val="19"/>
           <w:rFonts w:ascii="Georgia" w:cs="Georgia" w:eastAsia="Georgia" w:hAnsi="Georgia"/>
         </w:rPr>
-        <w:t xml:space="preserve">TIME, NOT CONTENT. The phones mark only where we are: June 12, 2023 — then the one date both timelines share, enormous: MAY 18, 2024 — then back again on the rowboat line. The era rail does the traveling; the people do the vows.</w:t>
+        <w:t xml:space="preserve">TIME, NOT CONTENT. Her lock screen marks only where we are: June 12, 2023 — then the one date both timelines share: May 18, 2024 — then back again on the rowboat line. The final chord brings up the INTERMISSION card, which holds until Act Two’s first GO.</w:t>
       </w:r>
     </w:p>
     <w:p>
@@ -12266,7 +12266,7 @@
           <w:szCs w:val="19"/>
           <w:rFonts w:ascii="Georgia" w:cs="Georgia" w:eastAsia="Georgia" w:hAnsi="Georgia"/>
         </w:rPr>
-        <w:t xml:space="preserve">HER INTERIOR VS. HIS SCROLL. The bell-tone fragments rhyme with the sung monologue and never transcribe it — protect that rule in every edit.</w:t>
+        <w:t xml:space="preserve">TWO TEXTS, THREE MONTHS APART. “break a leg” lands before her first note — lowercase, three seconds of effort — then two rejection emails over the lock screen. On the bell tone, time rolls back to November 2023 and his other text arrives: long, thoughtful, the man he was. The contrast is the whole cue.</w:t>
       </w:r>
     </w:p>
     <w:p>
@@ -13915,7 +13915,7 @@
           <w:szCs w:val="19"/>
           <w:rFonts w:ascii="Georgia" w:cs="Georgia" w:eastAsia="Georgia" w:hAnsi="Georgia"/>
         </w:rPr>
-        <w:t xml:space="preserve">THE FIGHT HAS AN AUDIENCE: HIS PHONE. What the argument is actually about sits unsigned on the other side of the stage all song.</w:t>
+        <w:t xml:space="preserve">TIMELINE ONLY. One GO: time rolls forward to MARCH 2026, the night of the party, and holds center-stage for the whole fight. Nothing on a phone — the argument is the screen.</w:t>
       </w:r>
     </w:p>
     <w:p>
@@ -14171,7 +14171,7 @@
           <w:szCs w:val="19"/>
           <w:rFonts w:ascii="Georgia" w:cs="Georgia" w:eastAsia="Georgia" w:hAnsi="Georgia"/>
         </w:rPr>
-        <w:t xml:space="preserve">HER GHOST REGISTER, USED FOR LOVE. Drafted courage, kept receipts, a shared playlist — the exact mirror of what his register becomes.</w:t>
+        <w:t xml:space="preserve">THE DRIVE. Her phone on the dash, Apple Maps for the entire song: the puck rides the route from New York to the Eastern Shore, the miles and minutes fall, each maneuver counts down, the phone’s clock runs 4:05 to 7:45. Arrival is timed to the song (tune `dur` in tech).</w:t>
       </w:r>
     </w:p>
     <w:p>
@@ -14636,7 +14636,7 @@
           <w:szCs w:val="19"/>
           <w:rFonts w:ascii="Georgia" w:cs="Georgia" w:eastAsia="Georgia" w:hAnsi="Georgia"/>
         </w:rPr>
-        <w:t xml:space="preserve">THE PAYOFF. The same three gestures as the first night, frozen over. Speed that read as charm now reads as practice.</w:t>
+        <w:t xml:space="preserve">TWO BEATS. Her good-morning text lights his phone and he swipes it away, unread, at once. On his last line he opens Find My and turns his location back ON — Share Indefinitely — the cover-up filed as devotion. It was off before the song; we never see him turn it off.</w:t>
       </w:r>
     </w:p>
     <w:p>
@@ -15656,7 +15656,7 @@
           <w:szCs w:val="19"/>
           <w:rFonts w:ascii="Georgia" w:cs="Georgia" w:eastAsia="Georgia" w:hAnsi="Georgia"/>
         </w:rPr>
-        <w:t xml:space="preserve">THE GRAMMAR RESOLVES. Her firsts fill as his lasts empty — the same thread from both ends, five years apart.</w:t>
+        <w:t xml:space="preserve">THE GRAMMAR RESOLVES. The era flips with the singer. Her one animation: his “home safe?” lands on her steps, she opens it, and she is still typing her answer when his last verse rolls the time forward to JUNE 2026 — the last image. True black on the final goodbye.</w:t>
       </w:r>
     </w:p>
     <w:p>

</xml_diff>

<commit_message>
Punch list: preview equals projection, progress bar, Read/typing back in song 1, longer rolls, real wallpapers
- Phone typography is relative to the phone's own height (--ph), so the presenter
  preview and the projection lay out identically and Larger Text reaches the TV.
- Presenter: a progress bar for the playing cue (estimated duration per cue, AUTO
  badge on the GO card and the queue).
- Song 1: the memories return is cut; READ 9:44, his typing bubble, and the stop
  are back on her lines; the thread holds to the cutoff.
- Time rolls scale with the distance travelled (a month ~1.2 s, five years ~3 s).
- Lock screens draw a real abstract wallpaper when no photo is supplied (no note).
- Drive ticker guarded on hidden stages; presenter overflow guards.

Co-Authored-By: Claude Fable 5.1 <noreply@anthropic.com>
Claude-Session: https://claude.ai/code/session_01Y6sUkZbYffNPeDjzCChZiy
</commit_message>
<xml_diff>
--- a/L5Y-Cue-Bible.docx
+++ b/L5Y-Cue-Bible.docx
@@ -65,7 +65,7 @@
           <w:szCs w:val="19"/>
           <w:rFonts w:ascii="Georgia" w:cs="Georgia" w:eastAsia="Georgia" w:hAnsi="Georgia"/>
         </w:rPr>
-        <w:t xml:space="preserve">72 cues · 14 songs · generated from the live show build, so this document cannot drift from what the phones actually do</w:t>
+        <w:t xml:space="preserve">73 cues · 14 songs · generated from the live show build, so this document cannot drift from what the phones actually do</w:t>
       </w:r>
     </w:p>
     <w:p>
@@ -133,7 +133,7 @@
           <w:szCs w:val="18"/>
           <w:rFonts w:ascii="Courier New" w:cs="Courier New" w:eastAsia="Courier New" w:hAnsi="Courier New"/>
         </w:rPr>
-        <w:t xml:space="preserve">   CATHY SINGS · 6 FIRES</w:t>
+        <w:t xml:space="preserve">   CATHY SINGS · 7 FIRES</w:t>
       </w:r>
     </w:p>
     <w:p>
@@ -148,7 +148,7 @@
           <w:szCs w:val="19"/>
           <w:rFonts w:ascii="Georgia" w:cs="Georgia" w:eastAsia="Georgia" w:hAnsi="Georgia"/>
         </w:rPr>
-        <w:t xml:space="preserve">COLD OPEN. Her phone is the first actor on stage, and the whole prologue plays from ONE GO: the Memories notification, the tap, four years in four cards. Black on the first bar. At the m.58 interlude she picks it up and sends her text — one GO, plays out on its own. On her later line the memories return full-bleed, the frame gone.</w:t>
+        <w:t xml:space="preserve">COLD OPEN. Her phone is the first actor on stage, and the whole prologue plays from ONE GO: the Memories notification, the tap, four years in four cards. Black on the first bar. At the m.58 interlude she picks it up and sends her text — one GO, plays out on its own. Then, on her lines: Delivered turns to READ at 9:44, his typing bubble rises, and it stops. The thread stays up to the cutoff.</w:t>
       </w:r>
     </w:p>
     <w:p>
@@ -2433,7 +2433,7 @@
           <w:szCs w:val="17"/>
           <w:rFonts w:ascii="Courier New" w:cs="Courier New" w:eastAsia="Courier New" w:hAnsi="Courier New"/>
         </w:rPr>
-        <w:t xml:space="preserve">  SR · CATHY · Facebook Memories</w:t>
+        <w:t xml:space="preserve">  SR · CATHY · Messages</w:t>
       </w:r>
       <w:r>
         <w:rPr>
@@ -2444,7 +2444,7 @@
           <w:szCs w:val="19"/>
           <w:rFonts w:ascii="Georgia" w:cs="Georgia" w:eastAsia="Georgia" w:hAnsi="Georgia"/>
         </w:rPr>
-        <w:t xml:space="preserve">   —  “Give me a day, Jamie!” — the memories return, full screen</w:t>
+        <w:t xml:space="preserve">   —  “Give me a day, Jamie!” — Delivered turns to READ</w:t>
       </w:r>
     </w:p>
     <w:p>
@@ -2459,79 +2459,104 @@
           <w:szCs w:val="19"/>
           <w:rFonts w:ascii="Georgia" w:cs="Georgia" w:eastAsia="Georgia" w:hAnsi="Georgia"/>
         </w:rPr>
-        <w:t xml:space="preserve">NON-DIEGETIC — she is not holding the phone. The frame drops away and the feed fills the whole screen, resting on the wedding card.</w:t>
-      </w:r>
-    </w:p>
-    <w:p>
-      <w:pPr>
-        <w:keepNext/>
-        <w:spacing w:before="30" w:after="20"/>
-      </w:pPr>
-      <w:r>
-        <w:rPr>
-          <w:b/>
-          <w:bCs/>
-          <w:color w:val="6b7280"/>
-          <w:sz w:val="16"/>
-          <w:szCs w:val="16"/>
-          <w:rFonts w:ascii="Courier New" w:cs="Courier New" w:eastAsia="Courier New" w:hAnsi="Courier New"/>
-        </w:rPr>
-        <w:t xml:space="preserve">PLAYS</w:t>
-      </w:r>
-    </w:p>
-    <w:p>
-      <w:pPr>
-        <w:spacing w:after="14"/>
-        <w:ind w:left="280"/>
-      </w:pPr>
-      <w:r>
-        <w:rPr>
-          <w:color w:val="3a3f4d"/>
-          <w:sz w:val="18"/>
-          <w:szCs w:val="18"/>
-          <w:rFonts w:ascii="Georgia" w:cs="Georgia" w:eastAsia="Georgia" w:hAnsi="Georgia"/>
-        </w:rPr>
-        <w:t xml:space="preserve">the full shell appears — CATHY’s screen</w:t>
-      </w:r>
-    </w:p>
-    <w:p>
-      <w:pPr>
-        <w:spacing w:after="14"/>
-        <w:ind w:left="280"/>
-      </w:pPr>
-      <w:r>
-        <w:rPr>
-          <w:color w:val="3a3f4d"/>
-          <w:sz w:val="18"/>
-          <w:szCs w:val="18"/>
-          <w:rFonts w:ascii="Georgia" w:cs="Georgia" w:eastAsia="Georgia" w:hAnsi="Georgia"/>
-        </w:rPr>
-        <w:t xml:space="preserve">cut to Facebook Memories (instant)</w:t>
-      </w:r>
-    </w:p>
-    <w:p>
-      <w:pPr>
+        <w:t xml:space="preserve">Delivered → READ, 9:44. He is awake. He is holding his phone.</w:t>
+      </w:r>
+    </w:p>
+    <w:p>
+      <w:pPr>
+        <w:keepNext/>
+        <w:spacing w:after="20"/>
+      </w:pPr>
+      <w:r>
+        <w:rPr>
+          <w:b/>
+          <w:bCs/>
+          <w:color w:val="6b7280"/>
+          <w:sz w:val="16"/>
+          <w:szCs w:val="16"/>
+          <w:rFonts w:ascii="Courier New" w:cs="Courier New" w:eastAsia="Courier New" w:hAnsi="Courier New"/>
+        </w:rPr>
+        <w:t xml:space="preserve">ON SCREEN</w:t>
+      </w:r>
+    </w:p>
+    <w:p>
+      <w:pPr>
+        <w:spacing w:after="14"/>
+        <w:ind w:left="280"/>
+      </w:pPr>
+      <w:r>
+        <w:rPr>
+          <w:b/>
+          <w:bCs/>
+          <w:color w:val="1a1d26"/>
+          <w:sz w:val="18"/>
+          <w:szCs w:val="18"/>
+          <w:rFonts w:ascii="Courier New" w:cs="Courier New" w:eastAsia="Courier New" w:hAnsi="Courier New"/>
+        </w:rPr>
+        <w:t xml:space="preserve">LOCK CLOCK — </w:t>
+      </w:r>
+      <w:r>
+        <w:rPr>
+          <w:color w:val="1a1d26"/>
+          <w:sz w:val="18"/>
+          <w:szCs w:val="18"/>
+          <w:rFonts w:ascii="Courier New" w:cs="Courier New" w:eastAsia="Courier New" w:hAnsi="Courier New"/>
+        </w:rPr>
+        <w:t xml:space="preserve">9:44</w:t>
+      </w:r>
+    </w:p>
+    <w:p>
+      <w:pPr>
+        <w:spacing w:after="14"/>
+        <w:ind w:left="280"/>
+      </w:pPr>
+      <w:r>
+        <w:rPr>
+          <w:b/>
+          <w:bCs/>
+          <w:color w:val="1a1d26"/>
+          <w:sz w:val="18"/>
+          <w:szCs w:val="18"/>
+          <w:rFonts w:ascii="Courier New" w:cs="Courier New" w:eastAsia="Courier New" w:hAnsi="Courier New"/>
+        </w:rPr>
+        <w:t xml:space="preserve">STATUS FLIPS → </w:t>
+      </w:r>
+      <w:r>
+        <w:rPr>
+          <w:color w:val="1a1d26"/>
+          <w:sz w:val="18"/>
+          <w:szCs w:val="18"/>
+          <w:rFonts w:ascii="Courier New" w:cs="Courier New" w:eastAsia="Courier New" w:hAnsi="Courier New"/>
+        </w:rPr>
+        <w:t xml:space="preserve">Read 9:44 AM</w:t>
+      </w:r>
+    </w:p>
+    <w:p>
+      <w:pPr>
+        <w:shd w:fill="faf3dc" w:val="clear"/>
         <w:spacing w:before="30" w:after="14"/>
       </w:pPr>
       <w:r>
         <w:rPr>
           <w:b/>
           <w:bCs/>
-          <w:color w:val="6b7280"/>
-          <w:sz w:val="16"/>
-          <w:szCs w:val="16"/>
-          <w:rFonts w:ascii="Courier New" w:cs="Courier New" w:eastAsia="Courier New" w:hAnsi="Courier New"/>
-        </w:rPr>
-        <w:t xml:space="preserve">PHONES  </w:t>
-      </w:r>
-      <w:r>
-        <w:rPr>
-          <w:color w:val="6b7280"/>
+          <w:color w:val="8a6d10"/>
           <w:sz w:val="17"/>
           <w:szCs w:val="17"/>
           <w:rFonts w:ascii="Courier New" w:cs="Courier New" w:eastAsia="Courier New" w:hAnsi="Courier New"/>
         </w:rPr>
-        <w:t xml:space="preserve">SR = Facebook Memories  ·  stamp “JUNE 2026”  ·  clock 9:41</w:t>
+        <w:t xml:space="preserve">HOLD · </w:t>
+      </w:r>
+      <w:r>
+        <w:rPr>
+          <w:i/>
+          <w:iCs/>
+          <w:color w:val="8a6d10"/>
+          <w:sz w:val="18"/>
+          <w:szCs w:val="18"/>
+          <w:rFonts w:ascii="Georgia" w:cs="Georgia" w:eastAsia="Georgia" w:hAnsi="Georgia"/>
+        </w:rPr>
+        <w:t xml:space="preserve">Let the receipt sit alone for a full phrase.</w:t>
       </w:r>
     </w:p>
     <w:p>
@@ -2560,7 +2585,7 @@
           <w:szCs w:val="17"/>
           <w:rFonts w:ascii="Courier New" w:cs="Courier New" w:eastAsia="Courier New" w:hAnsi="Courier New"/>
         </w:rPr>
-        <w:t xml:space="preserve">  SR · CATHY · Facebook Memories</w:t>
+        <w:t xml:space="preserve">  SR · CATHY · Messages</w:t>
       </w:r>
       <w:r>
         <w:rPr>
@@ -2571,7 +2596,7 @@
           <w:szCs w:val="19"/>
           <w:rFonts w:ascii="Georgia" w:cs="Georgia" w:eastAsia="Georgia" w:hAnsi="Georgia"/>
         </w:rPr>
-        <w:t xml:space="preserve">   —  “Jamie is over and where can I turn?” — the last verse</w:t>
+        <w:t xml:space="preserve">   —  “Hang them back on the wall!” — his typing bubble rises</w:t>
       </w:r>
     </w:p>
     <w:p>
@@ -2586,7 +2611,49 @@
           <w:szCs w:val="19"/>
           <w:rFonts w:ascii="Georgia" w:cs="Georgia" w:eastAsia="Georgia" w:hAnsi="Georgia"/>
         </w:rPr>
-        <w:t xml:space="preserve">The feed drifts down to the oldest card — nine months in, the couch, the happiest one — enormous, to close the song.</w:t>
+        <w:t xml:space="preserve">His typing bubble rises. He is answering.</w:t>
+      </w:r>
+    </w:p>
+    <w:p>
+      <w:pPr>
+        <w:keepNext/>
+        <w:spacing w:after="20"/>
+      </w:pPr>
+      <w:r>
+        <w:rPr>
+          <w:b/>
+          <w:bCs/>
+          <w:color w:val="6b7280"/>
+          <w:sz w:val="16"/>
+          <w:szCs w:val="16"/>
+          <w:rFonts w:ascii="Courier New" w:cs="Courier New" w:eastAsia="Courier New" w:hAnsi="Courier New"/>
+        </w:rPr>
+        <w:t xml:space="preserve">ON SCREEN</w:t>
+      </w:r>
+    </w:p>
+    <w:p>
+      <w:pPr>
+        <w:spacing w:after="14"/>
+        <w:ind w:left="280"/>
+      </w:pPr>
+      <w:r>
+        <w:rPr>
+          <w:b/>
+          <w:bCs/>
+          <w:color w:val="1a1d26"/>
+          <w:sz w:val="18"/>
+          <w:szCs w:val="18"/>
+          <w:rFonts w:ascii="Courier New" w:cs="Courier New" w:eastAsia="Courier New" w:hAnsi="Courier New"/>
+        </w:rPr>
+        <w:t xml:space="preserve">typing indicator rises (three dots)</w:t>
+      </w:r>
+      <w:r>
+        <w:rPr>
+          <w:color w:val="1a1d26"/>
+          <w:sz w:val="18"/>
+          <w:szCs w:val="18"/>
+          <w:rFonts w:ascii="Courier New" w:cs="Courier New" w:eastAsia="Courier New" w:hAnsi="Courier New"/>
+        </w:rPr>
       </w:r>
     </w:p>
     <w:p>
@@ -2607,6 +2674,131 @@
           <w:rFonts w:ascii="Courier New" w:cs="Courier New" w:eastAsia="Courier New" w:hAnsi="Courier New"/>
         </w:rPr>
         <w:t xml:space="preserve">1.6</w:t>
+      </w:r>
+      <w:r>
+        <w:rPr>
+          <w:color w:val="2a5db0"/>
+          <w:sz w:val="17"/>
+          <w:szCs w:val="17"/>
+          <w:rFonts w:ascii="Courier New" w:cs="Courier New" w:eastAsia="Courier New" w:hAnsi="Courier New"/>
+        </w:rPr>
+        <w:t xml:space="preserve">  SR · CATHY · Messages</w:t>
+      </w:r>
+      <w:r>
+        <w:rPr>
+          <w:i/>
+          <w:iCs/>
+          <w:color w:val="1a1d26"/>
+          <w:sz w:val="19"/>
+          <w:szCs w:val="19"/>
+          <w:rFonts w:ascii="Georgia" w:cs="Georgia" w:eastAsia="Georgia" w:hAnsi="Georgia"/>
+        </w:rPr>
+        <w:t xml:space="preserve">   —  “Had no chance at all.” — it stops</w:t>
+      </w:r>
+    </w:p>
+    <w:p>
+      <w:pPr>
+        <w:keepNext/>
+        <w:spacing w:after="60"/>
+      </w:pPr>
+      <w:r>
+        <w:rPr>
+          <w:color w:val="3a3f4d"/>
+          <w:sz w:val="19"/>
+          <w:szCs w:val="19"/>
+          <w:rFonts w:ascii="Georgia" w:cs="Georgia" w:eastAsia="Georgia" w:hAnsi="Georgia"/>
+        </w:rPr>
+        <w:t xml:space="preserve">It stops. Nothing comes. He read it and put the phone down. The thread stays up through her last verse.</w:t>
+      </w:r>
+    </w:p>
+    <w:p>
+      <w:pPr>
+        <w:keepNext/>
+        <w:spacing w:after="20"/>
+      </w:pPr>
+      <w:r>
+        <w:rPr>
+          <w:b/>
+          <w:bCs/>
+          <w:color w:val="6b7280"/>
+          <w:sz w:val="16"/>
+          <w:szCs w:val="16"/>
+          <w:rFonts w:ascii="Courier New" w:cs="Courier New" w:eastAsia="Courier New" w:hAnsi="Courier New"/>
+        </w:rPr>
+        <w:t xml:space="preserve">ON SCREEN</w:t>
+      </w:r>
+    </w:p>
+    <w:p>
+      <w:pPr>
+        <w:spacing w:after="14"/>
+        <w:ind w:left="280"/>
+      </w:pPr>
+      <w:r>
+        <w:rPr>
+          <w:b/>
+          <w:bCs/>
+          <w:color w:val="1a1d26"/>
+          <w:sz w:val="18"/>
+          <w:szCs w:val="18"/>
+          <w:rFonts w:ascii="Courier New" w:cs="Courier New" w:eastAsia="Courier New" w:hAnsi="Courier New"/>
+        </w:rPr>
+        <w:t xml:space="preserve">typing indicator disappears</w:t>
+      </w:r>
+      <w:r>
+        <w:rPr>
+          <w:color w:val="1a1d26"/>
+          <w:sz w:val="18"/>
+          <w:szCs w:val="18"/>
+          <w:rFonts w:ascii="Courier New" w:cs="Courier New" w:eastAsia="Courier New" w:hAnsi="Courier New"/>
+        </w:rPr>
+      </w:r>
+    </w:p>
+    <w:p>
+      <w:pPr>
+        <w:shd w:fill="faf3dc" w:val="clear"/>
+        <w:spacing w:before="30" w:after="14"/>
+      </w:pPr>
+      <w:r>
+        <w:rPr>
+          <w:b/>
+          <w:bCs/>
+          <w:color w:val="8a6d10"/>
+          <w:sz w:val="17"/>
+          <w:szCs w:val="17"/>
+          <w:rFonts w:ascii="Courier New" w:cs="Courier New" w:eastAsia="Courier New" w:hAnsi="Courier New"/>
+        </w:rPr>
+        <w:t xml:space="preserve">HOLD · </w:t>
+      </w:r>
+      <w:r>
+        <w:rPr>
+          <w:i/>
+          <w:iCs/>
+          <w:color w:val="8a6d10"/>
+          <w:sz w:val="18"/>
+          <w:szCs w:val="18"/>
+          <w:rFonts w:ascii="Georgia" w:cs="Georgia" w:eastAsia="Georgia" w:hAnsi="Georgia"/>
+        </w:rPr>
+        <w:t xml:space="preserve">The cruellest silence available in 2026.</w:t>
+      </w:r>
+    </w:p>
+    <w:p>
+      <w:pPr>
+        <w:keepNext/>
+        <w:pBdr>
+          <w:top w:val="single" w:color="d8d2c2" w:sz="4"/>
+        </w:pBdr>
+        <w:spacing w:before="200" w:after="40"/>
+      </w:pPr>
+      <w:r>
+        <w:rPr>
+          <w:b/>
+          <w:bCs/>
+          <w:color w:val="1a1d26"/>
+          <w:sz w:val="22"/>
+          <w:szCs w:val="22"/>
+          <w:rFonts w:ascii="Courier New" w:cs="Courier New" w:eastAsia="Courier New" w:hAnsi="Courier New"/>
+        </w:rPr>
+        <w:t xml:space="preserve">1.7</w:t>
       </w:r>
       <w:r>
         <w:rPr>

</xml_diff>

<commit_message>
Torn Score IV: the right panel big and hard black on light grain paper, contact photos (M24/M25) in each other's phone books, song 9 made phone-real with confirm flags, notifications only ding when new, phone calls connect silently, threads rest where the action is
Co-Authored-By: Claude Fable 5.1 <noreply@anthropic.com>
Claude-Session: https://claude.ai/code/session_01Y6sUkZbYffNPeDjzCChZiy
</commit_message>
<xml_diff>
--- a/L5Y-Cue-Bible.docx
+++ b/L5Y-Cue-Bible.docx
@@ -203,7 +203,7 @@
           <w:szCs w:val="19"/>
           <w:rFonts w:ascii="Georgia" w:cs="Georgia" w:eastAsia="Georgia" w:hAnsi="Georgia"/>
         </w:rPr>
-        <w:t xml:space="preserve">AUTO-PLAYS from this one GO (~52 s). The title page lifts away; the falling pages keep falling, thinning out, until the last one blows off — and the calendar lands center-stage: JUNE · YEAR 5. No phone in the prologue.</w:t>
+        <w:t xml:space="preserve">ONE GO. The title page tears off the pad and falls; beneath it the calendar reads JUNE · YEAR 5, the morning after, and holds center-stage through the whole prologue. No phone, no sound.</w:t>
       </w:r>
     </w:p>
     <w:p>
@@ -324,7 +324,7 @@
           <w:szCs w:val="18"/>
           <w:rFonts w:ascii="Courier New" w:cs="Courier New" w:eastAsia="Courier New" w:hAnsi="Courier New"/>
         </w:rPr>
-        <w:t xml:space="preserve">the falling pages thin out over ~52 s; the last one blows away; the calendar lands</w:t>
+        <w:t xml:space="preserve">the falling pages thin out over ~0 s; the last one blows away; the calendar lands</w:t>
       </w:r>
     </w:p>
     <w:p>
@@ -352,7 +352,7 @@
           <w:szCs w:val="18"/>
           <w:rFonts w:ascii="Georgia" w:cs="Georgia" w:eastAsia="Georgia" w:hAnsi="Georgia"/>
         </w:rPr>
-        <w:t xml:space="preserve">The wind-down length is the `ms` on this cue — match it to the waltz in tech.</w:t>
+        <w:t xml:space="preserve">`ms` on this cue delays the tear after GO (0 = on the GO). Nothing else moves until her verse-two line.</w:t>
       </w:r>
     </w:p>
     <w:p>
@@ -407,7 +407,7 @@
           <w:szCs w:val="19"/>
           <w:rFonts w:ascii="Georgia" w:cs="Georgia" w:eastAsia="Georgia" w:hAnsi="Georgia"/>
         </w:rPr>
-        <w:t xml:space="preserve">AUTO-PLAYS from this GO (~18 s). The calendar docks; her phone rises, locked — a Facebook Memories notification lands and she ignores it. Unlock, Messages (the whole list is condolences), his thread mid-history — days of her asking, all silent. She types it live, hesitant, and SENDS. Delivered.</w:t>
+        <w:t xml:space="preserve">AUTO-PLAYS from this GO (~50 s — slowed by direction; every pause is tunable in tech). The calendar docks; her phone rises, locked — a Facebook Memories notification lands and she ignores it. Unlock, Messages (the whole list is condolences), his thread mid-history — days of her asking, all silent. She types it live, hesitant, and SENDS. Delivered.</w:t>
       </w:r>
     </w:p>
     <w:p>
@@ -502,6 +502,836 @@
           <w:szCs w:val="18"/>
           <w:rFonts w:ascii="Courier New" w:cs="Courier New" w:eastAsia="Courier New" w:hAnsi="Courier New"/>
         </w:rPr>
+        <w:t xml:space="preserve">4.5 s)</w:t>
+      </w:r>
+    </w:p>
+    <w:p>
+      <w:pPr>
+        <w:spacing w:after="14"/>
+        <w:ind w:left="280"/>
+      </w:pPr>
+      <w:r>
+        <w:rPr>
+          <w:b/>
+          <w:bCs/>
+          <w:color w:val="1a1d26"/>
+          <w:sz w:val="18"/>
+          <w:szCs w:val="18"/>
+          <w:rFonts w:ascii="Courier New" w:cs="Courier New" w:eastAsia="Courier New" w:hAnsi="Courier New"/>
+        </w:rPr>
+        <w:t xml:space="preserve">MESSAGES LIST — loads whole, already full: </w:t>
+      </w:r>
+      <w:r>
+        <w:rPr>
+          <w:color w:val="1a1d26"/>
+          <w:sz w:val="18"/>
+          <w:szCs w:val="18"/>
+          <w:rFonts w:ascii="Courier New" w:cs="Courier New" w:eastAsia="Courier New" w:hAnsi="Courier New"/>
+        </w:rPr>
+      </w:r>
+    </w:p>
+    <w:p>
+      <w:pPr>
+        <w:spacing w:after="14"/>
+        <w:ind w:left="280"/>
+      </w:pPr>
+      <w:r>
+        <w:rPr>
+          <w:b/>
+          <w:bCs/>
+          <w:color w:val="1a1d26"/>
+          <w:sz w:val="18"/>
+          <w:szCs w:val="18"/>
+          <w:rFonts w:ascii="Courier New" w:cs="Courier New" w:eastAsia="Courier New" w:hAnsi="Courier New"/>
+        </w:rPr>
+        <w:t xml:space="preserve">   · </w:t>
+      </w:r>
+      <w:r>
+        <w:rPr>
+          <w:color w:val="1a1d26"/>
+          <w:sz w:val="18"/>
+          <w:szCs w:val="18"/>
+          <w:rFonts w:ascii="Courier New" w:cs="Courier New" w:eastAsia="Courier New" w:hAnsi="Courier New"/>
+        </w:rPr>
+        <w:t xml:space="preserve">Mom ❤️ ● — “call me when you’re up. I love you.” (8:02 AM)</w:t>
+      </w:r>
+    </w:p>
+    <w:p>
+      <w:pPr>
+        <w:spacing w:after="14"/>
+        <w:ind w:left="280"/>
+      </w:pPr>
+      <w:r>
+        <w:rPr>
+          <w:b/>
+          <w:bCs/>
+          <w:color w:val="1a1d26"/>
+          <w:sz w:val="18"/>
+          <w:szCs w:val="18"/>
+          <w:rFonts w:ascii="Courier New" w:cs="Courier New" w:eastAsia="Courier New" w:hAnsi="Courier New"/>
+        </w:rPr>
+        <w:t xml:space="preserve">   · </w:t>
+      </w:r>
+      <w:r>
+        <w:rPr>
+          <w:color w:val="1a1d26"/>
+          <w:sz w:val="18"/>
+          <w:szCs w:val="18"/>
+          <w:rFonts w:ascii="Courier New" w:cs="Courier New" w:eastAsia="Courier New" w:hAnsi="Courier New"/>
+        </w:rPr>
+        <w:t xml:space="preserve">Dana + girls 🍸 ● — “Dana: we’re coming over at 7. non-negotiable.” (7:41 AM)</w:t>
+      </w:r>
+    </w:p>
+    <w:p>
+      <w:pPr>
+        <w:spacing w:after="14"/>
+        <w:ind w:left="280"/>
+      </w:pPr>
+      <w:r>
+        <w:rPr>
+          <w:b/>
+          <w:bCs/>
+          <w:color w:val="1a1d26"/>
+          <w:sz w:val="18"/>
+          <w:szCs w:val="18"/>
+          <w:rFonts w:ascii="Courier New" w:cs="Courier New" w:eastAsia="Courier New" w:hAnsi="Courier New"/>
+        </w:rPr>
+        <w:t xml:space="preserve">   · </w:t>
+      </w:r>
+      <w:r>
+        <w:rPr>
+          <w:color w:val="1a1d26"/>
+          <w:sz w:val="18"/>
+          <w:szCs w:val="18"/>
+          <w:rFonts w:ascii="Courier New" w:cs="Courier New" w:eastAsia="Courier New" w:hAnsi="Courier New"/>
+        </w:rPr>
+        <w:t xml:space="preserve">Beth — “just heard. I’m so so sorry 💔” (Yesterday)</w:t>
+      </w:r>
+    </w:p>
+    <w:p>
+      <w:pPr>
+        <w:spacing w:after="14"/>
+        <w:ind w:left="280"/>
+      </w:pPr>
+      <w:r>
+        <w:rPr>
+          <w:b/>
+          <w:bCs/>
+          <w:color w:val="1a1d26"/>
+          <w:sz w:val="18"/>
+          <w:szCs w:val="18"/>
+          <w:rFonts w:ascii="Courier New" w:cs="Courier New" w:eastAsia="Courier New" w:hAnsi="Courier New"/>
+        </w:rPr>
+        <w:t xml:space="preserve">   · </w:t>
+      </w:r>
+      <w:r>
+        <w:rPr>
+          <w:color w:val="1a1d26"/>
+          <w:sz w:val="18"/>
+          <w:szCs w:val="18"/>
+          <w:rFonts w:ascii="Courier New" w:cs="Courier New" w:eastAsia="Courier New" w:hAnsi="Courier New"/>
+        </w:rPr>
+        <w:t xml:space="preserve">Grammy ● — “sweetheart. are you eating?” (Yesterday)</w:t>
+      </w:r>
+    </w:p>
+    <w:p>
+      <w:pPr>
+        <w:spacing w:after="14"/>
+        <w:ind w:left="280"/>
+      </w:pPr>
+      <w:r>
+        <w:rPr>
+          <w:b/>
+          <w:bCs/>
+          <w:color w:val="1a1d26"/>
+          <w:sz w:val="18"/>
+          <w:szCs w:val="18"/>
+          <w:rFonts w:ascii="Courier New" w:cs="Courier New" w:eastAsia="Courier New" w:hAnsi="Courier New"/>
+        </w:rPr>
+        <w:t xml:space="preserve">   · </w:t>
+      </w:r>
+      <w:r>
+        <w:rPr>
+          <w:color w:val="1a1d26"/>
+          <w:sz w:val="18"/>
+          <w:szCs w:val="18"/>
+          <w:rFonts w:ascii="Courier New" w:cs="Courier New" w:eastAsia="Courier New" w:hAnsi="Courier New"/>
+        </w:rPr>
+        <w:t xml:space="preserve">Aunt Patti — “your mother told me. call me, honey” (Yesterday)</w:t>
+      </w:r>
+    </w:p>
+    <w:p>
+      <w:pPr>
+        <w:spacing w:after="14"/>
+        <w:ind w:left="280"/>
+      </w:pPr>
+      <w:r>
+        <w:rPr>
+          <w:b/>
+          <w:bCs/>
+          <w:color w:val="1a1d26"/>
+          <w:sz w:val="18"/>
+          <w:szCs w:val="18"/>
+          <w:rFonts w:ascii="Courier New" w:cs="Courier New" w:eastAsia="Courier New" w:hAnsi="Courier New"/>
+        </w:rPr>
+        <w:t xml:space="preserve">   · </w:t>
+      </w:r>
+      <w:r>
+        <w:rPr>
+          <w:color w:val="1a1d26"/>
+          <w:sz w:val="18"/>
+          <w:szCs w:val="18"/>
+          <w:rFonts w:ascii="Courier New" w:cs="Courier New" w:eastAsia="Courier New" w:hAnsi="Courier New"/>
+        </w:rPr>
+        <w:t xml:space="preserve">Jamie — “I’m not angry. just talk to me” (Yesterday)</w:t>
+      </w:r>
+    </w:p>
+    <w:p>
+      <w:pPr>
+        <w:spacing w:after="14"/>
+        <w:ind w:left="280"/>
+      </w:pPr>
+      <w:r>
+        <w:rPr>
+          <w:b/>
+          <w:bCs/>
+          <w:color w:val="1a1d26"/>
+          <w:sz w:val="18"/>
+          <w:szCs w:val="18"/>
+          <w:rFonts w:ascii="Courier New" w:cs="Courier New" w:eastAsia="Courier New" w:hAnsi="Courier New"/>
+        </w:rPr>
+        <w:t xml:space="preserve">   · </w:t>
+      </w:r>
+      <w:r>
+        <w:rPr>
+          <w:color w:val="1a1d26"/>
+          <w:sz w:val="18"/>
+          <w:szCs w:val="18"/>
+          <w:rFonts w:ascii="Courier New" w:cs="Courier New" w:eastAsia="Courier New" w:hAnsi="Courier New"/>
+        </w:rPr>
+        <w:t xml:space="preserve">Michael (voice) — “no lesson this week — I’m out of town” (Tuesday)</w:t>
+      </w:r>
+    </w:p>
+    <w:p>
+      <w:pPr>
+        <w:spacing w:after="14"/>
+        <w:ind w:left="280"/>
+      </w:pPr>
+      <w:r>
+        <w:rPr>
+          <w:b/>
+          <w:bCs/>
+          <w:color w:val="1a1d26"/>
+          <w:sz w:val="18"/>
+          <w:szCs w:val="18"/>
+          <w:rFonts w:ascii="Courier New" w:cs="Courier New" w:eastAsia="Courier New" w:hAnsi="Courier New"/>
+        </w:rPr>
+        <w:t xml:space="preserve">   · </w:t>
+      </w:r>
+      <w:r>
+        <w:rPr>
+          <w:color w:val="1a1d26"/>
+          <w:sz w:val="18"/>
+          <w:szCs w:val="18"/>
+          <w:rFonts w:ascii="Courier New" w:cs="Courier New" w:eastAsia="Courier New" w:hAnsi="Courier New"/>
+        </w:rPr>
+        <w:t xml:space="preserve">Ohio Housing — “Re: summer sublet — deposit received” (Monday)</w:t>
+      </w:r>
+    </w:p>
+    <w:p>
+      <w:pPr>
+        <w:spacing w:after="14"/>
+        <w:ind w:left="280"/>
+      </w:pPr>
+      <w:r>
+        <w:rPr>
+          <w:b/>
+          <w:bCs/>
+          <w:color w:val="1a1d26"/>
+          <w:sz w:val="18"/>
+          <w:szCs w:val="18"/>
+          <w:rFonts w:ascii="Courier New" w:cs="Courier New" w:eastAsia="Courier New" w:hAnsi="Courier New"/>
+        </w:rPr>
+        <w:t xml:space="preserve">   · </w:t>
+      </w:r>
+      <w:r>
+        <w:rPr>
+          <w:color w:val="1a1d26"/>
+          <w:sz w:val="18"/>
+          <w:szCs w:val="18"/>
+          <w:rFonts w:ascii="Courier New" w:cs="Courier New" w:eastAsia="Courier New" w:hAnsi="Courier New"/>
+        </w:rPr>
+        <w:t xml:space="preserve">CVS Pharmacy — “Your prescription is ready for pickup” (Monday)</w:t>
+      </w:r>
+    </w:p>
+    <w:p>
+      <w:pPr>
+        <w:spacing w:after="14"/>
+        <w:ind w:left="280"/>
+      </w:pPr>
+      <w:r>
+        <w:rPr>
+          <w:b/>
+          <w:bCs/>
+          <w:color w:val="1a1d26"/>
+          <w:sz w:val="18"/>
+          <w:szCs w:val="18"/>
+          <w:rFonts w:ascii="Courier New" w:cs="Courier New" w:eastAsia="Courier New" w:hAnsi="Courier New"/>
+        </w:rPr>
+        <w:t xml:space="preserve">   · </w:t>
+      </w:r>
+      <w:r>
+        <w:rPr>
+          <w:color w:val="1a1d26"/>
+          <w:sz w:val="18"/>
+          <w:szCs w:val="18"/>
+          <w:rFonts w:ascii="Courier New" w:cs="Courier New" w:eastAsia="Courier New" w:hAnsi="Courier New"/>
+        </w:rPr>
+        <w:t xml:space="preserve">Dentist — Dr. Okafor — “Reminder: cleaning Jun 22, 2:30 PM” (Sunday)</w:t>
+      </w:r>
+    </w:p>
+    <w:p>
+      <w:pPr>
+        <w:spacing w:after="14"/>
+        <w:ind w:left="280"/>
+      </w:pPr>
+      <w:r>
+        <w:rPr>
+          <w:b/>
+          <w:bCs/>
+          <w:color w:val="1a1d26"/>
+          <w:sz w:val="18"/>
+          <w:szCs w:val="18"/>
+          <w:rFonts w:ascii="Courier New" w:cs="Courier New" w:eastAsia="Courier New" w:hAnsi="Courier New"/>
+        </w:rPr>
+        <w:t xml:space="preserve">  … a beat (auto-timed, </w:t>
+      </w:r>
+      <w:r>
+        <w:rPr>
+          <w:color w:val="1a1d26"/>
+          <w:sz w:val="18"/>
+          <w:szCs w:val="18"/>
+          <w:rFonts w:ascii="Courier New" w:cs="Courier New" w:eastAsia="Courier New" w:hAnsi="Courier New"/>
+        </w:rPr>
+        <w:t xml:space="preserve">3.5 s)</w:t>
+      </w:r>
+    </w:p>
+    <w:p>
+      <w:pPr>
+        <w:spacing w:after="14"/>
+        <w:ind w:left="280"/>
+      </w:pPr>
+      <w:r>
+        <w:rPr>
+          <w:b/>
+          <w:bCs/>
+          <w:color w:val="1a1d26"/>
+          <w:sz w:val="18"/>
+          <w:szCs w:val="18"/>
+          <w:rFonts w:ascii="Courier New" w:cs="Courier New" w:eastAsia="Courier New" w:hAnsi="Courier New"/>
+        </w:rPr>
+        <w:t xml:space="preserve">  … a beat (auto-timed, </w:t>
+      </w:r>
+      <w:r>
+        <w:rPr>
+          <w:color w:val="1a1d26"/>
+          <w:sz w:val="18"/>
+          <w:szCs w:val="18"/>
+          <w:rFonts w:ascii="Courier New" w:cs="Courier New" w:eastAsia="Courier New" w:hAnsi="Courier New"/>
+        </w:rPr>
+        <w:t xml:space="preserve">1.6 s)</w:t>
+      </w:r>
+    </w:p>
+    <w:p>
+      <w:pPr>
+        <w:spacing w:after="14"/>
+        <w:ind w:left="280"/>
+      </w:pPr>
+      <w:r>
+        <w:rPr>
+          <w:b/>
+          <w:bCs/>
+          <w:color w:val="1a1d26"/>
+          <w:sz w:val="18"/>
+          <w:szCs w:val="18"/>
+          <w:rFonts w:ascii="Courier New" w:cs="Courier New" w:eastAsia="Courier New" w:hAnsi="Courier New"/>
+        </w:rPr>
+        <w:t xml:space="preserve">THREAD HISTORY — loads whole with the thread: </w:t>
+      </w:r>
+      <w:r>
+        <w:rPr>
+          <w:color w:val="1a1d26"/>
+          <w:sz w:val="18"/>
+          <w:szCs w:val="18"/>
+          <w:rFonts w:ascii="Courier New" w:cs="Courier New" w:eastAsia="Courier New" w:hAnsi="Courier New"/>
+        </w:rPr>
+      </w:r>
+    </w:p>
+    <w:p>
+      <w:pPr>
+        <w:spacing w:after="14"/>
+        <w:ind w:left="280"/>
+      </w:pPr>
+      <w:r>
+        <w:rPr>
+          <w:b/>
+          <w:bCs/>
+          <w:color w:val="1a1d26"/>
+          <w:sz w:val="18"/>
+          <w:szCs w:val="18"/>
+          <w:rFonts w:ascii="Courier New" w:cs="Courier New" w:eastAsia="Courier New" w:hAnsi="Courier New"/>
+        </w:rPr>
+        <w:t xml:space="preserve">   — </w:t>
+      </w:r>
+      <w:r>
+        <w:rPr>
+          <w:color w:val="1a1d26"/>
+          <w:sz w:val="18"/>
+          <w:szCs w:val="18"/>
+          <w:rFonts w:ascii="Courier New" w:cs="Courier New" w:eastAsia="Courier New" w:hAnsi="Courier New"/>
+        </w:rPr>
+        <w:t xml:space="preserve">Sunday · 8:20 PM</w:t>
+      </w:r>
+    </w:p>
+    <w:p>
+      <w:pPr>
+        <w:spacing w:after="14"/>
+        <w:ind w:left="280"/>
+      </w:pPr>
+      <w:r>
+        <w:rPr>
+          <w:b/>
+          <w:bCs/>
+          <w:color w:val="1a1d26"/>
+          <w:sz w:val="18"/>
+          <w:szCs w:val="18"/>
+          <w:rFonts w:ascii="Courier New" w:cs="Courier New" w:eastAsia="Courier New" w:hAnsi="Courier New"/>
+        </w:rPr>
+        <w:t xml:space="preserve">   SENT (blue): </w:t>
+      </w:r>
+      <w:r>
+        <w:rPr>
+          <w:color w:val="1a1d26"/>
+          <w:sz w:val="18"/>
+          <w:szCs w:val="18"/>
+          <w:rFonts w:ascii="Courier New" w:cs="Courier New" w:eastAsia="Courier New" w:hAnsi="Courier New"/>
+        </w:rPr>
+        <w:t xml:space="preserve">“porch light’s out again. landlord says tuesday”</w:t>
+      </w:r>
+    </w:p>
+    <w:p>
+      <w:pPr>
+        <w:spacing w:after="14"/>
+        <w:ind w:left="280"/>
+      </w:pPr>
+      <w:r>
+        <w:rPr>
+          <w:b/>
+          <w:bCs/>
+          <w:color w:val="1a1d26"/>
+          <w:sz w:val="18"/>
+          <w:szCs w:val="18"/>
+          <w:rFonts w:ascii="Courier New" w:cs="Courier New" w:eastAsia="Courier New" w:hAnsi="Courier New"/>
+        </w:rPr>
+        <w:t xml:space="preserve">   RECEIVED (gray): </w:t>
+      </w:r>
+      <w:r>
+        <w:rPr>
+          <w:color w:val="1a1d26"/>
+          <w:sz w:val="18"/>
+          <w:szCs w:val="18"/>
+          <w:rFonts w:ascii="Courier New" w:cs="Courier New" w:eastAsia="Courier New" w:hAnsi="Courier New"/>
+        </w:rPr>
+        <w:t xml:space="preserve">“ok”</w:t>
+      </w:r>
+    </w:p>
+    <w:p>
+      <w:pPr>
+        <w:spacing w:after="14"/>
+        <w:ind w:left="280"/>
+      </w:pPr>
+      <w:r>
+        <w:rPr>
+          <w:b/>
+          <w:bCs/>
+          <w:color w:val="1a1d26"/>
+          <w:sz w:val="18"/>
+          <w:szCs w:val="18"/>
+          <w:rFonts w:ascii="Courier New" w:cs="Courier New" w:eastAsia="Courier New" w:hAnsi="Courier New"/>
+        </w:rPr>
+        <w:t xml:space="preserve">   — </w:t>
+      </w:r>
+      <w:r>
+        <w:rPr>
+          <w:color w:val="1a1d26"/>
+          <w:sz w:val="18"/>
+          <w:szCs w:val="18"/>
+          <w:rFonts w:ascii="Courier New" w:cs="Courier New" w:eastAsia="Courier New" w:hAnsi="Courier New"/>
+        </w:rPr>
+        <w:t xml:space="preserve">Tuesday · 1:15 PM</w:t>
+      </w:r>
+    </w:p>
+    <w:p>
+      <w:pPr>
+        <w:spacing w:after="14"/>
+        <w:ind w:left="280"/>
+      </w:pPr>
+      <w:r>
+        <w:rPr>
+          <w:b/>
+          <w:bCs/>
+          <w:color w:val="1a1d26"/>
+          <w:sz w:val="18"/>
+          <w:szCs w:val="18"/>
+          <w:rFonts w:ascii="Courier New" w:cs="Courier New" w:eastAsia="Courier New" w:hAnsi="Courier New"/>
+        </w:rPr>
+        <w:t xml:space="preserve">   SENT (blue): </w:t>
+      </w:r>
+      <w:r>
+        <w:rPr>
+          <w:color w:val="1a1d26"/>
+          <w:sz w:val="18"/>
+          <w:szCs w:val="18"/>
+          <w:rFonts w:ascii="Courier New" w:cs="Courier New" w:eastAsia="Courier New" w:hAnsi="Courier New"/>
+        </w:rPr>
+        <w:t xml:space="preserve">“sublet deposit cleared 👍 the room is yours too when you’re here”</w:t>
+      </w:r>
+    </w:p>
+    <w:p>
+      <w:pPr>
+        <w:spacing w:after="14"/>
+        <w:ind w:left="280"/>
+      </w:pPr>
+      <w:r>
+        <w:rPr>
+          <w:b/>
+          <w:bCs/>
+          <w:color w:val="1a1d26"/>
+          <w:sz w:val="18"/>
+          <w:szCs w:val="18"/>
+          <w:rFonts w:ascii="Courier New" w:cs="Courier New" w:eastAsia="Courier New" w:hAnsi="Courier New"/>
+        </w:rPr>
+        <w:t xml:space="preserve">   RECEIVED (gray): </w:t>
+      </w:r>
+      <w:r>
+        <w:rPr>
+          <w:color w:val="1a1d26"/>
+          <w:sz w:val="18"/>
+          <w:szCs w:val="18"/>
+          <w:rFonts w:ascii="Courier New" w:cs="Courier New" w:eastAsia="Courier New" w:hAnsi="Courier New"/>
+        </w:rPr>
+        <w:t xml:space="preserve">“👍”</w:t>
+      </w:r>
+    </w:p>
+    <w:p>
+      <w:pPr>
+        <w:spacing w:after="14"/>
+        <w:ind w:left="280"/>
+      </w:pPr>
+      <w:r>
+        <w:rPr>
+          <w:b/>
+          <w:bCs/>
+          <w:color w:val="1a1d26"/>
+          <w:sz w:val="18"/>
+          <w:szCs w:val="18"/>
+          <w:rFonts w:ascii="Courier New" w:cs="Courier New" w:eastAsia="Courier New" w:hAnsi="Courier New"/>
+        </w:rPr>
+        <w:t xml:space="preserve">   — </w:t>
+      </w:r>
+      <w:r>
+        <w:rPr>
+          <w:color w:val="1a1d26"/>
+          <w:sz w:val="18"/>
+          <w:szCs w:val="18"/>
+          <w:rFonts w:ascii="Courier New" w:cs="Courier New" w:eastAsia="Courier New" w:hAnsi="Courier New"/>
+        </w:rPr>
+        <w:t xml:space="preserve">Yesterday · 5:05 AM</w:t>
+      </w:r>
+    </w:p>
+    <w:p>
+      <w:pPr>
+        <w:spacing w:after="14"/>
+        <w:ind w:left="280"/>
+      </w:pPr>
+      <w:r>
+        <w:rPr>
+          <w:b/>
+          <w:bCs/>
+          <w:color w:val="1a1d26"/>
+          <w:sz w:val="18"/>
+          <w:szCs w:val="18"/>
+          <w:rFonts w:ascii="Courier New" w:cs="Courier New" w:eastAsia="Courier New" w:hAnsi="Courier New"/>
+        </w:rPr>
+        <w:t xml:space="preserve">   SENT (blue): </w:t>
+      </w:r>
+      <w:r>
+        <w:rPr>
+          <w:color w:val="1a1d26"/>
+          <w:sz w:val="18"/>
+          <w:szCs w:val="18"/>
+          <w:rFonts w:ascii="Courier New" w:cs="Courier New" w:eastAsia="Courier New" w:hAnsi="Courier New"/>
+        </w:rPr>
+        <w:t xml:space="preserve">“good morning. can’t wait to see you — what time does your flight land?”</w:t>
+      </w:r>
+    </w:p>
+    <w:p>
+      <w:pPr>
+        <w:spacing w:after="14"/>
+        <w:ind w:left="280"/>
+      </w:pPr>
+      <w:r>
+        <w:rPr>
+          <w:b/>
+          <w:bCs/>
+          <w:color w:val="1a1d26"/>
+          <w:sz w:val="18"/>
+          <w:szCs w:val="18"/>
+          <w:rFonts w:ascii="Courier New" w:cs="Courier New" w:eastAsia="Courier New" w:hAnsi="Courier New"/>
+        </w:rPr>
+        <w:t xml:space="preserve">   — </w:t>
+      </w:r>
+      <w:r>
+        <w:rPr>
+          <w:color w:val="1a1d26"/>
+          <w:sz w:val="18"/>
+          <w:szCs w:val="18"/>
+          <w:rFonts w:ascii="Courier New" w:cs="Courier New" w:eastAsia="Courier New" w:hAnsi="Courier New"/>
+        </w:rPr>
+        <w:t xml:space="preserve">Yesterday · 1:30 PM</w:t>
+      </w:r>
+    </w:p>
+    <w:p>
+      <w:pPr>
+        <w:spacing w:after="14"/>
+        <w:ind w:left="280"/>
+      </w:pPr>
+      <w:r>
+        <w:rPr>
+          <w:b/>
+          <w:bCs/>
+          <w:color w:val="1a1d26"/>
+          <w:sz w:val="18"/>
+          <w:szCs w:val="18"/>
+          <w:rFonts w:ascii="Courier New" w:cs="Courier New" w:eastAsia="Courier New" w:hAnsi="Courier New"/>
+        </w:rPr>
+        <w:t xml:space="preserve">   SENT (blue): </w:t>
+      </w:r>
+      <w:r>
+        <w:rPr>
+          <w:color w:val="1a1d26"/>
+          <w:sz w:val="18"/>
+          <w:szCs w:val="18"/>
+          <w:rFonts w:ascii="Courier New" w:cs="Courier New" w:eastAsia="Courier New" w:hAnsi="Courier New"/>
+        </w:rPr>
+        <w:t xml:space="preserve">“landed?”</w:t>
+      </w:r>
+    </w:p>
+    <w:p>
+      <w:pPr>
+        <w:spacing w:after="14"/>
+        <w:ind w:left="280"/>
+      </w:pPr>
+      <w:r>
+        <w:rPr>
+          <w:b/>
+          <w:bCs/>
+          <w:color w:val="1a1d26"/>
+          <w:sz w:val="18"/>
+          <w:szCs w:val="18"/>
+          <w:rFonts w:ascii="Courier New" w:cs="Courier New" w:eastAsia="Courier New" w:hAnsi="Courier New"/>
+        </w:rPr>
+        <w:t xml:space="preserve">   — </w:t>
+      </w:r>
+      <w:r>
+        <w:rPr>
+          <w:color w:val="1a1d26"/>
+          <w:sz w:val="18"/>
+          <w:szCs w:val="18"/>
+          <w:rFonts w:ascii="Courier New" w:cs="Courier New" w:eastAsia="Courier New" w:hAnsi="Courier New"/>
+        </w:rPr>
+        <w:t xml:space="preserve">Yesterday · 4:40 PM</w:t>
+      </w:r>
+    </w:p>
+    <w:p>
+      <w:pPr>
+        <w:spacing w:after="14"/>
+        <w:ind w:left="280"/>
+      </w:pPr>
+      <w:r>
+        <w:rPr>
+          <w:b/>
+          <w:bCs/>
+          <w:color w:val="1a1d26"/>
+          <w:sz w:val="18"/>
+          <w:szCs w:val="18"/>
+          <w:rFonts w:ascii="Courier New" w:cs="Courier New" w:eastAsia="Courier New" w:hAnsi="Courier New"/>
+        </w:rPr>
+        <w:t xml:space="preserve">   SENT (blue): </w:t>
+      </w:r>
+      <w:r>
+        <w:rPr>
+          <w:color w:val="1a1d26"/>
+          <w:sz w:val="18"/>
+          <w:szCs w:val="18"/>
+          <w:rFonts w:ascii="Courier New" w:cs="Courier New" w:eastAsia="Courier New" w:hAnsi="Courier New"/>
+        </w:rPr>
+        <w:t xml:space="preserve">“I read it. please call me”</w:t>
+      </w:r>
+    </w:p>
+    <w:p>
+      <w:pPr>
+        <w:spacing w:after="14"/>
+        <w:ind w:left="280"/>
+      </w:pPr>
+      <w:r>
+        <w:rPr>
+          <w:b/>
+          <w:bCs/>
+          <w:color w:val="1a1d26"/>
+          <w:sz w:val="18"/>
+          <w:szCs w:val="18"/>
+          <w:rFonts w:ascii="Courier New" w:cs="Courier New" w:eastAsia="Courier New" w:hAnsi="Courier New"/>
+        </w:rPr>
+        <w:t xml:space="preserve">   — </w:t>
+      </w:r>
+      <w:r>
+        <w:rPr>
+          <w:color w:val="1a1d26"/>
+          <w:sz w:val="18"/>
+          <w:szCs w:val="18"/>
+          <w:rFonts w:ascii="Courier New" w:cs="Courier New" w:eastAsia="Courier New" w:hAnsi="Courier New"/>
+        </w:rPr>
+        <w:t xml:space="preserve">Yesterday · 9:30 PM</w:t>
+      </w:r>
+    </w:p>
+    <w:p>
+      <w:pPr>
+        <w:spacing w:after="14"/>
+        <w:ind w:left="280"/>
+      </w:pPr>
+      <w:r>
+        <w:rPr>
+          <w:b/>
+          <w:bCs/>
+          <w:color w:val="1a1d26"/>
+          <w:sz w:val="18"/>
+          <w:szCs w:val="18"/>
+          <w:rFonts w:ascii="Courier New" w:cs="Courier New" w:eastAsia="Courier New" w:hAnsi="Courier New"/>
+        </w:rPr>
+        <w:t xml:space="preserve">   SENT (blue): </w:t>
+      </w:r>
+      <w:r>
+        <w:rPr>
+          <w:color w:val="1a1d26"/>
+          <w:sz w:val="18"/>
+          <w:szCs w:val="18"/>
+          <w:rFonts w:ascii="Courier New" w:cs="Courier New" w:eastAsia="Courier New" w:hAnsi="Courier New"/>
+        </w:rPr>
+        <w:t xml:space="preserve">“I’m not angry. just talk to me”</w:t>
+      </w:r>
+    </w:p>
+    <w:p>
+      <w:pPr>
+        <w:spacing w:after="14"/>
+        <w:ind w:left="280"/>
+      </w:pPr>
+      <w:r>
+        <w:rPr>
+          <w:b/>
+          <w:bCs/>
+          <w:color w:val="1a1d26"/>
+          <w:sz w:val="18"/>
+          <w:szCs w:val="18"/>
+          <w:rFonts w:ascii="Courier New" w:cs="Courier New" w:eastAsia="Courier New" w:hAnsi="Courier New"/>
+        </w:rPr>
+        <w:t xml:space="preserve">   status: </w:t>
+      </w:r>
+      <w:r>
+        <w:rPr>
+          <w:color w:val="1a1d26"/>
+          <w:sz w:val="18"/>
+          <w:szCs w:val="18"/>
+          <w:rFonts w:ascii="Courier New" w:cs="Courier New" w:eastAsia="Courier New" w:hAnsi="Courier New"/>
+        </w:rPr>
+        <w:t xml:space="preserve">Delivered</w:t>
+      </w:r>
+    </w:p>
+    <w:p>
+      <w:pPr>
+        <w:spacing w:after="14"/>
+        <w:ind w:left="280"/>
+      </w:pPr>
+      <w:r>
+        <w:rPr>
+          <w:b/>
+          <w:bCs/>
+          <w:color w:val="1a1d26"/>
+          <w:sz w:val="18"/>
+          <w:szCs w:val="18"/>
+          <w:rFonts w:ascii="Courier New" w:cs="Courier New" w:eastAsia="Courier New" w:hAnsi="Courier New"/>
+        </w:rPr>
+        <w:t xml:space="preserve">  … a beat (auto-timed, </w:t>
+      </w:r>
+      <w:r>
+        <w:rPr>
+          <w:color w:val="1a1d26"/>
+          <w:sz w:val="18"/>
+          <w:szCs w:val="18"/>
+          <w:rFonts w:ascii="Courier New" w:cs="Courier New" w:eastAsia="Courier New" w:hAnsi="Courier New"/>
+        </w:rPr>
+        <w:t xml:space="preserve">3.2 s)</w:t>
+      </w:r>
+    </w:p>
+    <w:p>
+      <w:pPr>
+        <w:spacing w:after="14"/>
+        <w:ind w:left="280"/>
+      </w:pPr>
+      <w:r>
+        <w:rPr>
+          <w:b/>
+          <w:bCs/>
+          <w:color w:val="1a1d26"/>
+          <w:sz w:val="18"/>
+          <w:szCs w:val="18"/>
+          <w:rFonts w:ascii="Courier New" w:cs="Courier New" w:eastAsia="Courier New" w:hAnsi="Courier New"/>
+        </w:rPr>
+        <w:t xml:space="preserve">thread caption: </w:t>
+      </w:r>
+      <w:r>
+        <w:rPr>
+          <w:color w:val="1a1d26"/>
+          <w:sz w:val="18"/>
+          <w:szCs w:val="18"/>
+          <w:rFonts w:ascii="Courier New" w:cs="Courier New" w:eastAsia="Courier New" w:hAnsi="Courier New"/>
+        </w:rPr>
+        <w:t xml:space="preserve">Today · 9:41 AM</w:t>
+      </w:r>
+    </w:p>
+    <w:p>
+      <w:pPr>
+        <w:spacing w:after="14"/>
+        <w:ind w:left="280"/>
+      </w:pPr>
+      <w:r>
+        <w:rPr>
+          <w:b/>
+          <w:bCs/>
+          <w:color w:val="1a1d26"/>
+          <w:sz w:val="18"/>
+          <w:szCs w:val="18"/>
+          <w:rFonts w:ascii="Courier New" w:cs="Courier New" w:eastAsia="Courier New" w:hAnsi="Courier New"/>
+        </w:rPr>
+        <w:t xml:space="preserve">  … a beat (auto-timed, </w:t>
+      </w:r>
+      <w:r>
+        <w:rPr>
+          <w:color w:val="1a1d26"/>
+          <w:sz w:val="18"/>
+          <w:szCs w:val="18"/>
+          <w:rFonts w:ascii="Courier New" w:cs="Courier New" w:eastAsia="Courier New" w:hAnsi="Courier New"/>
+        </w:rPr>
         <w:t xml:space="preserve">1.8 s)</w:t>
       </w:r>
     </w:p>
@@ -519,275 +1349,16 @@
           <w:szCs w:val="18"/>
           <w:rFonts w:ascii="Courier New" w:cs="Courier New" w:eastAsia="Courier New" w:hAnsi="Courier New"/>
         </w:rPr>
-        <w:t xml:space="preserve">MESSAGES LIST — loads whole, already full: </w:t>
-      </w:r>
-      <w:r>
-        <w:rPr>
-          <w:color w:val="1a1d26"/>
-          <w:sz w:val="18"/>
-          <w:szCs w:val="18"/>
-          <w:rFonts w:ascii="Courier New" w:cs="Courier New" w:eastAsia="Courier New" w:hAnsi="Courier New"/>
-        </w:rPr>
-      </w:r>
-    </w:p>
-    <w:p>
-      <w:pPr>
-        <w:spacing w:after="14"/>
-        <w:ind w:left="280"/>
-      </w:pPr>
-      <w:r>
-        <w:rPr>
-          <w:b/>
-          <w:bCs/>
-          <w:color w:val="1a1d26"/>
-          <w:sz w:val="18"/>
-          <w:szCs w:val="18"/>
-          <w:rFonts w:ascii="Courier New" w:cs="Courier New" w:eastAsia="Courier New" w:hAnsi="Courier New"/>
-        </w:rPr>
-        <w:t xml:space="preserve">   · </w:t>
-      </w:r>
-      <w:r>
-        <w:rPr>
-          <w:color w:val="1a1d26"/>
-          <w:sz w:val="18"/>
-          <w:szCs w:val="18"/>
-          <w:rFonts w:ascii="Courier New" w:cs="Courier New" w:eastAsia="Courier New" w:hAnsi="Courier New"/>
-        </w:rPr>
-        <w:t xml:space="preserve">Mom ❤️ ● — “call me when you’re up. I love you.” (8:02 AM)</w:t>
-      </w:r>
-    </w:p>
-    <w:p>
-      <w:pPr>
-        <w:spacing w:after="14"/>
-        <w:ind w:left="280"/>
-      </w:pPr>
-      <w:r>
-        <w:rPr>
-          <w:b/>
-          <w:bCs/>
-          <w:color w:val="1a1d26"/>
-          <w:sz w:val="18"/>
-          <w:szCs w:val="18"/>
-          <w:rFonts w:ascii="Courier New" w:cs="Courier New" w:eastAsia="Courier New" w:hAnsi="Courier New"/>
-        </w:rPr>
-        <w:t xml:space="preserve">   · </w:t>
-      </w:r>
-      <w:r>
-        <w:rPr>
-          <w:color w:val="1a1d26"/>
-          <w:sz w:val="18"/>
-          <w:szCs w:val="18"/>
-          <w:rFonts w:ascii="Courier New" w:cs="Courier New" w:eastAsia="Courier New" w:hAnsi="Courier New"/>
-        </w:rPr>
-        <w:t xml:space="preserve">Dana + girls 🍸 ● — “Dana: we’re coming over at 7. non-negotiable.” (7:41 AM)</w:t>
-      </w:r>
-    </w:p>
-    <w:p>
-      <w:pPr>
-        <w:spacing w:after="14"/>
-        <w:ind w:left="280"/>
-      </w:pPr>
-      <w:r>
-        <w:rPr>
-          <w:b/>
-          <w:bCs/>
-          <w:color w:val="1a1d26"/>
-          <w:sz w:val="18"/>
-          <w:szCs w:val="18"/>
-          <w:rFonts w:ascii="Courier New" w:cs="Courier New" w:eastAsia="Courier New" w:hAnsi="Courier New"/>
-        </w:rPr>
-        <w:t xml:space="preserve">   · </w:t>
-      </w:r>
-      <w:r>
-        <w:rPr>
-          <w:color w:val="1a1d26"/>
-          <w:sz w:val="18"/>
-          <w:szCs w:val="18"/>
-          <w:rFonts w:ascii="Courier New" w:cs="Courier New" w:eastAsia="Courier New" w:hAnsi="Courier New"/>
-        </w:rPr>
-        <w:t xml:space="preserve">Beth — “just heard. I’m so so sorry 💔” (Yesterday)</w:t>
-      </w:r>
-    </w:p>
-    <w:p>
-      <w:pPr>
-        <w:spacing w:after="14"/>
-        <w:ind w:left="280"/>
-      </w:pPr>
-      <w:r>
-        <w:rPr>
-          <w:b/>
-          <w:bCs/>
-          <w:color w:val="1a1d26"/>
-          <w:sz w:val="18"/>
-          <w:szCs w:val="18"/>
-          <w:rFonts w:ascii="Courier New" w:cs="Courier New" w:eastAsia="Courier New" w:hAnsi="Courier New"/>
-        </w:rPr>
-        <w:t xml:space="preserve">   · </w:t>
-      </w:r>
-      <w:r>
-        <w:rPr>
-          <w:color w:val="1a1d26"/>
-          <w:sz w:val="18"/>
-          <w:szCs w:val="18"/>
-          <w:rFonts w:ascii="Courier New" w:cs="Courier New" w:eastAsia="Courier New" w:hAnsi="Courier New"/>
-        </w:rPr>
-        <w:t xml:space="preserve">Grammy ● — “sweetheart. are you eating?” (Yesterday)</w:t>
-      </w:r>
-    </w:p>
-    <w:p>
-      <w:pPr>
-        <w:spacing w:after="14"/>
-        <w:ind w:left="280"/>
-      </w:pPr>
-      <w:r>
-        <w:rPr>
-          <w:b/>
-          <w:bCs/>
-          <w:color w:val="1a1d26"/>
-          <w:sz w:val="18"/>
-          <w:szCs w:val="18"/>
-          <w:rFonts w:ascii="Courier New" w:cs="Courier New" w:eastAsia="Courier New" w:hAnsi="Courier New"/>
-        </w:rPr>
-        <w:t xml:space="preserve">   · </w:t>
-      </w:r>
-      <w:r>
-        <w:rPr>
-          <w:color w:val="1a1d26"/>
-          <w:sz w:val="18"/>
-          <w:szCs w:val="18"/>
-          <w:rFonts w:ascii="Courier New" w:cs="Courier New" w:eastAsia="Courier New" w:hAnsi="Courier New"/>
-        </w:rPr>
-        <w:t xml:space="preserve">Aunt Patti — “your mother told me. call me, honey” (Yesterday)</w:t>
-      </w:r>
-    </w:p>
-    <w:p>
-      <w:pPr>
-        <w:spacing w:after="14"/>
-        <w:ind w:left="280"/>
-      </w:pPr>
-      <w:r>
-        <w:rPr>
-          <w:b/>
-          <w:bCs/>
-          <w:color w:val="1a1d26"/>
-          <w:sz w:val="18"/>
-          <w:szCs w:val="18"/>
-          <w:rFonts w:ascii="Courier New" w:cs="Courier New" w:eastAsia="Courier New" w:hAnsi="Courier New"/>
-        </w:rPr>
-        <w:t xml:space="preserve">   · </w:t>
-      </w:r>
-      <w:r>
-        <w:rPr>
-          <w:color w:val="1a1d26"/>
-          <w:sz w:val="18"/>
-          <w:szCs w:val="18"/>
-          <w:rFonts w:ascii="Courier New" w:cs="Courier New" w:eastAsia="Courier New" w:hAnsi="Courier New"/>
-        </w:rPr>
-        <w:t xml:space="preserve">Jamie — “I’m not angry. just talk to me” (Yesterday)</w:t>
-      </w:r>
-    </w:p>
-    <w:p>
-      <w:pPr>
-        <w:spacing w:after="14"/>
-        <w:ind w:left="280"/>
-      </w:pPr>
-      <w:r>
-        <w:rPr>
-          <w:b/>
-          <w:bCs/>
-          <w:color w:val="1a1d26"/>
-          <w:sz w:val="18"/>
-          <w:szCs w:val="18"/>
-          <w:rFonts w:ascii="Courier New" w:cs="Courier New" w:eastAsia="Courier New" w:hAnsi="Courier New"/>
-        </w:rPr>
-        <w:t xml:space="preserve">   · </w:t>
-      </w:r>
-      <w:r>
-        <w:rPr>
-          <w:color w:val="1a1d26"/>
-          <w:sz w:val="18"/>
-          <w:szCs w:val="18"/>
-          <w:rFonts w:ascii="Courier New" w:cs="Courier New" w:eastAsia="Courier New" w:hAnsi="Courier New"/>
-        </w:rPr>
-        <w:t xml:space="preserve">Michael (voice) — “no lesson this week — I’m out of town” (Tuesday)</w:t>
-      </w:r>
-    </w:p>
-    <w:p>
-      <w:pPr>
-        <w:spacing w:after="14"/>
-        <w:ind w:left="280"/>
-      </w:pPr>
-      <w:r>
-        <w:rPr>
-          <w:b/>
-          <w:bCs/>
-          <w:color w:val="1a1d26"/>
-          <w:sz w:val="18"/>
-          <w:szCs w:val="18"/>
-          <w:rFonts w:ascii="Courier New" w:cs="Courier New" w:eastAsia="Courier New" w:hAnsi="Courier New"/>
-        </w:rPr>
-        <w:t xml:space="preserve">   · </w:t>
-      </w:r>
-      <w:r>
-        <w:rPr>
-          <w:color w:val="1a1d26"/>
-          <w:sz w:val="18"/>
-          <w:szCs w:val="18"/>
-          <w:rFonts w:ascii="Courier New" w:cs="Courier New" w:eastAsia="Courier New" w:hAnsi="Courier New"/>
-        </w:rPr>
-        <w:t xml:space="preserve">Ohio Housing — “Re: summer sublet — deposit received” (Monday)</w:t>
-      </w:r>
-    </w:p>
-    <w:p>
-      <w:pPr>
-        <w:spacing w:after="14"/>
-        <w:ind w:left="280"/>
-      </w:pPr>
-      <w:r>
-        <w:rPr>
-          <w:b/>
-          <w:bCs/>
-          <w:color w:val="1a1d26"/>
-          <w:sz w:val="18"/>
-          <w:szCs w:val="18"/>
-          <w:rFonts w:ascii="Courier New" w:cs="Courier New" w:eastAsia="Courier New" w:hAnsi="Courier New"/>
-        </w:rPr>
-        <w:t xml:space="preserve">   · </w:t>
-      </w:r>
-      <w:r>
-        <w:rPr>
-          <w:color w:val="1a1d26"/>
-          <w:sz w:val="18"/>
-          <w:szCs w:val="18"/>
-          <w:rFonts w:ascii="Courier New" w:cs="Courier New" w:eastAsia="Courier New" w:hAnsi="Courier New"/>
-        </w:rPr>
-        <w:t xml:space="preserve">CVS Pharmacy — “Your prescription is ready for pickup” (Monday)</w:t>
-      </w:r>
-    </w:p>
-    <w:p>
-      <w:pPr>
-        <w:spacing w:after="14"/>
-        <w:ind w:left="280"/>
-      </w:pPr>
-      <w:r>
-        <w:rPr>
-          <w:b/>
-          <w:bCs/>
-          <w:color w:val="1a1d26"/>
-          <w:sz w:val="18"/>
-          <w:szCs w:val="18"/>
-          <w:rFonts w:ascii="Courier New" w:cs="Courier New" w:eastAsia="Courier New" w:hAnsi="Courier New"/>
-        </w:rPr>
-        <w:t xml:space="preserve">   · </w:t>
-      </w:r>
-      <w:r>
-        <w:rPr>
-          <w:color w:val="1a1d26"/>
-          <w:sz w:val="18"/>
-          <w:szCs w:val="18"/>
-          <w:rFonts w:ascii="Courier New" w:cs="Courier New" w:eastAsia="Courier New" w:hAnsi="Courier New"/>
-        </w:rPr>
-        <w:t xml:space="preserve">Dentist — Dr. Okafor — “Reminder: cleaning Jun 22, 2:30 PM” (Sunday)</w:t>
+        <w:t xml:space="preserve">TYPES LIVE (keyboard up, keys flashing, self-timed): </w:t>
+      </w:r>
+      <w:r>
+        <w:rPr>
+          <w:color w:val="1a1d26"/>
+          <w:sz w:val="18"/>
+          <w:szCs w:val="18"/>
+          <w:rFonts w:ascii="Courier New" w:cs="Courier New" w:eastAsia="Courier New" w:hAnsi="Courier New"/>
+        </w:rPr>
+        <w:t xml:space="preserve">“I’m not sure that I can do this without you”</w:t>
       </w:r>
     </w:p>
     <w:p>
@@ -813,526 +1384,7 @@
           <w:szCs w:val="18"/>
           <w:rFonts w:ascii="Courier New" w:cs="Courier New" w:eastAsia="Courier New" w:hAnsi="Courier New"/>
         </w:rPr>
-        <w:t xml:space="preserve">0.7 s)</w:t>
-      </w:r>
-    </w:p>
-    <w:p>
-      <w:pPr>
-        <w:spacing w:after="14"/>
-        <w:ind w:left="280"/>
-      </w:pPr>
-      <w:r>
-        <w:rPr>
-          <w:b/>
-          <w:bCs/>
-          <w:color w:val="1a1d26"/>
-          <w:sz w:val="18"/>
-          <w:szCs w:val="18"/>
-          <w:rFonts w:ascii="Courier New" w:cs="Courier New" w:eastAsia="Courier New" w:hAnsi="Courier New"/>
-        </w:rPr>
-        <w:t xml:space="preserve">THREAD HISTORY — loads whole with the thread: </w:t>
-      </w:r>
-      <w:r>
-        <w:rPr>
-          <w:color w:val="1a1d26"/>
-          <w:sz w:val="18"/>
-          <w:szCs w:val="18"/>
-          <w:rFonts w:ascii="Courier New" w:cs="Courier New" w:eastAsia="Courier New" w:hAnsi="Courier New"/>
-        </w:rPr>
-      </w:r>
-    </w:p>
-    <w:p>
-      <w:pPr>
-        <w:spacing w:after="14"/>
-        <w:ind w:left="280"/>
-      </w:pPr>
-      <w:r>
-        <w:rPr>
-          <w:b/>
-          <w:bCs/>
-          <w:color w:val="1a1d26"/>
-          <w:sz w:val="18"/>
-          <w:szCs w:val="18"/>
-          <w:rFonts w:ascii="Courier New" w:cs="Courier New" w:eastAsia="Courier New" w:hAnsi="Courier New"/>
-        </w:rPr>
-        <w:t xml:space="preserve">   — </w:t>
-      </w:r>
-      <w:r>
-        <w:rPr>
-          <w:color w:val="1a1d26"/>
-          <w:sz w:val="18"/>
-          <w:szCs w:val="18"/>
-          <w:rFonts w:ascii="Courier New" w:cs="Courier New" w:eastAsia="Courier New" w:hAnsi="Courier New"/>
-        </w:rPr>
-        <w:t xml:space="preserve">Sunday · 8:20 PM</w:t>
-      </w:r>
-    </w:p>
-    <w:p>
-      <w:pPr>
-        <w:spacing w:after="14"/>
-        <w:ind w:left="280"/>
-      </w:pPr>
-      <w:r>
-        <w:rPr>
-          <w:b/>
-          <w:bCs/>
-          <w:color w:val="1a1d26"/>
-          <w:sz w:val="18"/>
-          <w:szCs w:val="18"/>
-          <w:rFonts w:ascii="Courier New" w:cs="Courier New" w:eastAsia="Courier New" w:hAnsi="Courier New"/>
-        </w:rPr>
-        <w:t xml:space="preserve">   SENT (blue): </w:t>
-      </w:r>
-      <w:r>
-        <w:rPr>
-          <w:color w:val="1a1d26"/>
-          <w:sz w:val="18"/>
-          <w:szCs w:val="18"/>
-          <w:rFonts w:ascii="Courier New" w:cs="Courier New" w:eastAsia="Courier New" w:hAnsi="Courier New"/>
-        </w:rPr>
-        <w:t xml:space="preserve">“porch light’s out again. landlord says tuesday”</w:t>
-      </w:r>
-    </w:p>
-    <w:p>
-      <w:pPr>
-        <w:spacing w:after="14"/>
-        <w:ind w:left="280"/>
-      </w:pPr>
-      <w:r>
-        <w:rPr>
-          <w:b/>
-          <w:bCs/>
-          <w:color w:val="1a1d26"/>
-          <w:sz w:val="18"/>
-          <w:szCs w:val="18"/>
-          <w:rFonts w:ascii="Courier New" w:cs="Courier New" w:eastAsia="Courier New" w:hAnsi="Courier New"/>
-        </w:rPr>
-        <w:t xml:space="preserve">   RECEIVED (gray): </w:t>
-      </w:r>
-      <w:r>
-        <w:rPr>
-          <w:color w:val="1a1d26"/>
-          <w:sz w:val="18"/>
-          <w:szCs w:val="18"/>
-          <w:rFonts w:ascii="Courier New" w:cs="Courier New" w:eastAsia="Courier New" w:hAnsi="Courier New"/>
-        </w:rPr>
-        <w:t xml:space="preserve">“ok”</w:t>
-      </w:r>
-    </w:p>
-    <w:p>
-      <w:pPr>
-        <w:spacing w:after="14"/>
-        <w:ind w:left="280"/>
-      </w:pPr>
-      <w:r>
-        <w:rPr>
-          <w:b/>
-          <w:bCs/>
-          <w:color w:val="1a1d26"/>
-          <w:sz w:val="18"/>
-          <w:szCs w:val="18"/>
-          <w:rFonts w:ascii="Courier New" w:cs="Courier New" w:eastAsia="Courier New" w:hAnsi="Courier New"/>
-        </w:rPr>
-        <w:t xml:space="preserve">   — </w:t>
-      </w:r>
-      <w:r>
-        <w:rPr>
-          <w:color w:val="1a1d26"/>
-          <w:sz w:val="18"/>
-          <w:szCs w:val="18"/>
-          <w:rFonts w:ascii="Courier New" w:cs="Courier New" w:eastAsia="Courier New" w:hAnsi="Courier New"/>
-        </w:rPr>
-        <w:t xml:space="preserve">Tuesday · 1:15 PM</w:t>
-      </w:r>
-    </w:p>
-    <w:p>
-      <w:pPr>
-        <w:spacing w:after="14"/>
-        <w:ind w:left="280"/>
-      </w:pPr>
-      <w:r>
-        <w:rPr>
-          <w:b/>
-          <w:bCs/>
-          <w:color w:val="1a1d26"/>
-          <w:sz w:val="18"/>
-          <w:szCs w:val="18"/>
-          <w:rFonts w:ascii="Courier New" w:cs="Courier New" w:eastAsia="Courier New" w:hAnsi="Courier New"/>
-        </w:rPr>
-        <w:t xml:space="preserve">   SENT (blue): </w:t>
-      </w:r>
-      <w:r>
-        <w:rPr>
-          <w:color w:val="1a1d26"/>
-          <w:sz w:val="18"/>
-          <w:szCs w:val="18"/>
-          <w:rFonts w:ascii="Courier New" w:cs="Courier New" w:eastAsia="Courier New" w:hAnsi="Courier New"/>
-        </w:rPr>
-        <w:t xml:space="preserve">“sublet deposit cleared 👍 the room is yours too when you’re here”</w:t>
-      </w:r>
-    </w:p>
-    <w:p>
-      <w:pPr>
-        <w:spacing w:after="14"/>
-        <w:ind w:left="280"/>
-      </w:pPr>
-      <w:r>
-        <w:rPr>
-          <w:b/>
-          <w:bCs/>
-          <w:color w:val="1a1d26"/>
-          <w:sz w:val="18"/>
-          <w:szCs w:val="18"/>
-          <w:rFonts w:ascii="Courier New" w:cs="Courier New" w:eastAsia="Courier New" w:hAnsi="Courier New"/>
-        </w:rPr>
-        <w:t xml:space="preserve">   RECEIVED (gray): </w:t>
-      </w:r>
-      <w:r>
-        <w:rPr>
-          <w:color w:val="1a1d26"/>
-          <w:sz w:val="18"/>
-          <w:szCs w:val="18"/>
-          <w:rFonts w:ascii="Courier New" w:cs="Courier New" w:eastAsia="Courier New" w:hAnsi="Courier New"/>
-        </w:rPr>
-        <w:t xml:space="preserve">“👍”</w:t>
-      </w:r>
-    </w:p>
-    <w:p>
-      <w:pPr>
-        <w:spacing w:after="14"/>
-        <w:ind w:left="280"/>
-      </w:pPr>
-      <w:r>
-        <w:rPr>
-          <w:b/>
-          <w:bCs/>
-          <w:color w:val="1a1d26"/>
-          <w:sz w:val="18"/>
-          <w:szCs w:val="18"/>
-          <w:rFonts w:ascii="Courier New" w:cs="Courier New" w:eastAsia="Courier New" w:hAnsi="Courier New"/>
-        </w:rPr>
-        <w:t xml:space="preserve">   — </w:t>
-      </w:r>
-      <w:r>
-        <w:rPr>
-          <w:color w:val="1a1d26"/>
-          <w:sz w:val="18"/>
-          <w:szCs w:val="18"/>
-          <w:rFonts w:ascii="Courier New" w:cs="Courier New" w:eastAsia="Courier New" w:hAnsi="Courier New"/>
-        </w:rPr>
-        <w:t xml:space="preserve">Yesterday · 5:05 AM</w:t>
-      </w:r>
-    </w:p>
-    <w:p>
-      <w:pPr>
-        <w:spacing w:after="14"/>
-        <w:ind w:left="280"/>
-      </w:pPr>
-      <w:r>
-        <w:rPr>
-          <w:b/>
-          <w:bCs/>
-          <w:color w:val="1a1d26"/>
-          <w:sz w:val="18"/>
-          <w:szCs w:val="18"/>
-          <w:rFonts w:ascii="Courier New" w:cs="Courier New" w:eastAsia="Courier New" w:hAnsi="Courier New"/>
-        </w:rPr>
-        <w:t xml:space="preserve">   SENT (blue): </w:t>
-      </w:r>
-      <w:r>
-        <w:rPr>
-          <w:color w:val="1a1d26"/>
-          <w:sz w:val="18"/>
-          <w:szCs w:val="18"/>
-          <w:rFonts w:ascii="Courier New" w:cs="Courier New" w:eastAsia="Courier New" w:hAnsi="Courier New"/>
-        </w:rPr>
-        <w:t xml:space="preserve">“good morning. can’t wait to see you — what time does your flight land?”</w:t>
-      </w:r>
-    </w:p>
-    <w:p>
-      <w:pPr>
-        <w:spacing w:after="14"/>
-        <w:ind w:left="280"/>
-      </w:pPr>
-      <w:r>
-        <w:rPr>
-          <w:b/>
-          <w:bCs/>
-          <w:color w:val="1a1d26"/>
-          <w:sz w:val="18"/>
-          <w:szCs w:val="18"/>
-          <w:rFonts w:ascii="Courier New" w:cs="Courier New" w:eastAsia="Courier New" w:hAnsi="Courier New"/>
-        </w:rPr>
-        <w:t xml:space="preserve">   — </w:t>
-      </w:r>
-      <w:r>
-        <w:rPr>
-          <w:color w:val="1a1d26"/>
-          <w:sz w:val="18"/>
-          <w:szCs w:val="18"/>
-          <w:rFonts w:ascii="Courier New" w:cs="Courier New" w:eastAsia="Courier New" w:hAnsi="Courier New"/>
-        </w:rPr>
-        <w:t xml:space="preserve">Yesterday · 1:30 PM</w:t>
-      </w:r>
-    </w:p>
-    <w:p>
-      <w:pPr>
-        <w:spacing w:after="14"/>
-        <w:ind w:left="280"/>
-      </w:pPr>
-      <w:r>
-        <w:rPr>
-          <w:b/>
-          <w:bCs/>
-          <w:color w:val="1a1d26"/>
-          <w:sz w:val="18"/>
-          <w:szCs w:val="18"/>
-          <w:rFonts w:ascii="Courier New" w:cs="Courier New" w:eastAsia="Courier New" w:hAnsi="Courier New"/>
-        </w:rPr>
-        <w:t xml:space="preserve">   SENT (blue): </w:t>
-      </w:r>
-      <w:r>
-        <w:rPr>
-          <w:color w:val="1a1d26"/>
-          <w:sz w:val="18"/>
-          <w:szCs w:val="18"/>
-          <w:rFonts w:ascii="Courier New" w:cs="Courier New" w:eastAsia="Courier New" w:hAnsi="Courier New"/>
-        </w:rPr>
-        <w:t xml:space="preserve">“landed?”</w:t>
-      </w:r>
-    </w:p>
-    <w:p>
-      <w:pPr>
-        <w:spacing w:after="14"/>
-        <w:ind w:left="280"/>
-      </w:pPr>
-      <w:r>
-        <w:rPr>
-          <w:b/>
-          <w:bCs/>
-          <w:color w:val="1a1d26"/>
-          <w:sz w:val="18"/>
-          <w:szCs w:val="18"/>
-          <w:rFonts w:ascii="Courier New" w:cs="Courier New" w:eastAsia="Courier New" w:hAnsi="Courier New"/>
-        </w:rPr>
-        <w:t xml:space="preserve">   — </w:t>
-      </w:r>
-      <w:r>
-        <w:rPr>
-          <w:color w:val="1a1d26"/>
-          <w:sz w:val="18"/>
-          <w:szCs w:val="18"/>
-          <w:rFonts w:ascii="Courier New" w:cs="Courier New" w:eastAsia="Courier New" w:hAnsi="Courier New"/>
-        </w:rPr>
-        <w:t xml:space="preserve">Yesterday · 4:40 PM</w:t>
-      </w:r>
-    </w:p>
-    <w:p>
-      <w:pPr>
-        <w:spacing w:after="14"/>
-        <w:ind w:left="280"/>
-      </w:pPr>
-      <w:r>
-        <w:rPr>
-          <w:b/>
-          <w:bCs/>
-          <w:color w:val="1a1d26"/>
-          <w:sz w:val="18"/>
-          <w:szCs w:val="18"/>
-          <w:rFonts w:ascii="Courier New" w:cs="Courier New" w:eastAsia="Courier New" w:hAnsi="Courier New"/>
-        </w:rPr>
-        <w:t xml:space="preserve">   SENT (blue): </w:t>
-      </w:r>
-      <w:r>
-        <w:rPr>
-          <w:color w:val="1a1d26"/>
-          <w:sz w:val="18"/>
-          <w:szCs w:val="18"/>
-          <w:rFonts w:ascii="Courier New" w:cs="Courier New" w:eastAsia="Courier New" w:hAnsi="Courier New"/>
-        </w:rPr>
-        <w:t xml:space="preserve">“I read it. please call me”</w:t>
-      </w:r>
-    </w:p>
-    <w:p>
-      <w:pPr>
-        <w:spacing w:after="14"/>
-        <w:ind w:left="280"/>
-      </w:pPr>
-      <w:r>
-        <w:rPr>
-          <w:b/>
-          <w:bCs/>
-          <w:color w:val="1a1d26"/>
-          <w:sz w:val="18"/>
-          <w:szCs w:val="18"/>
-          <w:rFonts w:ascii="Courier New" w:cs="Courier New" w:eastAsia="Courier New" w:hAnsi="Courier New"/>
-        </w:rPr>
-        <w:t xml:space="preserve">   — </w:t>
-      </w:r>
-      <w:r>
-        <w:rPr>
-          <w:color w:val="1a1d26"/>
-          <w:sz w:val="18"/>
-          <w:szCs w:val="18"/>
-          <w:rFonts w:ascii="Courier New" w:cs="Courier New" w:eastAsia="Courier New" w:hAnsi="Courier New"/>
-        </w:rPr>
-        <w:t xml:space="preserve">Yesterday · 9:30 PM</w:t>
-      </w:r>
-    </w:p>
-    <w:p>
-      <w:pPr>
-        <w:spacing w:after="14"/>
-        <w:ind w:left="280"/>
-      </w:pPr>
-      <w:r>
-        <w:rPr>
-          <w:b/>
-          <w:bCs/>
-          <w:color w:val="1a1d26"/>
-          <w:sz w:val="18"/>
-          <w:szCs w:val="18"/>
-          <w:rFonts w:ascii="Courier New" w:cs="Courier New" w:eastAsia="Courier New" w:hAnsi="Courier New"/>
-        </w:rPr>
-        <w:t xml:space="preserve">   SENT (blue): </w:t>
-      </w:r>
-      <w:r>
-        <w:rPr>
-          <w:color w:val="1a1d26"/>
-          <w:sz w:val="18"/>
-          <w:szCs w:val="18"/>
-          <w:rFonts w:ascii="Courier New" w:cs="Courier New" w:eastAsia="Courier New" w:hAnsi="Courier New"/>
-        </w:rPr>
-        <w:t xml:space="preserve">“I’m not angry. just talk to me”</w:t>
-      </w:r>
-    </w:p>
-    <w:p>
-      <w:pPr>
-        <w:spacing w:after="14"/>
-        <w:ind w:left="280"/>
-      </w:pPr>
-      <w:r>
-        <w:rPr>
-          <w:b/>
-          <w:bCs/>
-          <w:color w:val="1a1d26"/>
-          <w:sz w:val="18"/>
-          <w:szCs w:val="18"/>
-          <w:rFonts w:ascii="Courier New" w:cs="Courier New" w:eastAsia="Courier New" w:hAnsi="Courier New"/>
-        </w:rPr>
-        <w:t xml:space="preserve">   status: </w:t>
-      </w:r>
-      <w:r>
-        <w:rPr>
-          <w:color w:val="1a1d26"/>
-          <w:sz w:val="18"/>
-          <w:szCs w:val="18"/>
-          <w:rFonts w:ascii="Courier New" w:cs="Courier New" w:eastAsia="Courier New" w:hAnsi="Courier New"/>
-        </w:rPr>
-        <w:t xml:space="preserve">Delivered</w:t>
-      </w:r>
-    </w:p>
-    <w:p>
-      <w:pPr>
-        <w:spacing w:after="14"/>
-        <w:ind w:left="280"/>
-      </w:pPr>
-      <w:r>
-        <w:rPr>
-          <w:b/>
-          <w:bCs/>
-          <w:color w:val="1a1d26"/>
-          <w:sz w:val="18"/>
-          <w:szCs w:val="18"/>
-          <w:rFonts w:ascii="Courier New" w:cs="Courier New" w:eastAsia="Courier New" w:hAnsi="Courier New"/>
-        </w:rPr>
-        <w:t xml:space="preserve">  … a beat (auto-timed, </w:t>
-      </w:r>
-      <w:r>
-        <w:rPr>
-          <w:color w:val="1a1d26"/>
-          <w:sz w:val="18"/>
-          <w:szCs w:val="18"/>
-          <w:rFonts w:ascii="Courier New" w:cs="Courier New" w:eastAsia="Courier New" w:hAnsi="Courier New"/>
-        </w:rPr>
-        <w:t xml:space="preserve">0.7 s)</w:t>
-      </w:r>
-    </w:p>
-    <w:p>
-      <w:pPr>
-        <w:spacing w:after="14"/>
-        <w:ind w:left="280"/>
-      </w:pPr>
-      <w:r>
-        <w:rPr>
-          <w:b/>
-          <w:bCs/>
-          <w:color w:val="1a1d26"/>
-          <w:sz w:val="18"/>
-          <w:szCs w:val="18"/>
-          <w:rFonts w:ascii="Courier New" w:cs="Courier New" w:eastAsia="Courier New" w:hAnsi="Courier New"/>
-        </w:rPr>
-        <w:t xml:space="preserve">thread caption: </w:t>
-      </w:r>
-      <w:r>
-        <w:rPr>
-          <w:color w:val="1a1d26"/>
-          <w:sz w:val="18"/>
-          <w:szCs w:val="18"/>
-          <w:rFonts w:ascii="Courier New" w:cs="Courier New" w:eastAsia="Courier New" w:hAnsi="Courier New"/>
-        </w:rPr>
-        <w:t xml:space="preserve">Today · 9:41 AM</w:t>
-      </w:r>
-    </w:p>
-    <w:p>
-      <w:pPr>
-        <w:spacing w:after="14"/>
-        <w:ind w:left="280"/>
-      </w:pPr>
-      <w:r>
-        <w:rPr>
-          <w:b/>
-          <w:bCs/>
-          <w:color w:val="1a1d26"/>
-          <w:sz w:val="18"/>
-          <w:szCs w:val="18"/>
-          <w:rFonts w:ascii="Courier New" w:cs="Courier New" w:eastAsia="Courier New" w:hAnsi="Courier New"/>
-        </w:rPr>
-        <w:t xml:space="preserve">TYPES LIVE (keyboard up, keys flashing, self-timed): </w:t>
-      </w:r>
-      <w:r>
-        <w:rPr>
-          <w:color w:val="1a1d26"/>
-          <w:sz w:val="18"/>
-          <w:szCs w:val="18"/>
-          <w:rFonts w:ascii="Courier New" w:cs="Courier New" w:eastAsia="Courier New" w:hAnsi="Courier New"/>
-        </w:rPr>
-        <w:t xml:space="preserve">“I’m not sure that I can do this without you”</w:t>
-      </w:r>
-    </w:p>
-    <w:p>
-      <w:pPr>
-        <w:spacing w:after="14"/>
-        <w:ind w:left="280"/>
-      </w:pPr>
-      <w:r>
-        <w:rPr>
-          <w:b/>
-          <w:bCs/>
-          <w:color w:val="1a1d26"/>
-          <w:sz w:val="18"/>
-          <w:szCs w:val="18"/>
-          <w:rFonts w:ascii="Courier New" w:cs="Courier New" w:eastAsia="Courier New" w:hAnsi="Courier New"/>
-        </w:rPr>
-        <w:t xml:space="preserve">  … a beat (auto-timed, </w:t>
-      </w:r>
-      <w:r>
-        <w:rPr>
-          <w:color w:val="1a1d26"/>
-          <w:sz w:val="18"/>
-          <w:szCs w:val="18"/>
-          <w:rFonts w:ascii="Courier New" w:cs="Courier New" w:eastAsia="Courier New" w:hAnsi="Courier New"/>
-        </w:rPr>
-        <w:t xml:space="preserve">0.4 s)</w:t>
+        <w:t xml:space="preserve">2.6 s)</w:t>
       </w:r>
     </w:p>
     <w:p>
@@ -2110,7 +2162,7 @@
           <w:szCs w:val="19"/>
           <w:rFonts w:ascii="Georgia" w:cs="Georgia" w:eastAsia="Georgia" w:hAnsi="Georgia"/>
         </w:rPr>
-        <w:t xml:space="preserve">AUTO-PLAYS from this GO (~14 s). She leaves the thread and opens the Memories the notification offered: four cards scroll past — the bear (last year), the wedding, the ring, the couch — then she drifts back up to the bear and holds on it.</w:t>
+        <w:t xml:space="preserve">AUTO-PLAYS from this GO (~40 s — slowed by direction: each card’s caption centers, then the eye drifts down into the photograph). She leaves the thread and opens the Memories the notification offered: four cards scroll past — the bear (last year), the wedding, the ring, the couch — then she drifts back up to the bear and holds on it.</w:t>
       </w:r>
     </w:p>
     <w:p>
@@ -2153,7 +2205,7 @@
           <w:szCs w:val="18"/>
           <w:rFonts w:ascii="Courier New" w:cs="Courier New" w:eastAsia="Courier New" w:hAnsi="Courier New"/>
         </w:rPr>
-        <w:t xml:space="preserve">0.5 s)</w:t>
+        <w:t xml:space="preserve">1.8 s)</w:t>
       </w:r>
     </w:p>
     <w:p>
@@ -2283,7 +2335,7 @@
           <w:szCs w:val="18"/>
           <w:rFonts w:ascii="Courier New" w:cs="Courier New" w:eastAsia="Courier New" w:hAnsi="Courier New"/>
         </w:rPr>
-        <w:t xml:space="preserve">1.5 s)</w:t>
+        <w:t xml:space="preserve">5.0 s)</w:t>
       </w:r>
     </w:p>
     <w:p>
@@ -2413,7 +2465,7 @@
           <w:szCs w:val="18"/>
           <w:rFonts w:ascii="Courier New" w:cs="Courier New" w:eastAsia="Courier New" w:hAnsi="Courier New"/>
         </w:rPr>
-        <w:t xml:space="preserve">1.4 s)</w:t>
+        <w:t xml:space="preserve">5.0 s)</w:t>
       </w:r>
     </w:p>
     <w:p>
@@ -2543,7 +2595,7 @@
           <w:szCs w:val="18"/>
           <w:rFonts w:ascii="Courier New" w:cs="Courier New" w:eastAsia="Courier New" w:hAnsi="Courier New"/>
         </w:rPr>
-        <w:t xml:space="preserve">1.4 s)</w:t>
+        <w:t xml:space="preserve">5.0 s)</w:t>
       </w:r>
     </w:p>
     <w:p>
@@ -10323,7 +10375,7 @@
           <w:szCs w:val="19"/>
           <w:rFonts w:ascii="Georgia" w:cs="Georgia" w:eastAsia="Georgia" w:hAnsi="Georgia"/>
         </w:rPr>
-        <w:t xml:space="preserve">INTERMISSION: the falling pages return with an Intermission page. Holds through the break; the first GO of Act Two (9.1) clears it.</w:t>
+        <w:t xml:space="preserve">INTERMISSION: the calendar’s top page reads Intermission and holds, still, through the break; the first GO of Act Two (9.1) tears it off.</w:t>
       </w:r>
     </w:p>
     <w:p>
@@ -10532,7 +10584,33 @@
           <w:szCs w:val="18"/>
           <w:rFonts w:ascii="Courier New" w:cs="Courier New" w:eastAsia="Courier New" w:hAnsi="Courier New"/>
         </w:rPr>
-        <w:t xml:space="preserve">clears</w:t>
+        <w:t xml:space="preserve">“five months married”</w:t>
+      </w:r>
+    </w:p>
+    <w:p>
+      <w:pPr>
+        <w:spacing w:after="14"/>
+        <w:ind w:left="280"/>
+      </w:pPr>
+      <w:r>
+        <w:rPr>
+          <w:b/>
+          <w:bCs/>
+          <w:color w:val="1a1d26"/>
+          <w:sz w:val="18"/>
+          <w:szCs w:val="18"/>
+          <w:rFonts w:ascii="Courier New" w:cs="Courier New" w:eastAsia="Courier New" w:hAnsi="Courier New"/>
+        </w:rPr>
+        <w:t xml:space="preserve">WALLPAPER — </w:t>
+      </w:r>
+      <w:r>
+        <w:rPr>
+          <w:color w:val="1a1d26"/>
+          <w:sz w:val="18"/>
+          <w:szCs w:val="18"/>
+          <w:rFonts w:ascii="Courier New" w:cs="Courier New" w:eastAsia="Courier New" w:hAnsi="Courier New"/>
+        </w:rPr>
+        <w:t xml:space="preserve">M4 — the wedding portrait</w:t>
       </w:r>
     </w:p>
     <w:p>
@@ -10589,7 +10667,7 @@
           <w:szCs w:val="17"/>
           <w:rFonts w:ascii="Courier New" w:cs="Courier New" w:eastAsia="Courier New" w:hAnsi="Courier New"/>
         </w:rPr>
-        <w:t xml:space="preserve">SL = Lock screen  ·  clock 11:22</w:t>
+        <w:t xml:space="preserve">SL = Lock screen  ·  stamp “five months married”  ·  clock 11:22</w:t>
       </w:r>
     </w:p>
     <w:p>
@@ -10678,16 +10756,16 @@
           <w:szCs w:val="18"/>
           <w:rFonts w:ascii="Courier New" w:cs="Courier New" w:eastAsia="Courier New" w:hAnsi="Courier New"/>
         </w:rPr>
-        <w:t xml:space="preserve">NOTIFICATION — Instagram · @a.reader.somewhere (now): </w:t>
-      </w:r>
-      <w:r>
-        <w:rPr>
-          <w:color w:val="1a1d26"/>
-          <w:sz w:val="18"/>
-          <w:szCs w:val="18"/>
-          <w:rFonts w:ascii="Courier New" w:cs="Courier New" w:eastAsia="Courier New" w:hAnsi="Courier New"/>
-        </w:rPr>
-        <w:t xml:space="preserve">“okay the ending WRECKED me. how are you real”</w:t>
+        <w:t xml:space="preserve">NOTIFICATION — Instagram · a.reader.somewhere (now): </w:t>
+      </w:r>
+      <w:r>
+        <w:rPr>
+          <w:color w:val="1a1d26"/>
+          <w:sz w:val="18"/>
+          <w:szCs w:val="18"/>
+          <w:rFonts w:ascii="Courier New" w:cs="Courier New" w:eastAsia="Courier New" w:hAnsi="Courier New"/>
+        </w:rPr>
+        <w:t xml:space="preserve">“commented: okay the ending WRECKED me. how are you real”</w:t>
       </w:r>
     </w:p>
     <w:p>
@@ -10840,16 +10918,16 @@
           <w:szCs w:val="18"/>
           <w:rFonts w:ascii="Courier New" w:cs="Courier New" w:eastAsia="Courier New" w:hAnsi="Courier New"/>
         </w:rPr>
-        <w:t xml:space="preserve">NOTIFICATION — Instagram · @lit.with.lena (now): </w:t>
-      </w:r>
-      <w:r>
-        <w:rPr>
-          <w:color w:val="1a1d26"/>
-          <w:sz w:val="18"/>
-          <w:szCs w:val="18"/>
-          <w:rFonts w:ascii="Courier New" w:cs="Courier New" w:eastAsia="Courier New" w:hAnsi="Courier New"/>
-        </w:rPr>
-        <w:t xml:space="preserve">“sent you a message request”</w:t>
+        <w:t xml:space="preserve">NOTIFICATION — Instagram · lit.with.lena (now): </w:t>
+      </w:r>
+      <w:r>
+        <w:rPr>
+          <w:color w:val="1a1d26"/>
+          <w:sz w:val="18"/>
+          <w:szCs w:val="18"/>
+          <w:rFonts w:ascii="Courier New" w:cs="Courier New" w:eastAsia="Courier New" w:hAnsi="Courier New"/>
+        </w:rPr>
+        <w:t xml:space="preserve">“wants to send you a message”</w:t>
       </w:r>
     </w:p>
     <w:p>
@@ -10968,7 +11046,7 @@
           <w:szCs w:val="19"/>
           <w:rFonts w:ascii="Georgia" w:cs="Georgia" w:eastAsia="Georgia" w:hAnsi="Georgia"/>
         </w:rPr>
-        <w:t xml:space="preserve">The book keeps growing without him.</w:t>
+        <w:t xml:space="preserve">The book keeps growing without him — his agent, not a stranger, says so.</w:t>
       </w:r>
     </w:p>
     <w:p>
@@ -11002,16 +11080,42 @@
           <w:szCs w:val="18"/>
           <w:rFonts w:ascii="Courier New" w:cs="Courier New" w:eastAsia="Courier New" w:hAnsi="Courier New"/>
         </w:rPr>
-        <w:t xml:space="preserve">NOTIFICATION — Goodreads (now): </w:t>
-      </w:r>
-      <w:r>
-        <w:rPr>
-          <w:color w:val="1a1d26"/>
-          <w:sz w:val="18"/>
-          <w:szCs w:val="18"/>
-          <w:rFonts w:ascii="Courier New" w:cs="Courier New" w:eastAsia="Courier New" w:hAnsi="Courier New"/>
-        </w:rPr>
-        <w:t xml:space="preserve">“Your book passed 10,000 ratings · ★ 4.6”</w:t>
+        <w:t xml:space="preserve">TIME → </w:t>
+      </w:r>
+      <w:r>
+        <w:rPr>
+          <w:color w:val="1a1d26"/>
+          <w:sz w:val="18"/>
+          <w:szCs w:val="18"/>
+          <w:rFonts w:ascii="Courier New" w:cs="Courier New" w:eastAsia="Courier New" w:hAnsi="Courier New"/>
+        </w:rPr>
+        <w:t xml:space="preserve">11:25</w:t>
+      </w:r>
+    </w:p>
+    <w:p>
+      <w:pPr>
+        <w:spacing w:after="14"/>
+        <w:ind w:left="280"/>
+      </w:pPr>
+      <w:r>
+        <w:rPr>
+          <w:b/>
+          <w:bCs/>
+          <w:color w:val="1a1d26"/>
+          <w:sz w:val="18"/>
+          <w:szCs w:val="18"/>
+          <w:rFonts w:ascii="Courier New" w:cs="Courier New" w:eastAsia="Courier New" w:hAnsi="Courier New"/>
+        </w:rPr>
+        <w:t xml:space="preserve">NOTIFICATION — Messages · Linda Whitfield (now): </w:t>
+      </w:r>
+      <w:r>
+        <w:rPr>
+          <w:color w:val="1a1d26"/>
+          <w:sz w:val="18"/>
+          <w:szCs w:val="18"/>
+          <w:rFonts w:ascii="Courier New" w:cs="Courier New" w:eastAsia="Courier New" w:hAnsi="Courier New"/>
+        </w:rPr>
+        <w:t xml:space="preserve">“third printing confirmed. do NOT post it yet 🍾”</w:t>
       </w:r>
     </w:p>
     <w:p>
@@ -11115,7 +11219,7 @@
           <w:szCs w:val="19"/>
           <w:rFonts w:ascii="Georgia" w:cs="Georgia" w:eastAsia="Georgia" w:hAnsi="Georgia"/>
         </w:rPr>
-        <w:t xml:space="preserve">   —  “Let’s get a cup of coffee.” — Elise</w:t>
+        <w:t xml:space="preserve">   —  “Let’s get a cup of coffee.”</w:t>
       </w:r>
     </w:p>
     <w:p>
@@ -11130,7 +11234,7 @@
           <w:szCs w:val="19"/>
           <w:rFonts w:ascii="Georgia" w:cs="Georgia" w:eastAsia="Georgia" w:hAnsi="Georgia"/>
         </w:rPr>
-        <w:t xml:space="preserve">And Elise.</w:t>
+        <w:t xml:space="preserve">And Elise (the editor at Random House — the woman in this verse is unnamed in the score; the screen names her).</w:t>
       </w:r>
     </w:p>
     <w:p>
@@ -11164,7 +11268,7 @@
           <w:szCs w:val="18"/>
           <w:rFonts w:ascii="Courier New" w:cs="Courier New" w:eastAsia="Courier New" w:hAnsi="Courier New"/>
         </w:rPr>
-        <w:t xml:space="preserve">NOTIFICATION — Messages · Elise · Ed. (now): </w:t>
+        <w:t xml:space="preserve">NOTIFICATION — Messages · Elise (Random House) (now): </w:t>
       </w:r>
       <w:r>
         <w:rPr>
@@ -11292,7 +11396,7 @@
           <w:szCs w:val="19"/>
           <w:rFonts w:ascii="Georgia" w:cs="Georgia" w:eastAsia="Georgia" w:hAnsi="Georgia"/>
         </w:rPr>
-        <w:t xml:space="preserve">Front row.</w:t>
+        <w:t xml:space="preserve">Front row. (⚠CONFIRM which occurrence of the phrase — David pins it on the Cue Sheet.)</w:t>
       </w:r>
     </w:p>
     <w:p>
@@ -11326,16 +11430,42 @@
           <w:szCs w:val="18"/>
           <w:rFonts w:ascii="Courier New" w:cs="Courier New" w:eastAsia="Courier New" w:hAnsi="Courier New"/>
         </w:rPr>
-        <w:t xml:space="preserve">NOTIFICATION — Instagram · @novel.annie (now): </w:t>
-      </w:r>
-      <w:r>
-        <w:rPr>
-          <w:color w:val="1a1d26"/>
-          <w:sz w:val="18"/>
-          <w:szCs w:val="18"/>
-          <w:rFonts w:ascii="Courier New" w:cs="Courier New" w:eastAsia="Courier New" w:hAnsi="Courier New"/>
-        </w:rPr>
-        <w:t xml:space="preserve">“front row at your reading tonight 🙋‍♀️”</w:t>
+        <w:t xml:space="preserve">TIME → </w:t>
+      </w:r>
+      <w:r>
+        <w:rPr>
+          <w:color w:val="1a1d26"/>
+          <w:sz w:val="18"/>
+          <w:szCs w:val="18"/>
+          <w:rFonts w:ascii="Courier New" w:cs="Courier New" w:eastAsia="Courier New" w:hAnsi="Courier New"/>
+        </w:rPr>
+        <w:t xml:space="preserve">11:29</w:t>
+      </w:r>
+    </w:p>
+    <w:p>
+      <w:pPr>
+        <w:spacing w:after="14"/>
+        <w:ind w:left="280"/>
+      </w:pPr>
+      <w:r>
+        <w:rPr>
+          <w:b/>
+          <w:bCs/>
+          <w:color w:val="1a1d26"/>
+          <w:sz w:val="18"/>
+          <w:szCs w:val="18"/>
+          <w:rFonts w:ascii="Courier New" w:cs="Courier New" w:eastAsia="Courier New" w:hAnsi="Courier New"/>
+        </w:rPr>
+        <w:t xml:space="preserve">NOTIFICATION — Instagram · novel.annie (now): </w:t>
+      </w:r>
+      <w:r>
+        <w:rPr>
+          <w:color w:val="1a1d26"/>
+          <w:sz w:val="18"/>
+          <w:szCs w:val="18"/>
+          <w:rFonts w:ascii="Courier New" w:cs="Courier New" w:eastAsia="Courier New" w:hAnsi="Courier New"/>
+        </w:rPr>
+        <w:t xml:space="preserve">“commented: front row at your reading tonight 🙋‍♀️”</w:t>
       </w:r>
     </w:p>
     <w:p>

</xml_diff>

<commit_message>
The ladder: dressing-room mirror (M26) is the 2025 card, the bear (M2) takes the couch's 2022 slot, the couch (M15) is cut; she stays on the bear
Co-Authored-By: Claude Fable 5.1 <noreply@anthropic.com>
Claude-Session: https://claude.ai/code/session_01Y6sUkZbYffNPeDjzCChZiy
</commit_message>
<xml_diff>
--- a/L5Y-Cue-Bible.docx
+++ b/L5Y-Cue-Bible.docx
@@ -2162,7 +2162,7 @@
           <w:szCs w:val="19"/>
           <w:rFonts w:ascii="Georgia" w:cs="Georgia" w:eastAsia="Georgia" w:hAnsi="Georgia"/>
         </w:rPr>
-        <w:t xml:space="preserve">AUTO-PLAYS from this GO (~40 s — slowed by direction: each card’s caption centers, then the eye drifts down into the photograph). She leaves the thread and opens the Memories the notification offered: four cards scroll past — the bear (last year), the wedding, the ring, the couch — then she drifts back up to the bear and holds on it.</w:t>
+        <w:t xml:space="preserve">AUTO-PLAYS from this GO (~40 s — slowed by direction: each card’s caption centers, then the eye drifts down into the photograph). She leaves the thread and opens the Memories the notification offered: four cards scroll past — the dressing-room mirror (last year, Ohio round 2 day 1), the wedding, the ring, and the bear he brought at nine months — and she stays on the bear.</w:t>
       </w:r>
     </w:p>
     <w:p>
@@ -2283,6 +2283,396 @@
           <w:szCs w:val="18"/>
           <w:rFonts w:ascii="Courier New" w:cs="Courier New" w:eastAsia="Courier New" w:hAnsi="Courier New"/>
         </w:rPr>
+        <w:t xml:space="preserve">M26 — Cathy in the dressing-room mirror</w:t>
+      </w:r>
+    </w:p>
+    <w:p>
+      <w:pPr>
+        <w:spacing w:after="14"/>
+        <w:ind w:left="280"/>
+      </w:pPr>
+      <w:r>
+        <w:rPr>
+          <w:b/>
+          <w:bCs/>
+          <w:color w:val="1a1d26"/>
+          <w:sz w:val="18"/>
+          <w:szCs w:val="18"/>
+          <w:rFonts w:ascii="Courier New" w:cs="Courier New" w:eastAsia="Courier New" w:hAnsi="Courier New"/>
+        </w:rPr>
+        <w:t xml:space="preserve">  reactions: </w:t>
+      </w:r>
+      <w:r>
+        <w:rPr>
+          <w:color w:val="1a1d26"/>
+          <w:sz w:val="18"/>
+          <w:szCs w:val="18"/>
+          <w:rFonts w:ascii="Courier New" w:cs="Courier New" w:eastAsia="Courier New" w:hAnsi="Courier New"/>
+        </w:rPr>
+        <w:t xml:space="preserve">👍 64</w:t>
+      </w:r>
+    </w:p>
+    <w:p>
+      <w:pPr>
+        <w:spacing w:after="14"/>
+        <w:ind w:left="280"/>
+      </w:pPr>
+      <w:r>
+        <w:rPr>
+          <w:b/>
+          <w:bCs/>
+          <w:color w:val="1a1d26"/>
+          <w:sz w:val="18"/>
+          <w:szCs w:val="18"/>
+          <w:rFonts w:ascii="Courier New" w:cs="Courier New" w:eastAsia="Courier New" w:hAnsi="Courier New"/>
+        </w:rPr>
+        <w:t xml:space="preserve">  … a beat (auto-timed, </w:t>
+      </w:r>
+      <w:r>
+        <w:rPr>
+          <w:color w:val="1a1d26"/>
+          <w:sz w:val="18"/>
+          <w:szCs w:val="18"/>
+          <w:rFonts w:ascii="Courier New" w:cs="Courier New" w:eastAsia="Courier New" w:hAnsi="Courier New"/>
+        </w:rPr>
+        <w:t xml:space="preserve">5.0 s)</w:t>
+      </w:r>
+    </w:p>
+    <w:p>
+      <w:pPr>
+        <w:spacing w:after="14"/>
+        <w:ind w:left="280"/>
+      </w:pPr>
+      <w:r>
+        <w:rPr>
+          <w:b/>
+          <w:bCs/>
+          <w:color w:val="1a1d26"/>
+          <w:sz w:val="18"/>
+          <w:szCs w:val="18"/>
+          <w:rFonts w:ascii="Courier New" w:cs="Courier New" w:eastAsia="Courier New" w:hAnsi="Courier New"/>
+        </w:rPr>
+        <w:t xml:space="preserve">MEMORY CARD — </w:t>
+      </w:r>
+      <w:r>
+        <w:rPr>
+          <w:color w:val="1a1d26"/>
+          <w:sz w:val="18"/>
+          <w:szCs w:val="18"/>
+          <w:rFonts w:ascii="Courier New" w:cs="Courier New" w:eastAsia="Courier New" w:hAnsi="Courier New"/>
+        </w:rPr>
+        <w:t xml:space="preserve">2 years ago — Cathy Wellerstein · June 12</w:t>
+      </w:r>
+    </w:p>
+    <w:p>
+      <w:pPr>
+        <w:spacing w:after="14"/>
+        <w:ind w:left="280"/>
+      </w:pPr>
+      <w:r>
+        <w:rPr>
+          <w:b/>
+          <w:bCs/>
+          <w:color w:val="1a1d26"/>
+          <w:sz w:val="18"/>
+          <w:szCs w:val="18"/>
+          <w:rFonts w:ascii="Courier New" w:cs="Courier New" w:eastAsia="Courier New" w:hAnsi="Courier New"/>
+        </w:rPr>
+        <w:t xml:space="preserve">  post: </w:t>
+      </w:r>
+      <w:r>
+        <w:rPr>
+          <w:color w:val="1a1d26"/>
+          <w:sz w:val="18"/>
+          <w:szCs w:val="18"/>
+          <w:rFonts w:ascii="Courier New" w:cs="Courier New" w:eastAsia="Courier New" w:hAnsi="Courier New"/>
+        </w:rPr>
+        <w:t xml:space="preserve">“married three weeks and 600 miles apart. worth it.”</w:t>
+      </w:r>
+    </w:p>
+    <w:p>
+      <w:pPr>
+        <w:spacing w:after="14"/>
+        <w:ind w:left="280"/>
+      </w:pPr>
+      <w:r>
+        <w:rPr>
+          <w:b/>
+          <w:bCs/>
+          <w:color w:val="1a1d26"/>
+          <w:sz w:val="18"/>
+          <w:szCs w:val="18"/>
+          <w:rFonts w:ascii="Courier New" w:cs="Courier New" w:eastAsia="Courier New" w:hAnsi="Courier New"/>
+        </w:rPr>
+        <w:t xml:space="preserve">  media: </w:t>
+      </w:r>
+      <w:r>
+        <w:rPr>
+          <w:color w:val="1a1d26"/>
+          <w:sz w:val="18"/>
+          <w:szCs w:val="18"/>
+          <w:rFonts w:ascii="Courier New" w:cs="Courier New" w:eastAsia="Courier New" w:hAnsi="Courier New"/>
+        </w:rPr>
+        <w:t xml:space="preserve">M4 — the wedding portrait</w:t>
+      </w:r>
+    </w:p>
+    <w:p>
+      <w:pPr>
+        <w:spacing w:after="14"/>
+        <w:ind w:left="280"/>
+      </w:pPr>
+      <w:r>
+        <w:rPr>
+          <w:b/>
+          <w:bCs/>
+          <w:color w:val="1a1d26"/>
+          <w:sz w:val="18"/>
+          <w:szCs w:val="18"/>
+          <w:rFonts w:ascii="Courier New" w:cs="Courier New" w:eastAsia="Courier New" w:hAnsi="Courier New"/>
+        </w:rPr>
+        <w:t xml:space="preserve">  reactions: </w:t>
+      </w:r>
+      <w:r>
+        <w:rPr>
+          <w:color w:val="1a1d26"/>
+          <w:sz w:val="18"/>
+          <w:szCs w:val="18"/>
+          <w:rFonts w:ascii="Courier New" w:cs="Courier New" w:eastAsia="Courier New" w:hAnsi="Courier New"/>
+        </w:rPr>
+        <w:t xml:space="preserve">👍 402</w:t>
+      </w:r>
+    </w:p>
+    <w:p>
+      <w:pPr>
+        <w:spacing w:after="14"/>
+        <w:ind w:left="280"/>
+      </w:pPr>
+      <w:r>
+        <w:rPr>
+          <w:b/>
+          <w:bCs/>
+          <w:color w:val="1a1d26"/>
+          <w:sz w:val="18"/>
+          <w:szCs w:val="18"/>
+          <w:rFonts w:ascii="Courier New" w:cs="Courier New" w:eastAsia="Courier New" w:hAnsi="Courier New"/>
+        </w:rPr>
+        <w:t xml:space="preserve">  … a beat (auto-timed, </w:t>
+      </w:r>
+      <w:r>
+        <w:rPr>
+          <w:color w:val="1a1d26"/>
+          <w:sz w:val="18"/>
+          <w:szCs w:val="18"/>
+          <w:rFonts w:ascii="Courier New" w:cs="Courier New" w:eastAsia="Courier New" w:hAnsi="Courier New"/>
+        </w:rPr>
+        <w:t xml:space="preserve">5.0 s)</w:t>
+      </w:r>
+    </w:p>
+    <w:p>
+      <w:pPr>
+        <w:spacing w:after="14"/>
+        <w:ind w:left="280"/>
+      </w:pPr>
+      <w:r>
+        <w:rPr>
+          <w:b/>
+          <w:bCs/>
+          <w:color w:val="1a1d26"/>
+          <w:sz w:val="18"/>
+          <w:szCs w:val="18"/>
+          <w:rFonts w:ascii="Courier New" w:cs="Courier New" w:eastAsia="Courier New" w:hAnsi="Courier New"/>
+        </w:rPr>
+        <w:t xml:space="preserve">MEMORY CARD — </w:t>
+      </w:r>
+      <w:r>
+        <w:rPr>
+          <w:color w:val="1a1d26"/>
+          <w:sz w:val="18"/>
+          <w:szCs w:val="18"/>
+          <w:rFonts w:ascii="Courier New" w:cs="Courier New" w:eastAsia="Courier New" w:hAnsi="Courier New"/>
+        </w:rPr>
+        <w:t xml:space="preserve">3 years ago — Cathy Wellerstein · June 12</w:t>
+      </w:r>
+    </w:p>
+    <w:p>
+      <w:pPr>
+        <w:spacing w:after="14"/>
+        <w:ind w:left="280"/>
+      </w:pPr>
+      <w:r>
+        <w:rPr>
+          <w:b/>
+          <w:bCs/>
+          <w:color w:val="1a1d26"/>
+          <w:sz w:val="18"/>
+          <w:szCs w:val="18"/>
+          <w:rFonts w:ascii="Courier New" w:cs="Courier New" w:eastAsia="Courier New" w:hAnsi="Courier New"/>
+        </w:rPr>
+        <w:t xml:space="preserve">  post: </w:t>
+      </w:r>
+      <w:r>
+        <w:rPr>
+          <w:color w:val="1a1d26"/>
+          <w:sz w:val="18"/>
+          <w:szCs w:val="18"/>
+          <w:rFonts w:ascii="Courier New" w:cs="Courier New" w:eastAsia="Courier New" w:hAnsi="Courier New"/>
+        </w:rPr>
+        <w:t xml:space="preserve">“he asked. I said yes before he finished 💍”</w:t>
+      </w:r>
+    </w:p>
+    <w:p>
+      <w:pPr>
+        <w:spacing w:after="14"/>
+        <w:ind w:left="280"/>
+      </w:pPr>
+      <w:r>
+        <w:rPr>
+          <w:b/>
+          <w:bCs/>
+          <w:color w:val="1a1d26"/>
+          <w:sz w:val="18"/>
+          <w:szCs w:val="18"/>
+          <w:rFonts w:ascii="Courier New" w:cs="Courier New" w:eastAsia="Courier New" w:hAnsi="Courier New"/>
+        </w:rPr>
+        <w:t xml:space="preserve">  media: </w:t>
+      </w:r>
+      <w:r>
+        <w:rPr>
+          <w:color w:val="1a1d26"/>
+          <w:sz w:val="18"/>
+          <w:szCs w:val="18"/>
+          <w:rFonts w:ascii="Courier New" w:cs="Courier New" w:eastAsia="Courier New" w:hAnsi="Courier New"/>
+        </w:rPr>
+        <w:t xml:space="preserve">M3a — the ring, the rowboat</w:t>
+      </w:r>
+    </w:p>
+    <w:p>
+      <w:pPr>
+        <w:spacing w:after="14"/>
+        <w:ind w:left="280"/>
+      </w:pPr>
+      <w:r>
+        <w:rPr>
+          <w:b/>
+          <w:bCs/>
+          <w:color w:val="1a1d26"/>
+          <w:sz w:val="18"/>
+          <w:szCs w:val="18"/>
+          <w:rFonts w:ascii="Courier New" w:cs="Courier New" w:eastAsia="Courier New" w:hAnsi="Courier New"/>
+        </w:rPr>
+        <w:t xml:space="preserve">  reactions: </w:t>
+      </w:r>
+      <w:r>
+        <w:rPr>
+          <w:color w:val="1a1d26"/>
+          <w:sz w:val="18"/>
+          <w:szCs w:val="18"/>
+          <w:rFonts w:ascii="Courier New" w:cs="Courier New" w:eastAsia="Courier New" w:hAnsi="Courier New"/>
+        </w:rPr>
+        <w:t xml:space="preserve">👍 341</w:t>
+      </w:r>
+    </w:p>
+    <w:p>
+      <w:pPr>
+        <w:spacing w:after="14"/>
+        <w:ind w:left="280"/>
+      </w:pPr>
+      <w:r>
+        <w:rPr>
+          <w:b/>
+          <w:bCs/>
+          <w:color w:val="1a1d26"/>
+          <w:sz w:val="18"/>
+          <w:szCs w:val="18"/>
+          <w:rFonts w:ascii="Courier New" w:cs="Courier New" w:eastAsia="Courier New" w:hAnsi="Courier New"/>
+        </w:rPr>
+        <w:t xml:space="preserve">  … a beat (auto-timed, </w:t>
+      </w:r>
+      <w:r>
+        <w:rPr>
+          <w:color w:val="1a1d26"/>
+          <w:sz w:val="18"/>
+          <w:szCs w:val="18"/>
+          <w:rFonts w:ascii="Courier New" w:cs="Courier New" w:eastAsia="Courier New" w:hAnsi="Courier New"/>
+        </w:rPr>
+        <w:t xml:space="preserve">5.0 s)</w:t>
+      </w:r>
+    </w:p>
+    <w:p>
+      <w:pPr>
+        <w:spacing w:after="14"/>
+        <w:ind w:left="280"/>
+      </w:pPr>
+      <w:r>
+        <w:rPr>
+          <w:b/>
+          <w:bCs/>
+          <w:color w:val="1a1d26"/>
+          <w:sz w:val="18"/>
+          <w:szCs w:val="18"/>
+          <w:rFonts w:ascii="Courier New" w:cs="Courier New" w:eastAsia="Courier New" w:hAnsi="Courier New"/>
+        </w:rPr>
+        <w:t xml:space="preserve">MEMORY CARD — </w:t>
+      </w:r>
+      <w:r>
+        <w:rPr>
+          <w:color w:val="1a1d26"/>
+          <w:sz w:val="18"/>
+          <w:szCs w:val="18"/>
+          <w:rFonts w:ascii="Courier New" w:cs="Courier New" w:eastAsia="Courier New" w:hAnsi="Courier New"/>
+        </w:rPr>
+        <w:t xml:space="preserve">4 years ago — Cathy Wellerstein · June 12</w:t>
+      </w:r>
+    </w:p>
+    <w:p>
+      <w:pPr>
+        <w:spacing w:after="14"/>
+        <w:ind w:left="280"/>
+      </w:pPr>
+      <w:r>
+        <w:rPr>
+          <w:b/>
+          <w:bCs/>
+          <w:color w:val="1a1d26"/>
+          <w:sz w:val="18"/>
+          <w:szCs w:val="18"/>
+          <w:rFonts w:ascii="Courier New" w:cs="Courier New" w:eastAsia="Courier New" w:hAnsi="Courier New"/>
+        </w:rPr>
+        <w:t xml:space="preserve">  post: </w:t>
+      </w:r>
+      <w:r>
+        <w:rPr>
+          <w:color w:val="1a1d26"/>
+          <w:sz w:val="18"/>
+          <w:szCs w:val="18"/>
+          <w:rFonts w:ascii="Courier New" w:cs="Courier New" w:eastAsia="Courier New" w:hAnsi="Courier New"/>
+        </w:rPr>
+        <w:t xml:space="preserve">“nine months in. he brought a bear 🧸”</w:t>
+      </w:r>
+    </w:p>
+    <w:p>
+      <w:pPr>
+        <w:spacing w:after="14"/>
+        <w:ind w:left="280"/>
+      </w:pPr>
+      <w:r>
+        <w:rPr>
+          <w:b/>
+          <w:bCs/>
+          <w:color w:val="1a1d26"/>
+          <w:sz w:val="18"/>
+          <w:szCs w:val="18"/>
+          <w:rFonts w:ascii="Courier New" w:cs="Courier New" w:eastAsia="Courier New" w:hAnsi="Courier New"/>
+        </w:rPr>
+        <w:t xml:space="preserve">  media: </w:t>
+      </w:r>
+      <w:r>
+        <w:rPr>
+          <w:color w:val="1a1d26"/>
+          <w:sz w:val="18"/>
+          <w:szCs w:val="18"/>
+          <w:rFonts w:ascii="Courier New" w:cs="Courier New" w:eastAsia="Courier New" w:hAnsi="Courier New"/>
+        </w:rPr>
         <w:t xml:space="preserve">M2 — Jamie giving Cathy the bear</w:t>
       </w:r>
     </w:p>
@@ -2309,7 +2699,7 @@
           <w:szCs w:val="18"/>
           <w:rFonts w:ascii="Courier New" w:cs="Courier New" w:eastAsia="Courier New" w:hAnsi="Courier New"/>
         </w:rPr>
-        <w:t xml:space="preserve">👍 64</w:t>
+        <w:t xml:space="preserve">👍 88</w:t>
       </w:r>
     </w:p>
     <w:p>
@@ -2335,396 +2725,6 @@
           <w:szCs w:val="18"/>
           <w:rFonts w:ascii="Courier New" w:cs="Courier New" w:eastAsia="Courier New" w:hAnsi="Courier New"/>
         </w:rPr>
-        <w:t xml:space="preserve">5.0 s)</w:t>
-      </w:r>
-    </w:p>
-    <w:p>
-      <w:pPr>
-        <w:spacing w:after="14"/>
-        <w:ind w:left="280"/>
-      </w:pPr>
-      <w:r>
-        <w:rPr>
-          <w:b/>
-          <w:bCs/>
-          <w:color w:val="1a1d26"/>
-          <w:sz w:val="18"/>
-          <w:szCs w:val="18"/>
-          <w:rFonts w:ascii="Courier New" w:cs="Courier New" w:eastAsia="Courier New" w:hAnsi="Courier New"/>
-        </w:rPr>
-        <w:t xml:space="preserve">MEMORY CARD — </w:t>
-      </w:r>
-      <w:r>
-        <w:rPr>
-          <w:color w:val="1a1d26"/>
-          <w:sz w:val="18"/>
-          <w:szCs w:val="18"/>
-          <w:rFonts w:ascii="Courier New" w:cs="Courier New" w:eastAsia="Courier New" w:hAnsi="Courier New"/>
-        </w:rPr>
-        <w:t xml:space="preserve">2 years ago — Cathy Wellerstein · June 12</w:t>
-      </w:r>
-    </w:p>
-    <w:p>
-      <w:pPr>
-        <w:spacing w:after="14"/>
-        <w:ind w:left="280"/>
-      </w:pPr>
-      <w:r>
-        <w:rPr>
-          <w:b/>
-          <w:bCs/>
-          <w:color w:val="1a1d26"/>
-          <w:sz w:val="18"/>
-          <w:szCs w:val="18"/>
-          <w:rFonts w:ascii="Courier New" w:cs="Courier New" w:eastAsia="Courier New" w:hAnsi="Courier New"/>
-        </w:rPr>
-        <w:t xml:space="preserve">  post: </w:t>
-      </w:r>
-      <w:r>
-        <w:rPr>
-          <w:color w:val="1a1d26"/>
-          <w:sz w:val="18"/>
-          <w:szCs w:val="18"/>
-          <w:rFonts w:ascii="Courier New" w:cs="Courier New" w:eastAsia="Courier New" w:hAnsi="Courier New"/>
-        </w:rPr>
-        <w:t xml:space="preserve">“married three weeks and 600 miles apart. worth it.”</w:t>
-      </w:r>
-    </w:p>
-    <w:p>
-      <w:pPr>
-        <w:spacing w:after="14"/>
-        <w:ind w:left="280"/>
-      </w:pPr>
-      <w:r>
-        <w:rPr>
-          <w:b/>
-          <w:bCs/>
-          <w:color w:val="1a1d26"/>
-          <w:sz w:val="18"/>
-          <w:szCs w:val="18"/>
-          <w:rFonts w:ascii="Courier New" w:cs="Courier New" w:eastAsia="Courier New" w:hAnsi="Courier New"/>
-        </w:rPr>
-        <w:t xml:space="preserve">  media: </w:t>
-      </w:r>
-      <w:r>
-        <w:rPr>
-          <w:color w:val="1a1d26"/>
-          <w:sz w:val="18"/>
-          <w:szCs w:val="18"/>
-          <w:rFonts w:ascii="Courier New" w:cs="Courier New" w:eastAsia="Courier New" w:hAnsi="Courier New"/>
-        </w:rPr>
-        <w:t xml:space="preserve">M4 — the wedding portrait</w:t>
-      </w:r>
-    </w:p>
-    <w:p>
-      <w:pPr>
-        <w:spacing w:after="14"/>
-        <w:ind w:left="280"/>
-      </w:pPr>
-      <w:r>
-        <w:rPr>
-          <w:b/>
-          <w:bCs/>
-          <w:color w:val="1a1d26"/>
-          <w:sz w:val="18"/>
-          <w:szCs w:val="18"/>
-          <w:rFonts w:ascii="Courier New" w:cs="Courier New" w:eastAsia="Courier New" w:hAnsi="Courier New"/>
-        </w:rPr>
-        <w:t xml:space="preserve">  reactions: </w:t>
-      </w:r>
-      <w:r>
-        <w:rPr>
-          <w:color w:val="1a1d26"/>
-          <w:sz w:val="18"/>
-          <w:szCs w:val="18"/>
-          <w:rFonts w:ascii="Courier New" w:cs="Courier New" w:eastAsia="Courier New" w:hAnsi="Courier New"/>
-        </w:rPr>
-        <w:t xml:space="preserve">👍 402</w:t>
-      </w:r>
-    </w:p>
-    <w:p>
-      <w:pPr>
-        <w:spacing w:after="14"/>
-        <w:ind w:left="280"/>
-      </w:pPr>
-      <w:r>
-        <w:rPr>
-          <w:b/>
-          <w:bCs/>
-          <w:color w:val="1a1d26"/>
-          <w:sz w:val="18"/>
-          <w:szCs w:val="18"/>
-          <w:rFonts w:ascii="Courier New" w:cs="Courier New" w:eastAsia="Courier New" w:hAnsi="Courier New"/>
-        </w:rPr>
-        <w:t xml:space="preserve">  … a beat (auto-timed, </w:t>
-      </w:r>
-      <w:r>
-        <w:rPr>
-          <w:color w:val="1a1d26"/>
-          <w:sz w:val="18"/>
-          <w:szCs w:val="18"/>
-          <w:rFonts w:ascii="Courier New" w:cs="Courier New" w:eastAsia="Courier New" w:hAnsi="Courier New"/>
-        </w:rPr>
-        <w:t xml:space="preserve">5.0 s)</w:t>
-      </w:r>
-    </w:p>
-    <w:p>
-      <w:pPr>
-        <w:spacing w:after="14"/>
-        <w:ind w:left="280"/>
-      </w:pPr>
-      <w:r>
-        <w:rPr>
-          <w:b/>
-          <w:bCs/>
-          <w:color w:val="1a1d26"/>
-          <w:sz w:val="18"/>
-          <w:szCs w:val="18"/>
-          <w:rFonts w:ascii="Courier New" w:cs="Courier New" w:eastAsia="Courier New" w:hAnsi="Courier New"/>
-        </w:rPr>
-        <w:t xml:space="preserve">MEMORY CARD — </w:t>
-      </w:r>
-      <w:r>
-        <w:rPr>
-          <w:color w:val="1a1d26"/>
-          <w:sz w:val="18"/>
-          <w:szCs w:val="18"/>
-          <w:rFonts w:ascii="Courier New" w:cs="Courier New" w:eastAsia="Courier New" w:hAnsi="Courier New"/>
-        </w:rPr>
-        <w:t xml:space="preserve">3 years ago — Cathy Wellerstein · June 12</w:t>
-      </w:r>
-    </w:p>
-    <w:p>
-      <w:pPr>
-        <w:spacing w:after="14"/>
-        <w:ind w:left="280"/>
-      </w:pPr>
-      <w:r>
-        <w:rPr>
-          <w:b/>
-          <w:bCs/>
-          <w:color w:val="1a1d26"/>
-          <w:sz w:val="18"/>
-          <w:szCs w:val="18"/>
-          <w:rFonts w:ascii="Courier New" w:cs="Courier New" w:eastAsia="Courier New" w:hAnsi="Courier New"/>
-        </w:rPr>
-        <w:t xml:space="preserve">  post: </w:t>
-      </w:r>
-      <w:r>
-        <w:rPr>
-          <w:color w:val="1a1d26"/>
-          <w:sz w:val="18"/>
-          <w:szCs w:val="18"/>
-          <w:rFonts w:ascii="Courier New" w:cs="Courier New" w:eastAsia="Courier New" w:hAnsi="Courier New"/>
-        </w:rPr>
-        <w:t xml:space="preserve">“he asked. I said yes before he finished 💍”</w:t>
-      </w:r>
-    </w:p>
-    <w:p>
-      <w:pPr>
-        <w:spacing w:after="14"/>
-        <w:ind w:left="280"/>
-      </w:pPr>
-      <w:r>
-        <w:rPr>
-          <w:b/>
-          <w:bCs/>
-          <w:color w:val="1a1d26"/>
-          <w:sz w:val="18"/>
-          <w:szCs w:val="18"/>
-          <w:rFonts w:ascii="Courier New" w:cs="Courier New" w:eastAsia="Courier New" w:hAnsi="Courier New"/>
-        </w:rPr>
-        <w:t xml:space="preserve">  media: </w:t>
-      </w:r>
-      <w:r>
-        <w:rPr>
-          <w:color w:val="1a1d26"/>
-          <w:sz w:val="18"/>
-          <w:szCs w:val="18"/>
-          <w:rFonts w:ascii="Courier New" w:cs="Courier New" w:eastAsia="Courier New" w:hAnsi="Courier New"/>
-        </w:rPr>
-        <w:t xml:space="preserve">M3a — the ring, the rowboat</w:t>
-      </w:r>
-    </w:p>
-    <w:p>
-      <w:pPr>
-        <w:spacing w:after="14"/>
-        <w:ind w:left="280"/>
-      </w:pPr>
-      <w:r>
-        <w:rPr>
-          <w:b/>
-          <w:bCs/>
-          <w:color w:val="1a1d26"/>
-          <w:sz w:val="18"/>
-          <w:szCs w:val="18"/>
-          <w:rFonts w:ascii="Courier New" w:cs="Courier New" w:eastAsia="Courier New" w:hAnsi="Courier New"/>
-        </w:rPr>
-        <w:t xml:space="preserve">  reactions: </w:t>
-      </w:r>
-      <w:r>
-        <w:rPr>
-          <w:color w:val="1a1d26"/>
-          <w:sz w:val="18"/>
-          <w:szCs w:val="18"/>
-          <w:rFonts w:ascii="Courier New" w:cs="Courier New" w:eastAsia="Courier New" w:hAnsi="Courier New"/>
-        </w:rPr>
-        <w:t xml:space="preserve">👍 341</w:t>
-      </w:r>
-    </w:p>
-    <w:p>
-      <w:pPr>
-        <w:spacing w:after="14"/>
-        <w:ind w:left="280"/>
-      </w:pPr>
-      <w:r>
-        <w:rPr>
-          <w:b/>
-          <w:bCs/>
-          <w:color w:val="1a1d26"/>
-          <w:sz w:val="18"/>
-          <w:szCs w:val="18"/>
-          <w:rFonts w:ascii="Courier New" w:cs="Courier New" w:eastAsia="Courier New" w:hAnsi="Courier New"/>
-        </w:rPr>
-        <w:t xml:space="preserve">  … a beat (auto-timed, </w:t>
-      </w:r>
-      <w:r>
-        <w:rPr>
-          <w:color w:val="1a1d26"/>
-          <w:sz w:val="18"/>
-          <w:szCs w:val="18"/>
-          <w:rFonts w:ascii="Courier New" w:cs="Courier New" w:eastAsia="Courier New" w:hAnsi="Courier New"/>
-        </w:rPr>
-        <w:t xml:space="preserve">5.0 s)</w:t>
-      </w:r>
-    </w:p>
-    <w:p>
-      <w:pPr>
-        <w:spacing w:after="14"/>
-        <w:ind w:left="280"/>
-      </w:pPr>
-      <w:r>
-        <w:rPr>
-          <w:b/>
-          <w:bCs/>
-          <w:color w:val="1a1d26"/>
-          <w:sz w:val="18"/>
-          <w:szCs w:val="18"/>
-          <w:rFonts w:ascii="Courier New" w:cs="Courier New" w:eastAsia="Courier New" w:hAnsi="Courier New"/>
-        </w:rPr>
-        <w:t xml:space="preserve">MEMORY CARD — </w:t>
-      </w:r>
-      <w:r>
-        <w:rPr>
-          <w:color w:val="1a1d26"/>
-          <w:sz w:val="18"/>
-          <w:szCs w:val="18"/>
-          <w:rFonts w:ascii="Courier New" w:cs="Courier New" w:eastAsia="Courier New" w:hAnsi="Courier New"/>
-        </w:rPr>
-        <w:t xml:space="preserve">4 years ago — Cathy Wellerstein · June 12</w:t>
-      </w:r>
-    </w:p>
-    <w:p>
-      <w:pPr>
-        <w:spacing w:after="14"/>
-        <w:ind w:left="280"/>
-      </w:pPr>
-      <w:r>
-        <w:rPr>
-          <w:b/>
-          <w:bCs/>
-          <w:color w:val="1a1d26"/>
-          <w:sz w:val="18"/>
-          <w:szCs w:val="18"/>
-          <w:rFonts w:ascii="Courier New" w:cs="Courier New" w:eastAsia="Courier New" w:hAnsi="Courier New"/>
-        </w:rPr>
-        <w:t xml:space="preserve">  post: </w:t>
-      </w:r>
-      <w:r>
-        <w:rPr>
-          <w:color w:val="1a1d26"/>
-          <w:sz w:val="18"/>
-          <w:szCs w:val="18"/>
-          <w:rFonts w:ascii="Courier New" w:cs="Courier New" w:eastAsia="Courier New" w:hAnsi="Courier New"/>
-        </w:rPr>
-        <w:t xml:space="preserve">“nine months in and our apartment has a name. it is called The Couch.”</w:t>
-      </w:r>
-    </w:p>
-    <w:p>
-      <w:pPr>
-        <w:spacing w:after="14"/>
-        <w:ind w:left="280"/>
-      </w:pPr>
-      <w:r>
-        <w:rPr>
-          <w:b/>
-          <w:bCs/>
-          <w:color w:val="1a1d26"/>
-          <w:sz w:val="18"/>
-          <w:szCs w:val="18"/>
-          <w:rFonts w:ascii="Courier New" w:cs="Courier New" w:eastAsia="Courier New" w:hAnsi="Courier New"/>
-        </w:rPr>
-        <w:t xml:space="preserve">  media: </w:t>
-      </w:r>
-      <w:r>
-        <w:rPr>
-          <w:color w:val="1a1d26"/>
-          <w:sz w:val="18"/>
-          <w:szCs w:val="18"/>
-          <w:rFonts w:ascii="Courier New" w:cs="Courier New" w:eastAsia="Courier New" w:hAnsi="Courier New"/>
-        </w:rPr>
-        <w:t xml:space="preserve">M15 — the hideous couch</w:t>
-      </w:r>
-    </w:p>
-    <w:p>
-      <w:pPr>
-        <w:spacing w:after="14"/>
-        <w:ind w:left="280"/>
-      </w:pPr>
-      <w:r>
-        <w:rPr>
-          <w:b/>
-          <w:bCs/>
-          <w:color w:val="1a1d26"/>
-          <w:sz w:val="18"/>
-          <w:szCs w:val="18"/>
-          <w:rFonts w:ascii="Courier New" w:cs="Courier New" w:eastAsia="Courier New" w:hAnsi="Courier New"/>
-        </w:rPr>
-        <w:t xml:space="preserve">  reactions: </w:t>
-      </w:r>
-      <w:r>
-        <w:rPr>
-          <w:color w:val="1a1d26"/>
-          <w:sz w:val="18"/>
-          <w:szCs w:val="18"/>
-          <w:rFonts w:ascii="Courier New" w:cs="Courier New" w:eastAsia="Courier New" w:hAnsi="Courier New"/>
-        </w:rPr>
-        <w:t xml:space="preserve">👍 88</w:t>
-      </w:r>
-    </w:p>
-    <w:p>
-      <w:pPr>
-        <w:spacing w:after="14"/>
-        <w:ind w:left="280"/>
-      </w:pPr>
-      <w:r>
-        <w:rPr>
-          <w:b/>
-          <w:bCs/>
-          <w:color w:val="1a1d26"/>
-          <w:sz w:val="18"/>
-          <w:szCs w:val="18"/>
-          <w:rFonts w:ascii="Courier New" w:cs="Courier New" w:eastAsia="Courier New" w:hAnsi="Courier New"/>
-        </w:rPr>
-        <w:t xml:space="preserve">  … a beat (auto-timed, </w:t>
-      </w:r>
-      <w:r>
-        <w:rPr>
-          <w:color w:val="1a1d26"/>
-          <w:sz w:val="18"/>
-          <w:szCs w:val="18"/>
-          <w:rFonts w:ascii="Courier New" w:cs="Courier New" w:eastAsia="Courier New" w:hAnsi="Courier New"/>
-        </w:rPr>
         <w:t xml:space="preserve">1.8 s)</w:t>
       </w:r>
     </w:p>
@@ -2751,7 +2751,7 @@
           <w:szCs w:val="18"/>
           <w:rFonts w:ascii="Courier New" w:cs="Courier New" w:eastAsia="Courier New" w:hAnsi="Courier New"/>
         </w:rPr>
-        <w:t xml:space="preserve">she drifts up the feed to card 1 and holds on it</w:t>
+        <w:t xml:space="preserve">she drifts up the feed to card 4 and holds on it</w:t>
       </w:r>
     </w:p>
     <w:p>

</xml_diff>

<commit_message>
See I'm Smiling: the lake bed cues (3.1 fade in, 3.10 fade out), Bible describer
Co-Authored-By: Claude Fable 5.1 <noreply@anthropic.com>
Claude-Session: https://claude.ai/code/session_01Y6sUkZbYffNPeDjzCChZiy
</commit_message>
<xml_diff>
--- a/L5Y-Cue-Bible.docx
+++ b/L5Y-Cue-Bible.docx
@@ -5145,6 +5145,32 @@
           <w:szCs w:val="18"/>
           <w:rFonts w:ascii="Courier New" w:cs="Courier New" w:eastAsia="Courier New" w:hAnsi="Courier New"/>
         </w:rPr>
+        <w:t xml:space="preserve">SOUND BED — </w:t>
+      </w:r>
+      <w:r>
+        <w:rPr>
+          <w:color w:val="1a1d26"/>
+          <w:sz w:val="18"/>
+          <w:szCs w:val="18"/>
+          <w:rFonts w:ascii="Courier New" w:cs="Courier New" w:eastAsia="Courier New" w:hAnsi="Courier New"/>
+        </w:rPr>
+        <w:t xml:space="preserve">lake.mp3 fades in over 5 s and loops under the whole song</w:t>
+      </w:r>
+    </w:p>
+    <w:p>
+      <w:pPr>
+        <w:spacing w:after="14"/>
+        <w:ind w:left="280"/>
+      </w:pPr>
+      <w:r>
+        <w:rPr>
+          <w:b/>
+          <w:bCs/>
+          <w:color w:val="1a1d26"/>
+          <w:sz w:val="18"/>
+          <w:szCs w:val="18"/>
+          <w:rFonts w:ascii="Courier New" w:cs="Courier New" w:eastAsia="Courier New" w:hAnsi="Courier New"/>
+        </w:rPr>
         <w:t xml:space="preserve">PHONE AWAY — </w:t>
       </w:r>
       <w:r>
@@ -6782,6 +6808,32 @@
           <w:rFonts w:ascii="Courier New" w:cs="Courier New" w:eastAsia="Courier New" w:hAnsi="Courier New"/>
         </w:rPr>
         <w:t xml:space="preserve">ON SCREEN</w:t>
+      </w:r>
+    </w:p>
+    <w:p>
+      <w:pPr>
+        <w:spacing w:after="14"/>
+        <w:ind w:left="280"/>
+      </w:pPr>
+      <w:r>
+        <w:rPr>
+          <w:b/>
+          <w:bCs/>
+          <w:color w:val="1a1d26"/>
+          <w:sz w:val="18"/>
+          <w:szCs w:val="18"/>
+          <w:rFonts w:ascii="Courier New" w:cs="Courier New" w:eastAsia="Courier New" w:hAnsi="Courier New"/>
+        </w:rPr>
+        <w:t xml:space="preserve">SOUND BED — </w:t>
+      </w:r>
+      <w:r>
+        <w:rPr>
+          <w:color w:val="1a1d26"/>
+          <w:sz w:val="18"/>
+          <w:szCs w:val="18"/>
+          <w:rFonts w:ascii="Courier New" w:cs="Courier New" w:eastAsia="Courier New" w:hAnsi="Courier New"/>
+        </w:rPr>
+        <w:t xml:space="preserve">fades out over 5 s</w:t>
       </w:r>
     </w:p>
     <w:p>

</xml_diff>

<commit_message>
The Time Warp music under every calendar roll (David's file): in with the first page, out as the last settles, stopped on a scrub
Co-Authored-By: Claude Fable 5.1 <noreply@anthropic.com>
Claude-Session: https://claude.ai/code/session_01Y6sUkZbYffNPeDjzCChZiy
</commit_message>
<xml_diff>
--- a/L5Y-Cue-Bible.docx
+++ b/L5Y-Cue-Bible.docx
@@ -246,7 +246,7 @@
           <w:szCs w:val="18"/>
           <w:rFonts w:ascii="Courier New" w:cs="Courier New" w:eastAsia="Courier New" w:hAnsi="Courier New"/>
         </w:rPr>
-        <w:t xml:space="preserve">9:41 · Friday, June 12, 2026 — the house reads JUNE · YEAR 5; the calendar pages roll to it (forward tears, backward settles) before any device appears</w:t>
+        <w:t xml:space="preserve">9:41 · Friday, June 12, 2026 — the house reads JUNE · YEAR 5; the calendar pages roll to it under the TIME WARP music (forward tears, backward settles) before any device appears</w:t>
       </w:r>
     </w:p>
     <w:p>
@@ -3153,7 +3153,7 @@
           <w:szCs w:val="18"/>
           <w:rFonts w:ascii="Courier New" w:cs="Courier New" w:eastAsia="Courier New" w:hAnsi="Courier New"/>
         </w:rPr>
-        <w:t xml:space="preserve">11:38 · Friday, September 3, 2021 — the house reads SEPTEMBER · YEAR 1; the calendar pages roll to it (forward tears, backward settles) before any device appears</w:t>
+        <w:t xml:space="preserve">11:38 · Friday, September 3, 2021 — the house reads SEPTEMBER · YEAR 1; the calendar pages roll to it under the TIME WARP music (forward tears, backward settles) before any device appears</w:t>
       </w:r>
     </w:p>
     <w:p>
@@ -5206,7 +5206,7 @@
           <w:szCs w:val="18"/>
           <w:rFonts w:ascii="Courier New" w:cs="Courier New" w:eastAsia="Courier New" w:hAnsi="Courier New"/>
         </w:rPr>
-        <w:t xml:space="preserve">6:12 · Saturday, July 19, 2025 — the house reads JULY · YEAR 4; the calendar pages roll to it (forward tears, backward settles) before any device appears</w:t>
+        <w:t xml:space="preserve">6:12 · Saturday, July 19, 2025 — the house reads JULY · YEAR 4; the calendar pages roll to it under the TIME WARP music (forward tears, backward settles) before any device appears</w:t>
       </w:r>
     </w:p>
     <w:p>
@@ -5394,7 +5394,7 @@
           <w:szCs w:val="18"/>
           <w:rFonts w:ascii="Courier New" w:cs="Courier New" w:eastAsia="Courier New" w:hAnsi="Courier New"/>
         </w:rPr>
-        <w:t xml:space="preserve">2:41 · Tuesday, September 7, 2021 — the house reads SEPTEMBER · YEAR 1; the calendar pages roll to it (forward tears, backward settles) before any device appears</w:t>
+        <w:t xml:space="preserve">2:41 · Tuesday, September 7, 2021 — the house reads SEPTEMBER · YEAR 1; the calendar pages roll to it under the TIME WARP music (forward tears, backward settles) before any device appears</w:t>
       </w:r>
     </w:p>
     <w:p>
@@ -5757,7 +5757,7 @@
           <w:szCs w:val="18"/>
           <w:rFonts w:ascii="Courier New" w:cs="Courier New" w:eastAsia="Courier New" w:hAnsi="Courier New"/>
         </w:rPr>
-        <w:t xml:space="preserve">6:31 · Saturday, July 19, 2025 — the house reads JULY · YEAR 4; the calendar pages roll to it (forward tears, backward settles) before any device appears</w:t>
+        <w:t xml:space="preserve">6:31 · Saturday, July 19, 2025 — the house reads JULY · YEAR 4; the calendar pages roll to it under the TIME WARP music (forward tears, backward settles) before any device appears</w:t>
       </w:r>
     </w:p>
     <w:p>
@@ -5945,7 +5945,7 @@
           <w:szCs w:val="18"/>
           <w:rFonts w:ascii="Courier New" w:cs="Courier New" w:eastAsia="Courier New" w:hAnsi="Courier New"/>
         </w:rPr>
-        <w:t xml:space="preserve">4:18 · Tuesday, September 21, 2021 — the house reads SEPTEMBER · YEAR 1; the calendar pages roll to it (forward tears, backward settles) before any device appears</w:t>
+        <w:t xml:space="preserve">4:18 · Tuesday, September 21, 2021 — the house reads SEPTEMBER · YEAR 1; the calendar pages roll to it under the TIME WARP music (forward tears, backward settles) before any device appears</w:t>
       </w:r>
     </w:p>
     <w:p>
@@ -6308,7 +6308,7 @@
           <w:szCs w:val="18"/>
           <w:rFonts w:ascii="Courier New" w:cs="Courier New" w:eastAsia="Courier New" w:hAnsi="Courier New"/>
         </w:rPr>
-        <w:t xml:space="preserve">6:47 · Saturday, July 19, 2025 — the house reads JULY · YEAR 4; the calendar pages roll to it (forward tears, backward settles) before any device appears</w:t>
+        <w:t xml:space="preserve">6:47 · Saturday, July 19, 2025 — the house reads JULY · YEAR 4; the calendar pages roll to it under the TIME WARP music (forward tears, backward settles) before any device appears</w:t>
       </w:r>
     </w:p>
     <w:p>
@@ -6496,7 +6496,7 @@
           <w:szCs w:val="18"/>
           <w:rFonts w:ascii="Courier New" w:cs="Courier New" w:eastAsia="Courier New" w:hAnsi="Courier New"/>
         </w:rPr>
-        <w:t xml:space="preserve">8:02 · Thursday, September 30, 2021 — the house reads SEPTEMBER · YEAR 1; the calendar pages roll to it (forward tears, backward settles) before any device appears</w:t>
+        <w:t xml:space="preserve">8:02 · Thursday, September 30, 2021 — the house reads SEPTEMBER · YEAR 1; the calendar pages roll to it under the TIME WARP music (forward tears, backward settles) before any device appears</w:t>
       </w:r>
     </w:p>
     <w:p>
@@ -6885,7 +6885,7 @@
           <w:szCs w:val="18"/>
           <w:rFonts w:ascii="Courier New" w:cs="Courier New" w:eastAsia="Courier New" w:hAnsi="Courier New"/>
         </w:rPr>
-        <w:t xml:space="preserve">2:14 · Friday, October 8, 2021 — the house reads OCTOBER · YEAR 1; the calendar pages roll to it (forward tears, backward settles) before any device appears</w:t>
+        <w:t xml:space="preserve">2:14 · Friday, October 8, 2021 — the house reads OCTOBER · YEAR 1; the calendar pages roll to it under the TIME WARP music (forward tears, backward settles) before any device appears</w:t>
       </w:r>
     </w:p>
     <w:p>
@@ -7115,7 +7115,7 @@
           <w:szCs w:val="18"/>
           <w:rFonts w:ascii="Courier New" w:cs="Courier New" w:eastAsia="Courier New" w:hAnsi="Courier New"/>
         </w:rPr>
-        <w:t xml:space="preserve">10:10 · Friday, May 9, 2025 — the house reads MAY · YEAR 4; the calendar pages roll to it (forward tears, backward settles) before any device appears</w:t>
+        <w:t xml:space="preserve">10:10 · Friday, May 9, 2025 — the house reads MAY · YEAR 4; the calendar pages roll to it under the TIME WARP music (forward tears, backward settles) before any device appears</w:t>
       </w:r>
     </w:p>
     <w:p>
@@ -7478,7 +7478,7 @@
           <w:szCs w:val="18"/>
           <w:rFonts w:ascii="Courier New" w:cs="Courier New" w:eastAsia="Courier New" w:hAnsi="Courier New"/>
         </w:rPr>
-        <w:t xml:space="preserve">2:14 · Friday, October 8, 2021 — the house reads OCTOBER · YEAR 1; the calendar pages roll to it (forward tears, backward settles) before any device appears</w:t>
+        <w:t xml:space="preserve">2:14 · Friday, October 8, 2021 — the house reads OCTOBER · YEAR 1; the calendar pages roll to it under the TIME WARP music (forward tears, backward settles) before any device appears</w:t>
       </w:r>
     </w:p>
     <w:p>
@@ -8746,7 +8746,7 @@
           <w:szCs w:val="18"/>
           <w:rFonts w:ascii="Courier New" w:cs="Courier New" w:eastAsia="Courier New" w:hAnsi="Courier New"/>
         </w:rPr>
-        <w:t xml:space="preserve">8:12 · Saturday, March 8, 2025 — the house reads MARCH · YEAR 4; the calendar pages roll to it (forward tears, backward settles) before any device appears</w:t>
+        <w:t xml:space="preserve">8:12 · Saturday, March 8, 2025 — the house reads MARCH · YEAR 4; the calendar pages roll to it under the TIME WARP music (forward tears, backward settles) before any device appears</w:t>
       </w:r>
     </w:p>
     <w:p>
@@ -8976,7 +8976,7 @@
           <w:szCs w:val="18"/>
           <w:rFonts w:ascii="Courier New" w:cs="Courier New" w:eastAsia="Courier New" w:hAnsi="Courier New"/>
         </w:rPr>
-        <w:t xml:space="preserve">9:12 · Saturday, December 24, 2022 — the house reads DECEMBER · YEAR 2; the calendar pages roll to it (forward tears, backward settles) before any device appears</w:t>
+        <w:t xml:space="preserve">9:12 · Saturday, December 24, 2022 — the house reads DECEMBER · YEAR 2; the calendar pages roll to it under the TIME WARP music (forward tears, backward settles) before any device appears</w:t>
       </w:r>
     </w:p>
     <w:p>
@@ -9387,7 +9387,7 @@
           <w:szCs w:val="18"/>
           <w:rFonts w:ascii="Courier New" w:cs="Courier New" w:eastAsia="Courier New" w:hAnsi="Courier New"/>
         </w:rPr>
-        <w:t xml:space="preserve">9:38 · Friday, June 21, 2024 — the house reads JUNE · YEAR 3; the calendar pages roll to it (forward tears, backward settles) before any device appears</w:t>
+        <w:t xml:space="preserve">9:38 · Friday, June 21, 2024 — the house reads JUNE · YEAR 3; the calendar pages roll to it under the TIME WARP music (forward tears, backward settles) before any device appears</w:t>
       </w:r>
     </w:p>
     <w:p>
@@ -10034,7 +10034,7 @@
           <w:szCs w:val="18"/>
           <w:rFonts w:ascii="Courier New" w:cs="Courier New" w:eastAsia="Courier New" w:hAnsi="Courier New"/>
         </w:rPr>
-        <w:t xml:space="preserve">4:44 · Monday, June 12, 2023 — the house reads JUNE · YEAR 2; the calendar pages roll to it (forward tears, backward settles) before any device appears</w:t>
+        <w:t xml:space="preserve">4:44 · Monday, June 12, 2023 — the house reads JUNE · YEAR 2; the calendar pages roll to it under the TIME WARP music (forward tears, backward settles) before any device appears</w:t>
       </w:r>
     </w:p>
     <w:p>
@@ -10222,7 +10222,7 @@
           <w:szCs w:val="18"/>
           <w:rFonts w:ascii="Courier New" w:cs="Courier New" w:eastAsia="Courier New" w:hAnsi="Courier New"/>
         </w:rPr>
-        <w:t xml:space="preserve">6:47 · Saturday, May 18, 2024 — the house reads MAY · YEAR 3; the calendar pages roll to it (forward tears, backward settles) before any device appears</w:t>
+        <w:t xml:space="preserve">6:47 · Saturday, May 18, 2024 — the house reads MAY · YEAR 3; the calendar pages roll to it under the TIME WARP music (forward tears, backward settles) before any device appears</w:t>
       </w:r>
     </w:p>
     <w:p>
@@ -10346,7 +10346,7 @@
           <w:szCs w:val="18"/>
           <w:rFonts w:ascii="Courier New" w:cs="Courier New" w:eastAsia="Courier New" w:hAnsi="Courier New"/>
         </w:rPr>
-        <w:t xml:space="preserve">4:44 · Monday, June 12, 2023 — the house reads JUNE · YEAR 2; the calendar pages roll to it (forward tears, backward settles) before any device appears</w:t>
+        <w:t xml:space="preserve">4:44 · Monday, June 12, 2023 — the house reads JUNE · YEAR 2; the calendar pages roll to it under the TIME WARP music (forward tears, backward settles) before any device appears</w:t>
       </w:r>
     </w:p>
     <w:p>
@@ -10610,7 +10610,7 @@
           <w:szCs w:val="18"/>
           <w:rFonts w:ascii="Courier New" w:cs="Courier New" w:eastAsia="Courier New" w:hAnsi="Courier New"/>
         </w:rPr>
-        <w:t xml:space="preserve">11:22 · Friday, October 18, 2024 — the house reads OCTOBER · YEAR 4; the calendar pages roll to it (forward tears, backward settles) before any device appears</w:t>
+        <w:t xml:space="preserve">11:22 · Friday, October 18, 2024 — the house reads OCTOBER · YEAR 4; the calendar pages roll to it under the TIME WARP music (forward tears, backward settles) before any device appears</w:t>
       </w:r>
     </w:p>
     <w:p>
@@ -11883,7 +11883,7 @@
           <w:szCs w:val="18"/>
           <w:rFonts w:ascii="Courier New" w:cs="Courier New" w:eastAsia="Courier New" w:hAnsi="Courier New"/>
         </w:rPr>
-        <w:t xml:space="preserve">9:52 · Monday, February 5, 2024 — the house reads FEBRUARY · YEAR 3; the calendar pages roll to it (forward tears, backward settles) before any device appears</w:t>
+        <w:t xml:space="preserve">9:52 · Monday, February 5, 2024 — the house reads FEBRUARY · YEAR 3; the calendar pages roll to it under the TIME WARP music (forward tears, backward settles) before any device appears</w:t>
       </w:r>
     </w:p>
     <w:p>
@@ -12675,7 +12675,7 @@
           <w:szCs w:val="18"/>
           <w:rFonts w:ascii="Courier New" w:cs="Courier New" w:eastAsia="Courier New" w:hAnsi="Courier New"/>
         </w:rPr>
-        <w:t xml:space="preserve">9:48 · Wednesday, November 8, 2023 — the house reads NOVEMBER · YEAR 3; the calendar pages roll to it (forward tears, backward settles) before any device appears</w:t>
+        <w:t xml:space="preserve">9:48 · Wednesday, November 8, 2023 — the house reads NOVEMBER · YEAR 3; the calendar pages roll to it under the TIME WARP music (forward tears, backward settles) before any device appears</w:t>
       </w:r>
     </w:p>
     <w:p>
@@ -13246,7 +13246,7 @@
           <w:szCs w:val="18"/>
           <w:rFonts w:ascii="Courier New" w:cs="Courier New" w:eastAsia="Courier New" w:hAnsi="Courier New"/>
         </w:rPr>
-        <w:t xml:space="preserve">9:52 · Monday, February 5, 2024 — the house reads FEBRUARY · YEAR 3; the calendar pages roll to it (forward tears, backward settles) before any device appears</w:t>
+        <w:t xml:space="preserve">9:52 · Monday, February 5, 2024 — the house reads FEBRUARY · YEAR 3; the calendar pages roll to it under the TIME WARP music (forward tears, backward settles) before any device appears</w:t>
       </w:r>
     </w:p>
     <w:p>
@@ -13502,7 +13502,7 @@
           <w:szCs w:val="18"/>
           <w:rFonts w:ascii="Courier New" w:cs="Courier New" w:eastAsia="Courier New" w:hAnsi="Courier New"/>
         </w:rPr>
-        <w:t xml:space="preserve">7:41 · Friday, March 6, 2026 — the house reads MARCH · YEAR 5; the calendar pages roll to it (forward tears, backward settles) before any device appears</w:t>
+        <w:t xml:space="preserve">7:41 · Friday, March 6, 2026 — the house reads MARCH · YEAR 5; the calendar pages roll to it under the TIME WARP music (forward tears, backward settles) before any device appears</w:t>
       </w:r>
     </w:p>
     <w:p>
@@ -13732,7 +13732,7 @@
           <w:szCs w:val="18"/>
           <w:rFonts w:ascii="Courier New" w:cs="Courier New" w:eastAsia="Courier New" w:hAnsi="Courier New"/>
         </w:rPr>
-        <w:t xml:space="preserve">4:05 · Saturday, November 6, 2021 — the house reads NOVEMBER · YEAR 1; the calendar pages roll to it (forward tears, backward settles) before any device appears</w:t>
+        <w:t xml:space="preserve">4:05 · Saturday, November 6, 2021 — the house reads NOVEMBER · YEAR 1; the calendar pages roll to it under the TIME WARP music (forward tears, backward settles) before any device appears</w:t>
       </w:r>
     </w:p>
     <w:p>
@@ -14249,7 +14249,7 @@
           <w:szCs w:val="18"/>
           <w:rFonts w:ascii="Courier New" w:cs="Courier New" w:eastAsia="Courier New" w:hAnsi="Courier New"/>
         </w:rPr>
-        <w:t xml:space="preserve">5:05 · Thursday, June 11, 2026 — the house reads JUNE · YEAR 5; the calendar pages roll to it (forward tears, backward settles) before any device appears</w:t>
+        <w:t xml:space="preserve">5:05 · Thursday, June 11, 2026 — the house reads JUNE · YEAR 5; the calendar pages roll to it under the TIME WARP music (forward tears, backward settles) before any device appears</w:t>
       </w:r>
     </w:p>
     <w:p>
@@ -15269,7 +15269,7 @@
           <w:szCs w:val="18"/>
           <w:rFonts w:ascii="Courier New" w:cs="Courier New" w:eastAsia="Courier New" w:hAnsi="Courier New"/>
         </w:rPr>
-        <w:t xml:space="preserve">11:40 · Friday, September 3, 2021 — the house reads SEPTEMBER · YEAR 1; the calendar pages roll to it (forward tears, backward settles) before any device appears</w:t>
+        <w:t xml:space="preserve">11:40 · Friday, September 3, 2021 — the house reads SEPTEMBER · YEAR 1; the calendar pages roll to it under the TIME WARP music (forward tears, backward settles) before any device appears</w:t>
       </w:r>
     </w:p>
     <w:p>
@@ -15457,7 +15457,7 @@
           <w:szCs w:val="18"/>
           <w:rFonts w:ascii="Courier New" w:cs="Courier New" w:eastAsia="Courier New" w:hAnsi="Courier New"/>
         </w:rPr>
-        <w:t xml:space="preserve">2:40 · Thursday, June 11, 2026 — the house reads JUNE · YEAR 5; the calendar pages roll to it (forward tears, backward settles) before any device appears</w:t>
+        <w:t xml:space="preserve">2:40 · Thursday, June 11, 2026 — the house reads JUNE · YEAR 5; the calendar pages roll to it under the TIME WARP music (forward tears, backward settles) before any device appears</w:t>
       </w:r>
     </w:p>
     <w:p>
@@ -15581,7 +15581,7 @@
           <w:szCs w:val="18"/>
           <w:rFonts w:ascii="Courier New" w:cs="Courier New" w:eastAsia="Courier New" w:hAnsi="Courier New"/>
         </w:rPr>
-        <w:t xml:space="preserve">11:47 · Friday, September 3, 2021 — the house reads SEPTEMBER · YEAR 1; the calendar pages roll to it (forward tears, backward settles) before any device appears</w:t>
+        <w:t xml:space="preserve">11:47 · Friday, September 3, 2021 — the house reads SEPTEMBER · YEAR 1; the calendar pages roll to it under the TIME WARP music (forward tears, backward settles) before any device appears</w:t>
       </w:r>
     </w:p>
     <w:p>
@@ -16254,7 +16254,7 @@
           <w:szCs w:val="18"/>
           <w:rFonts w:ascii="Courier New" w:cs="Courier New" w:eastAsia="Courier New" w:hAnsi="Courier New"/>
         </w:rPr>
-        <w:t xml:space="preserve">4:12 · Thursday, June 11, 2026 — the house reads JUNE · YEAR 5; the calendar pages roll to it (forward tears, backward settles) before any device appears</w:t>
+        <w:t xml:space="preserve">4:12 · Thursday, June 11, 2026 — the house reads JUNE · YEAR 5; the calendar pages roll to it under the TIME WARP music (forward tears, backward settles) before any device appears</w:t>
       </w:r>
     </w:p>
     <w:p>

</xml_diff>

<commit_message>
Every roll is 6 s under the Time Warp music; song 10 reads (thread opens at the newest message, no slow glides, longer flashback pauses); the drive runs in real time
Co-Authored-By: Claude Fable 5.1 <noreply@anthropic.com>
Claude-Session: https://claude.ai/code/session_01Y6sUkZbYffNPeDjzCChZiy
</commit_message>
<xml_diff>
--- a/L5Y-Cue-Bible.docx
+++ b/L5Y-Cue-Bible.docx
@@ -12727,7 +12727,7 @@
           <w:szCs w:val="18"/>
           <w:rFonts w:ascii="Courier New" w:cs="Courier New" w:eastAsia="Courier New" w:hAnsi="Courier New"/>
         </w:rPr>
-        <w:t xml:space="preserve">0.6 s)</w:t>
+        <w:t xml:space="preserve">1.5 s)</w:t>
       </w:r>
     </w:p>
     <w:p>
@@ -12779,7 +12779,7 @@
           <w:szCs w:val="18"/>
           <w:rFonts w:ascii="Courier New" w:cs="Courier New" w:eastAsia="Courier New" w:hAnsi="Courier New"/>
         </w:rPr>
-        <w:t xml:space="preserve">1.8 s)</w:t>
+        <w:t xml:space="preserve">4.2 s)</w:t>
       </w:r>
     </w:p>
     <w:p>
@@ -13634,7 +13634,7 @@
           <w:szCs w:val="19"/>
           <w:rFonts w:ascii="Georgia" w:cs="Georgia" w:eastAsia="Georgia" w:hAnsi="Georgia"/>
         </w:rPr>
-        <w:t xml:space="preserve">THE DRIVE, ON THE DASH. CarPlay for the entire song: Apple Maps, the puck rides the route from New York to the Eastern Shore, the miles and minutes fall, each maneuver counts down, the dash clock runs 4:05 to 7:45. Arrival is timed to the song (tune `dur` in tech). On the final chord the dash goes dark and NOVEMBER · YEAR 1 holds.</w:t>
+        <w:t xml:space="preserve">THE DRIVE, ON THE DASH. CarPlay for the entire song: Apple Maps, the puck rides the route from New York to the Eastern Shore, the miles and minutes fall, each maneuver counts down, the drive runs in real time — the exit for the Delaware Memorial Bridge comes mid-song, the miles fall at highway speed, the dash clock runs 5:53 onward, arrival 7:45 PM holds (tune `rate`/`startAt` in tech). On the final chord the dash goes dark and NOVEMBER · YEAR 1 holds.</w:t>
       </w:r>
     </w:p>
     <w:p>
@@ -13689,7 +13689,7 @@
           <w:szCs w:val="19"/>
           <w:rFonts w:ascii="Georgia" w:cs="Georgia" w:eastAsia="Georgia" w:hAnsi="Georgia"/>
         </w:rPr>
-        <w:t xml:space="preserve">The calendar rolls BACK — MARCH · YEAR 5 → NOVEMBER · YEAR 1 — and docks; the dash lights up — CarPlay, already navigating: Apple Maps, New York → the Eastern Shore, the car’s display filling the frame. The drive really moves for the whole song: the puck rides the route, the miles and minutes fall, each maneuver counts down, and the dash clock runs 4:05 → 7:45. Arrival lands five minutes after this GO.</w:t>
+        <w:t xml:space="preserve">The calendar rolls BACK — MARCH · YEAR 5 → NOVEMBER · YEAR 1 — and docks; the dash lights up — CarPlay, already navigating: Apple Maps, New York → the Eastern Shore, the car’s display filling the frame. The drive really moves for the whole song: the puck rides the route, the miles and minutes fall, each maneuver counts down, and the drive runs in REAL TIME (rate:1): they are on I-95 past Wilmington with the Delaware Memorial Bridge exit four miles ahead — the exit comes mid-song, the miles fall at highway speed, the dash clock runs 5:53 → about 5:58, arrival 7:45 PM holds.</w:t>
       </w:r>
     </w:p>
     <w:p>
@@ -13732,7 +13732,7 @@
           <w:szCs w:val="18"/>
           <w:rFonts w:ascii="Courier New" w:cs="Courier New" w:eastAsia="Courier New" w:hAnsi="Courier New"/>
         </w:rPr>
-        <w:t xml:space="preserve">4:05 · Saturday, November 6, 2021 — the house reads NOVEMBER · YEAR 1; the calendar pages roll to it under the TIME WARP music (forward tears, backward settles) before any device appears</w:t>
+        <w:t xml:space="preserve">5:53 · Saturday, November 6, 2021 — the house reads NOVEMBER · YEAR 1; the calendar pages roll to it under the TIME WARP music (forward tears, backward settles) before any device appears</w:t>
       </w:r>
     </w:p>
     <w:p>
@@ -13867,7 +13867,7 @@
           <w:szCs w:val="17"/>
           <w:rFonts w:ascii="Courier New" w:cs="Courier New" w:eastAsia="Courier New" w:hAnsi="Courier New"/>
         </w:rPr>
-        <w:t xml:space="preserve">SR = Maps — navigating  ·  stamp “the drive”  ·  clock 4:05</w:t>
+        <w:t xml:space="preserve">SR = Maps — navigating  ·  stamp “the drive”  ·  clock 5:53</w:t>
       </w:r>
     </w:p>
     <w:p>
@@ -13895,7 +13895,7 @@
           <w:szCs w:val="18"/>
           <w:rFonts w:ascii="Georgia" w:cs="Georgia" w:eastAsia="Georgia" w:hAnsi="Georgia"/>
         </w:rPr>
-        <w:t xml:space="preserve">`dur` (seconds to arrival) lives on this cue in cues.js — match it to the song in tech. After arrival the screen holds on “You have arrived.”</w:t>
+        <w:t xml:space="preserve">`rate` (trip minutes per real minute; 1 = real time) and `startAt` (fraction of the trip at GO) live on this cue — tune in tech. At rate:1 she never arrives during the song; that is the point.</w:t>
       </w:r>
     </w:p>
     <w:p>

</xml_diff>

<commit_message>
The lake is hers: the bed ducks out under Jamie's three calls and returns on each roll home to Cathy
Co-Authored-By: Claude Fable 5.1 <noreply@anthropic.com>
Claude-Session: https://claude.ai/code/session_01Y6sUkZbYffNPeDjzCChZiy
</commit_message>
<xml_diff>
--- a/L5Y-Cue-Bible.docx
+++ b/L5Y-Cue-Bible.docx
@@ -5154,7 +5154,7 @@
           <w:szCs w:val="18"/>
           <w:rFonts w:ascii="Courier New" w:cs="Courier New" w:eastAsia="Courier New" w:hAnsi="Courier New"/>
         </w:rPr>
-        <w:t xml:space="preserve">lake.mp3 fades in over 5 s and loops under the whole song</w:t>
+        <w:t xml:space="preserve">lake.mp3 fades in over 5 s and loops until a cue stops it</w:t>
       </w:r>
     </w:p>
     <w:p>
@@ -5385,6 +5385,32 @@
           <w:szCs w:val="18"/>
           <w:rFonts w:ascii="Courier New" w:cs="Courier New" w:eastAsia="Courier New" w:hAnsi="Courier New"/>
         </w:rPr>
+        <w:t xml:space="preserve">SOUND BED — </w:t>
+      </w:r>
+      <w:r>
+        <w:rPr>
+          <w:color w:val="1a1d26"/>
+          <w:sz w:val="18"/>
+          <w:szCs w:val="18"/>
+          <w:rFonts w:ascii="Courier New" w:cs="Courier New" w:eastAsia="Courier New" w:hAnsi="Courier New"/>
+        </w:rPr>
+        <w:t xml:space="preserve">fades out over 2 s (the lake is hers; it goes when his phone comes up)</w:t>
+      </w:r>
+    </w:p>
+    <w:p>
+      <w:pPr>
+        <w:spacing w:after="14"/>
+        <w:ind w:left="280"/>
+      </w:pPr>
+      <w:r>
+        <w:rPr>
+          <w:b/>
+          <w:bCs/>
+          <w:color w:val="1a1d26"/>
+          <w:sz w:val="18"/>
+          <w:szCs w:val="18"/>
+          <w:rFonts w:ascii="Courier New" w:cs="Courier New" w:eastAsia="Courier New" w:hAnsi="Courier New"/>
+        </w:rPr>
         <w:t xml:space="preserve">TIME → </w:t>
       </w:r>
       <w:r>
@@ -5722,6 +5748,32 @@
           <w:szCs w:val="18"/>
           <w:rFonts w:ascii="Courier New" w:cs="Courier New" w:eastAsia="Courier New" w:hAnsi="Courier New"/>
         </w:rPr>
+        <w:t xml:space="preserve">SOUND BED — </w:t>
+      </w:r>
+      <w:r>
+        <w:rPr>
+          <w:color w:val="1a1d26"/>
+          <w:sz w:val="18"/>
+          <w:szCs w:val="18"/>
+          <w:rFonts w:ascii="Courier New" w:cs="Courier New" w:eastAsia="Courier New" w:hAnsi="Courier New"/>
+        </w:rPr>
+        <w:t xml:space="preserve">lake.mp3 fades in over 4 s and loops until a cue stops it</w:t>
+      </w:r>
+    </w:p>
+    <w:p>
+      <w:pPr>
+        <w:spacing w:after="14"/>
+        <w:ind w:left="280"/>
+      </w:pPr>
+      <w:r>
+        <w:rPr>
+          <w:b/>
+          <w:bCs/>
+          <w:color w:val="1a1d26"/>
+          <w:sz w:val="18"/>
+          <w:szCs w:val="18"/>
+          <w:rFonts w:ascii="Courier New" w:cs="Courier New" w:eastAsia="Courier New" w:hAnsi="Courier New"/>
+        </w:rPr>
         <w:t xml:space="preserve">PHONE AWAY — </w:t>
       </w:r>
       <w:r>
@@ -5936,6 +5988,32 @@
           <w:szCs w:val="18"/>
           <w:rFonts w:ascii="Courier New" w:cs="Courier New" w:eastAsia="Courier New" w:hAnsi="Courier New"/>
         </w:rPr>
+        <w:t xml:space="preserve">SOUND BED — </w:t>
+      </w:r>
+      <w:r>
+        <w:rPr>
+          <w:color w:val="1a1d26"/>
+          <w:sz w:val="18"/>
+          <w:szCs w:val="18"/>
+          <w:rFonts w:ascii="Courier New" w:cs="Courier New" w:eastAsia="Courier New" w:hAnsi="Courier New"/>
+        </w:rPr>
+        <w:t xml:space="preserve">fades out over 2 s (the lake is hers; it goes when his phone comes up)</w:t>
+      </w:r>
+    </w:p>
+    <w:p>
+      <w:pPr>
+        <w:spacing w:after="14"/>
+        <w:ind w:left="280"/>
+      </w:pPr>
+      <w:r>
+        <w:rPr>
+          <w:b/>
+          <w:bCs/>
+          <w:color w:val="1a1d26"/>
+          <w:sz w:val="18"/>
+          <w:szCs w:val="18"/>
+          <w:rFonts w:ascii="Courier New" w:cs="Courier New" w:eastAsia="Courier New" w:hAnsi="Courier New"/>
+        </w:rPr>
         <w:t xml:space="preserve">TIME → </w:t>
       </w:r>
       <w:r>
@@ -6273,6 +6351,32 @@
           <w:szCs w:val="18"/>
           <w:rFonts w:ascii="Courier New" w:cs="Courier New" w:eastAsia="Courier New" w:hAnsi="Courier New"/>
         </w:rPr>
+        <w:t xml:space="preserve">SOUND BED — </w:t>
+      </w:r>
+      <w:r>
+        <w:rPr>
+          <w:color w:val="1a1d26"/>
+          <w:sz w:val="18"/>
+          <w:szCs w:val="18"/>
+          <w:rFonts w:ascii="Courier New" w:cs="Courier New" w:eastAsia="Courier New" w:hAnsi="Courier New"/>
+        </w:rPr>
+        <w:t xml:space="preserve">lake.mp3 fades in over 4 s and loops until a cue stops it</w:t>
+      </w:r>
+    </w:p>
+    <w:p>
+      <w:pPr>
+        <w:spacing w:after="14"/>
+        <w:ind w:left="280"/>
+      </w:pPr>
+      <w:r>
+        <w:rPr>
+          <w:b/>
+          <w:bCs/>
+          <w:color w:val="1a1d26"/>
+          <w:sz w:val="18"/>
+          <w:szCs w:val="18"/>
+          <w:rFonts w:ascii="Courier New" w:cs="Courier New" w:eastAsia="Courier New" w:hAnsi="Courier New"/>
+        </w:rPr>
         <w:t xml:space="preserve">PHONE AWAY — </w:t>
       </w:r>
       <w:r>
@@ -6487,6 +6591,32 @@
           <w:szCs w:val="18"/>
           <w:rFonts w:ascii="Courier New" w:cs="Courier New" w:eastAsia="Courier New" w:hAnsi="Courier New"/>
         </w:rPr>
+        <w:t xml:space="preserve">SOUND BED — </w:t>
+      </w:r>
+      <w:r>
+        <w:rPr>
+          <w:color w:val="1a1d26"/>
+          <w:sz w:val="18"/>
+          <w:szCs w:val="18"/>
+          <w:rFonts w:ascii="Courier New" w:cs="Courier New" w:eastAsia="Courier New" w:hAnsi="Courier New"/>
+        </w:rPr>
+        <w:t xml:space="preserve">fades out over 2 s (the lake is hers; it goes when his phone comes up)</w:t>
+      </w:r>
+    </w:p>
+    <w:p>
+      <w:pPr>
+        <w:spacing w:after="14"/>
+        <w:ind w:left="280"/>
+      </w:pPr>
+      <w:r>
+        <w:rPr>
+          <w:b/>
+          <w:bCs/>
+          <w:color w:val="1a1d26"/>
+          <w:sz w:val="18"/>
+          <w:szCs w:val="18"/>
+          <w:rFonts w:ascii="Courier New" w:cs="Courier New" w:eastAsia="Courier New" w:hAnsi="Courier New"/>
+        </w:rPr>
         <w:t xml:space="preserve">TIME → </w:t>
       </w:r>
       <w:r>
@@ -6833,7 +6963,7 @@
           <w:szCs w:val="18"/>
           <w:rFonts w:ascii="Courier New" w:cs="Courier New" w:eastAsia="Courier New" w:hAnsi="Courier New"/>
         </w:rPr>
-        <w:t xml:space="preserve">fades out over 5 s</w:t>
+        <w:t xml:space="preserve">fades out over 5 s (the lake is hers; it goes when his phone comes up)</w:t>
       </w:r>
     </w:p>
     <w:p>

</xml_diff>

<commit_message>
Title page is a date card (THE LAST / 5 / YEARS); INTERMISSION is one word on a torn band; operator questionnaire gates the start screen with a second-person confirm; new cue 1.0 shows tonight's preshow performer
Co-Authored-By: Claude Opus 5 <noreply@anthropic.com>
Claude-Session: https://claude.ai/code/session_01Y6sUkZbYffNPeDjzCChZiy
</commit_message>
<xml_diff>
--- a/L5Y-Cue-Bible.docx
+++ b/L5Y-Cue-Bible.docx
@@ -65,7 +65,7 @@
           <w:szCs w:val="19"/>
           <w:rFonts w:ascii="Georgia" w:cs="Georgia" w:eastAsia="Georgia" w:hAnsi="Georgia"/>
         </w:rPr>
-        <w:t xml:space="preserve">65 cues · 14 songs · generated from the live show build, so this document cannot drift from what the phones actually do</w:t>
+        <w:t xml:space="preserve">66 cues · 14 songs · generated from the live show build, so this document cannot drift from what the phones actually do</w:t>
       </w:r>
     </w:p>
     <w:p>
@@ -133,7 +133,7 @@
           <w:szCs w:val="18"/>
           <w:rFonts w:ascii="Courier New" w:cs="Courier New" w:eastAsia="Courier New" w:hAnsi="Courier New"/>
         </w:rPr>
-        <w:t xml:space="preserve">   CATHY SINGS · 7 FIRES</w:t>
+        <w:t xml:space="preserve">   CATHY SINGS · 8 FIRES</w:t>
       </w:r>
     </w:p>
     <w:p>
@@ -149,6 +149,89 @@
           <w:rFonts w:ascii="Georgia" w:cs="Georgia" w:eastAsia="Georgia" w:hAnsi="Georgia"/>
         </w:rPr>
         <w:t xml:space="preserve">COLD OPEN, NO PHONE. The falling pages wind down on ONE GO — the title lifts away, the pages thin out, the last one blows off — and the calendar lands: JUNE · YEAR 5, the morning after. On her verse-two line the calendar docks and her phone rises (one GO, plays out): the Memories notification she ignores, Messages, his thread — days of her asking, a Thursday of silence — and she types her text and SENDS. Delivered → READ 9:44. His typing bubble rises. It stops. Then she opens the Memories: four cards, four years, and she drifts back up to the bear — the last image — until the cutoff takes the phone away.</w:t>
+      </w:r>
+    </w:p>
+    <w:p>
+      <w:pPr>
+        <w:keepNext/>
+        <w:pBdr>
+          <w:top w:val="single" w:color="d8d2c2" w:sz="4"/>
+        </w:pBdr>
+        <w:spacing w:before="200" w:after="40"/>
+      </w:pPr>
+      <w:r>
+        <w:rPr>
+          <w:b/>
+          <w:bCs/>
+          <w:color w:val="1a1d26"/>
+          <w:sz w:val="22"/>
+          <w:szCs w:val="22"/>
+          <w:rFonts w:ascii="Courier New" w:cs="Courier New" w:eastAsia="Courier New" w:hAnsi="Courier New"/>
+        </w:rPr>
+        <w:t xml:space="preserve">1.0</w:t>
+      </w:r>
+      <w:r>
+        <w:rPr>
+          <w:color w:val="2a5db0"/>
+          <w:sz w:val="17"/>
+          <w:szCs w:val="17"/>
+          <w:rFonts w:ascii="Courier New" w:cs="Courier New" w:eastAsia="Courier New" w:hAnsi="Courier New"/>
+        </w:rPr>
+        <w:t xml:space="preserve">  SR · CATHY</w:t>
+      </w:r>
+      <w:r>
+        <w:rPr>
+          <w:i/>
+          <w:iCs/>
+          <w:color w:val="1a1d26"/>
+          <w:sz w:val="19"/>
+          <w:szCs w:val="19"/>
+          <w:rFonts w:ascii="Georgia" w:cs="Georgia" w:eastAsia="Georgia" w:hAnsi="Georgia"/>
+        </w:rPr>
+        <w:t xml:space="preserve">   —  HOUSE — the preshow performer is announced</w:t>
+      </w:r>
+    </w:p>
+    <w:p>
+      <w:pPr>
+        <w:keepNext/>
+        <w:spacing w:after="60"/>
+      </w:pPr>
+      <w:r>
+        <w:rPr>
+          <w:color w:val="3a3f4d"/>
+          <w:sz w:val="19"/>
+          <w:szCs w:val="19"/>
+          <w:rFonts w:ascii="Georgia" w:cs="Georgia" w:eastAsia="Georgia" w:hAnsi="Georgia"/>
+        </w:rPr>
+        <w:t xml:space="preserve">The pad turns to tonight’s preshow performer — the name the operator chose on the start screen, nothing else on the page. If NONE was chosen the title page simply stays up and this GO does nothing.</w:t>
+      </w:r>
+    </w:p>
+    <w:p>
+      <w:pPr>
+        <w:shd w:fill="faf3dc" w:val="clear"/>
+        <w:spacing w:before="30" w:after="14"/>
+      </w:pPr>
+      <w:r>
+        <w:rPr>
+          <w:b/>
+          <w:bCs/>
+          <w:color w:val="8a6d10"/>
+          <w:sz w:val="17"/>
+          <w:szCs w:val="17"/>
+          <w:rFonts w:ascii="Courier New" w:cs="Courier New" w:eastAsia="Courier New" w:hAnsi="Courier New"/>
+        </w:rPr>
+        <w:t xml:space="preserve">HOLD · </w:t>
+      </w:r>
+      <w:r>
+        <w:rPr>
+          <w:i/>
+          <w:iCs/>
+          <w:color w:val="8a6d10"/>
+          <w:sz w:val="18"/>
+          <w:szCs w:val="18"/>
+          <w:rFonts w:ascii="Georgia" w:cs="Georgia" w:eastAsia="Georgia" w:hAnsi="Georgia"/>
+        </w:rPr>
+        <w:t xml:space="preserve">Hold here through the preshow. The next GO tears this page for the top of the show.</w:t>
       </w:r>
     </w:p>
     <w:p>

</xml_diff>

<commit_message>
Gate is a full-screen modal that blocks every click and key; the final curtain locks rewind and re-asks the questionnaire; intermission becomes three cues with the money-minute QR card
Co-Authored-By: Claude Opus 5 <noreply@anthropic.com>
Claude-Session: https://claude.ai/code/session_01Y6sUkZbYffNPeDjzCChZiy
</commit_message>
<xml_diff>
--- a/L5Y-Cue-Bible.docx
+++ b/L5Y-Cue-Bible.docx
@@ -65,7 +65,7 @@
           <w:szCs w:val="19"/>
           <w:rFonts w:ascii="Georgia" w:cs="Georgia" w:eastAsia="Georgia" w:hAnsi="Georgia"/>
         </w:rPr>
-        <w:t xml:space="preserve">66 cues · 14 songs · generated from the live show build, so this document cannot drift from what the phones actually do</w:t>
+        <w:t xml:space="preserve">68 cues · 14 songs · generated from the live show build, so this document cannot drift from what the phones actually do</w:t>
       </w:r>
     </w:p>
     <w:p>
@@ -10108,7 +10108,7 @@
           <w:szCs w:val="18"/>
           <w:rFonts w:ascii="Courier New" w:cs="Courier New" w:eastAsia="Courier New" w:hAnsi="Courier New"/>
         </w:rPr>
-        <w:t xml:space="preserve">   BOTH SING · 4 FIRES</w:t>
+        <w:t xml:space="preserve">   BOTH SING · 6 FIRES</w:t>
       </w:r>
     </w:p>
     <w:p>
@@ -10640,7 +10640,188 @@
           <w:szCs w:val="19"/>
           <w:rFonts w:ascii="Georgia" w:cs="Georgia" w:eastAsia="Georgia" w:hAnsi="Georgia"/>
         </w:rPr>
-        <w:t xml:space="preserve">INTERMISSION: the calendar’s top page reads Intermission and holds, still, through the break; the first GO of Act Two (9.1) tears it off.</w:t>
+        <w:t xml:space="preserve">INTERMISSION: the torn band reads Intermission and holds, still, through the break.</w:t>
+      </w:r>
+    </w:p>
+    <w:p>
+      <w:pPr>
+        <w:keepNext/>
+        <w:spacing w:after="20"/>
+      </w:pPr>
+      <w:r>
+        <w:rPr>
+          <w:b/>
+          <w:bCs/>
+          <w:color w:val="6b7280"/>
+          <w:sz w:val="16"/>
+          <w:szCs w:val="16"/>
+          <w:rFonts w:ascii="Courier New" w:cs="Courier New" w:eastAsia="Courier New" w:hAnsi="Courier New"/>
+        </w:rPr>
+        <w:t xml:space="preserve">ON SCREEN</w:t>
+      </w:r>
+    </w:p>
+    <w:p>
+      <w:pPr>
+        <w:spacing w:after="14"/>
+        <w:ind w:left="280"/>
+      </w:pPr>
+      <w:r>
+        <w:rPr>
+          <w:b/>
+          <w:bCs/>
+          <w:color w:val="1a1d26"/>
+          <w:sz w:val="18"/>
+          <w:szCs w:val="18"/>
+          <w:rFonts w:ascii="Courier New" w:cs="Courier New" w:eastAsia="Courier New" w:hAnsi="Courier New"/>
+        </w:rPr>
+        <w:t xml:space="preserve">INTERMISSION CARD — </w:t>
+      </w:r>
+      <w:r>
+        <w:rPr>
+          <w:color w:val="1a1d26"/>
+          <w:sz w:val="18"/>
+          <w:szCs w:val="18"/>
+          <w:rFonts w:ascii="Courier New" w:cs="Courier New" w:eastAsia="Courier New" w:hAnsi="Courier New"/>
+        </w:rPr>
+        <w:t xml:space="preserve">the house sees “Intermission”; it holds until Act Two’s first GO</w:t>
+      </w:r>
+    </w:p>
+    <w:p>
+      <w:pPr>
+        <w:keepNext/>
+        <w:pBdr>
+          <w:top w:val="single" w:color="d8d2c2" w:sz="4"/>
+        </w:pBdr>
+        <w:spacing w:before="200" w:after="40"/>
+      </w:pPr>
+      <w:r>
+        <w:rPr>
+          <w:b/>
+          <w:bCs/>
+          <w:color w:val="1a1d26"/>
+          <w:sz w:val="22"/>
+          <w:szCs w:val="22"/>
+          <w:rFonts w:ascii="Courier New" w:cs="Courier New" w:eastAsia="Courier New" w:hAnsi="Courier New"/>
+        </w:rPr>
+        <w:t xml:space="preserve">8.5</w:t>
+      </w:r>
+      <w:r>
+        <w:rPr>
+          <w:color w:val="2a5db0"/>
+          <w:sz w:val="17"/>
+          <w:szCs w:val="17"/>
+          <w:rFonts w:ascii="Courier New" w:cs="Courier New" w:eastAsia="Courier New" w:hAnsi="Courier New"/>
+        </w:rPr>
+        <w:t xml:space="preserve">  BOTH · CATHY</w:t>
+      </w:r>
+      <w:r>
+        <w:rPr>
+          <w:i/>
+          <w:iCs/>
+          <w:color w:val="1a1d26"/>
+          <w:sz w:val="19"/>
+          <w:szCs w:val="19"/>
+          <w:rFonts w:ascii="Georgia" w:cs="Georgia" w:eastAsia="Georgia" w:hAnsi="Georgia"/>
+        </w:rPr>
+        <w:t xml:space="preserve">   —  THE MONEY MINUTE — the speaker picks up the handheld mic</w:t>
+      </w:r>
+    </w:p>
+    <w:p>
+      <w:pPr>
+        <w:keepNext/>
+        <w:spacing w:after="60"/>
+      </w:pPr>
+      <w:r>
+        <w:rPr>
+          <w:color w:val="3a3f4d"/>
+          <w:sz w:val="19"/>
+          <w:szCs w:val="19"/>
+          <w:rFonts w:ascii="Georgia" w:cs="Georgia" w:eastAsia="Georgia" w:hAnsi="Georgia"/>
+        </w:rPr>
+        <w:t xml:space="preserve">THE NEXT 5 YEARS: the pad turns to the fundraising card — the words over Redline’s QR code, printed on the paper. No grit on the code; it has to scan from the house.</w:t>
+      </w:r>
+    </w:p>
+    <w:p>
+      <w:pPr>
+        <w:shd w:fill="faf3dc" w:val="clear"/>
+        <w:spacing w:before="30" w:after="14"/>
+      </w:pPr>
+      <w:r>
+        <w:rPr>
+          <w:b/>
+          <w:bCs/>
+          <w:color w:val="8a6d10"/>
+          <w:sz w:val="17"/>
+          <w:szCs w:val="17"/>
+          <w:rFonts w:ascii="Courier New" w:cs="Courier New" w:eastAsia="Courier New" w:hAnsi="Courier New"/>
+        </w:rPr>
+        <w:t xml:space="preserve">HOLD · </w:t>
+      </w:r>
+      <w:r>
+        <w:rPr>
+          <w:i/>
+          <w:iCs/>
+          <w:color w:val="8a6d10"/>
+          <w:sz w:val="18"/>
+          <w:szCs w:val="18"/>
+          <w:rFonts w:ascii="Georgia" w:cs="Georgia" w:eastAsia="Georgia" w:hAnsi="Georgia"/>
+        </w:rPr>
+        <w:t xml:space="preserve">Holds for the whole ask. The next GO puts the break back.</w:t>
+      </w:r>
+    </w:p>
+    <w:p>
+      <w:pPr>
+        <w:keepNext/>
+        <w:pBdr>
+          <w:top w:val="single" w:color="d8d2c2" w:sz="4"/>
+        </w:pBdr>
+        <w:spacing w:before="200" w:after="40"/>
+      </w:pPr>
+      <w:r>
+        <w:rPr>
+          <w:b/>
+          <w:bCs/>
+          <w:color w:val="1a1d26"/>
+          <w:sz w:val="22"/>
+          <w:szCs w:val="22"/>
+          <w:rFonts w:ascii="Courier New" w:cs="Courier New" w:eastAsia="Courier New" w:hAnsi="Courier New"/>
+        </w:rPr>
+        <w:t xml:space="preserve">8.6</w:t>
+      </w:r>
+      <w:r>
+        <w:rPr>
+          <w:color w:val="2a5db0"/>
+          <w:sz w:val="17"/>
+          <w:szCs w:val="17"/>
+          <w:rFonts w:ascii="Courier New" w:cs="Courier New" w:eastAsia="Courier New" w:hAnsi="Courier New"/>
+        </w:rPr>
+        <w:t xml:space="preserve">  BOTH · CATHY</w:t>
+      </w:r>
+      <w:r>
+        <w:rPr>
+          <w:i/>
+          <w:iCs/>
+          <w:color w:val="1a1d26"/>
+          <w:sz w:val="19"/>
+          <w:szCs w:val="19"/>
+          <w:rFonts w:ascii="Georgia" w:cs="Georgia" w:eastAsia="Georgia" w:hAnsi="Georgia"/>
+        </w:rPr>
+        <w:t xml:space="preserve">   —  THE ASK IS OVER — the mic goes down</w:t>
+      </w:r>
+    </w:p>
+    <w:p>
+      <w:pPr>
+        <w:keepNext/>
+        <w:spacing w:after="60"/>
+      </w:pPr>
+      <w:r>
+        <w:rPr>
+          <w:color w:val="3a3f4d"/>
+          <w:sz w:val="19"/>
+          <w:szCs w:val="19"/>
+          <w:rFonts w:ascii="Georgia" w:cs="Georgia" w:eastAsia="Georgia" w:hAnsi="Georgia"/>
+        </w:rPr>
+        <w:t xml:space="preserve">Back to Intermission: the same torn band as before, still, until the first GO of Act Two (9.1) tears it off.</w:t>
       </w:r>
     </w:p>
     <w:p>

</xml_diff>

<commit_message>
Preshow returns to the title card before the show; only one window can make sound; the month/event divider appears only when there is an event, on every page including mid-roll
Co-Authored-By: Claude Opus 5 <noreply@anthropic.com>
Claude-Session: https://claude.ai/code/session_01Y6sUkZbYffNPeDjzCChZiy
</commit_message>
<xml_diff>
--- a/L5Y-Cue-Bible.docx
+++ b/L5Y-Cue-Bible.docx
@@ -65,7 +65,7 @@
           <w:szCs w:val="19"/>
           <w:rFonts w:ascii="Georgia" w:cs="Georgia" w:eastAsia="Georgia" w:hAnsi="Georgia"/>
         </w:rPr>
-        <w:t xml:space="preserve">68 cues · 14 songs · generated from the live show build, so this document cannot drift from what the phones actually do</w:t>
+        <w:t xml:space="preserve">69 cues · 14 songs · generated from the live show build, so this document cannot drift from what the phones actually do</w:t>
       </w:r>
     </w:p>
     <w:p>
@@ -133,7 +133,7 @@
           <w:szCs w:val="18"/>
           <w:rFonts w:ascii="Courier New" w:cs="Courier New" w:eastAsia="Courier New" w:hAnsi="Courier New"/>
         </w:rPr>
-        <w:t xml:space="preserve">   CATHY SINGS · 8 FIRES</w:t>
+        <w:t xml:space="preserve">   CATHY SINGS · 9 FIRES</w:t>
       </w:r>
     </w:p>
     <w:p>
@@ -168,7 +168,7 @@
           <w:szCs w:val="22"/>
           <w:rFonts w:ascii="Courier New" w:cs="Courier New" w:eastAsia="Courier New" w:hAnsi="Courier New"/>
         </w:rPr>
-        <w:t xml:space="preserve">1.0</w:t>
+        <w:t xml:space="preserve">1.0a</w:t>
       </w:r>
       <w:r>
         <w:rPr>
@@ -203,7 +203,7 @@
           <w:szCs w:val="19"/>
           <w:rFonts w:ascii="Georgia" w:cs="Georgia" w:eastAsia="Georgia" w:hAnsi="Georgia"/>
         </w:rPr>
-        <w:t xml:space="preserve">The pad turns to tonight’s preshow performer — the name the operator chose on the start screen, nothing else on the page. If NONE was chosen the title page simply stays up and this GO does nothing.</w:t>
+        <w:t xml:space="preserve">The pad turns to tonight’s preshow performer — the name the operator chose on the start screen, nothing else on the page, the photographs still landing behind it. If NONE was chosen the title card simply stays up and this GO does nothing.</w:t>
       </w:r>
     </w:p>
     <w:p>
@@ -231,7 +231,90 @@
           <w:szCs w:val="18"/>
           <w:rFonts w:ascii="Georgia" w:cs="Georgia" w:eastAsia="Georgia" w:hAnsi="Georgia"/>
         </w:rPr>
-        <w:t xml:space="preserve">Hold here through the preshow. The next GO tears this page for the top of the show.</w:t>
+        <w:t xml:space="preserve">Hold here for the whole preshow set.</w:t>
+      </w:r>
+    </w:p>
+    <w:p>
+      <w:pPr>
+        <w:keepNext/>
+        <w:pBdr>
+          <w:top w:val="single" w:color="d8d2c2" w:sz="4"/>
+        </w:pBdr>
+        <w:spacing w:before="200" w:after="40"/>
+      </w:pPr>
+      <w:r>
+        <w:rPr>
+          <w:b/>
+          <w:bCs/>
+          <w:color w:val="1a1d26"/>
+          <w:sz w:val="22"/>
+          <w:szCs w:val="22"/>
+          <w:rFonts w:ascii="Courier New" w:cs="Courier New" w:eastAsia="Courier New" w:hAnsi="Courier New"/>
+        </w:rPr>
+        <w:t xml:space="preserve">1.0b</w:t>
+      </w:r>
+      <w:r>
+        <w:rPr>
+          <w:color w:val="2a5db0"/>
+          <w:sz w:val="17"/>
+          <w:szCs w:val="17"/>
+          <w:rFonts w:ascii="Courier New" w:cs="Courier New" w:eastAsia="Courier New" w:hAnsi="Courier New"/>
+        </w:rPr>
+        <w:t xml:space="preserve">  SR · CATHY</w:t>
+      </w:r>
+      <w:r>
+        <w:rPr>
+          <w:i/>
+          <w:iCs/>
+          <w:color w:val="1a1d26"/>
+          <w:sz w:val="19"/>
+          <w:szCs w:val="19"/>
+          <w:rFonts w:ascii="Georgia" w:cs="Georgia" w:eastAsia="Georgia" w:hAnsi="Georgia"/>
+        </w:rPr>
+        <w:t xml:space="preserve">   —  THE PRESHOW SET IS OVER — the performer is off</w:t>
+      </w:r>
+    </w:p>
+    <w:p>
+      <w:pPr>
+        <w:keepNext/>
+        <w:spacing w:after="60"/>
+      </w:pPr>
+      <w:r>
+        <w:rPr>
+          <w:color w:val="3a3f4d"/>
+          <w:sz w:val="19"/>
+          <w:szCs w:val="19"/>
+          <w:rFonts w:ascii="Georgia" w:cs="Georgia" w:eastAsia="Georgia" w:hAnsi="Georgia"/>
+        </w:rPr>
+        <w:t xml:space="preserve">Back to the title card and the photographs, for the rest of the house. The show does NOT start on this GO.</w:t>
+      </w:r>
+    </w:p>
+    <w:p>
+      <w:pPr>
+        <w:shd w:fill="faf3dc" w:val="clear"/>
+        <w:spacing w:before="30" w:after="14"/>
+      </w:pPr>
+      <w:r>
+        <w:rPr>
+          <w:b/>
+          <w:bCs/>
+          <w:color w:val="8a6d10"/>
+          <w:sz w:val="17"/>
+          <w:szCs w:val="17"/>
+          <w:rFonts w:ascii="Courier New" w:cs="Courier New" w:eastAsia="Courier New" w:hAnsi="Courier New"/>
+        </w:rPr>
+        <w:t xml:space="preserve">HOLD · </w:t>
+      </w:r>
+      <w:r>
+        <w:rPr>
+          <w:i/>
+          <w:iCs/>
+          <w:color w:val="8a6d10"/>
+          <w:sz w:val="18"/>
+          <w:szCs w:val="18"/>
+          <w:rFonts w:ascii="Georgia" w:cs="Georgia" w:eastAsia="Georgia" w:hAnsi="Georgia"/>
+        </w:rPr>
+        <w:t xml:space="preserve">Hold until places. The next GO is the top of the show.</w:t>
       </w:r>
     </w:p>
     <w:p>

</xml_diff>

<commit_message>
URGENT: the camera survives a stage rebuild again (paintAll destroyed the .stagecam and every shot after it played at scale 1); notifications force their push-in so the card fills the reading window; the calendar fitter only measures in its centre home; the laptop keeps clear of the docked strip; FaceTime end button no longer lands on the name; reverse time-warp clip, tapered warp with reverb, two audible ring-backs, a bell for the bank alert; Schmuel is calendar-only; the photo bed falls instead of piling; song 8 reads 'the engagement'
Co-Authored-By: Claude Opus 5 <noreply@anthropic.com>
Claude-Session: https://claude.ai/code/session_01Y6sUkZbYffNPeDjzCChZiy
</commit_message>
<xml_diff>
--- a/L5Y-Cue-Bible.docx
+++ b/L5Y-Cue-Bible.docx
@@ -65,7 +65,7 @@
           <w:szCs w:val="19"/>
           <w:rFonts w:ascii="Georgia" w:cs="Georgia" w:eastAsia="Georgia" w:hAnsi="Georgia"/>
         </w:rPr>
-        <w:t xml:space="preserve">69 cues · 14 songs · generated from the live show build, so this document cannot drift from what the phones actually do</w:t>
+        <w:t xml:space="preserve">68 cues · 14 songs · generated from the live show build, so this document cannot drift from what the phones actually do</w:t>
       </w:r>
     </w:p>
     <w:p>
@@ -9159,7 +9159,7 @@
           <w:szCs w:val="18"/>
           <w:rFonts w:ascii="Courier New" w:cs="Courier New" w:eastAsia="Courier New" w:hAnsi="Courier New"/>
         </w:rPr>
-        <w:t xml:space="preserve">   JAMIE SINGS · 2 FIRES</w:t>
+        <w:t xml:space="preserve">   JAMIE SINGS · 1 FIRES</w:t>
       </w:r>
     </w:p>
     <w:p>
@@ -9203,7 +9203,7 @@
           <w:szCs w:val="17"/>
           <w:rFonts w:ascii="Courier New" w:cs="Courier New" w:eastAsia="Courier New" w:hAnsi="Courier New"/>
         </w:rPr>
-        <w:t xml:space="preserve">  SL · JAMIE · Lock screen</w:t>
+        <w:t xml:space="preserve">  SL · JAMIE</w:t>
       </w:r>
       <w:r>
         <w:rPr>
@@ -9229,7 +9229,7 @@
           <w:szCs w:val="19"/>
           <w:rFonts w:ascii="Georgia" w:cs="Georgia" w:eastAsia="Georgia" w:hAnsi="Georgia"/>
         </w:rPr>
-        <w:t xml:space="preserve">The calendar rolls BACK — MARCH · YEAR 4 → DECEMBER · YEAR 2 — and docks; his phone rises, locked, the Christmas wallpaper (M23). No animations: the phone keeps the season for the whole song.</w:t>
+        <w:t xml:space="preserve">CALENDAR ONLY (David, Sept 20 — the phone is cut from Schmuel). The pages roll BACK, MARCH · YEAR 4 → DECEMBER · YEAR 2, and the date holds center-stage for the whole song. No phone, no wallpaper.</w:t>
       </w:r>
     </w:p>
     <w:p>
@@ -9263,6 +9263,32 @@
           <w:szCs w:val="18"/>
           <w:rFonts w:ascii="Courier New" w:cs="Courier New" w:eastAsia="Courier New" w:hAnsi="Courier New"/>
         </w:rPr>
+        <w:t xml:space="preserve">PHONE AWAY — </w:t>
+      </w:r>
+      <w:r>
+        <w:rPr>
+          <w:color w:val="1a1d26"/>
+          <w:sz w:val="18"/>
+          <w:szCs w:val="18"/>
+          <w:rFonts w:ascii="Courier New" w:cs="Courier New" w:eastAsia="Courier New" w:hAnsi="Courier New"/>
+        </w:rPr>
+        <w:t xml:space="preserve">the phone drops; the calendar returns to center-stage</w:t>
+      </w:r>
+    </w:p>
+    <w:p>
+      <w:pPr>
+        <w:spacing w:after="14"/>
+        <w:ind w:left="280"/>
+      </w:pPr>
+      <w:r>
+        <w:rPr>
+          <w:b/>
+          <w:bCs/>
+          <w:color w:val="1a1d26"/>
+          <w:sz w:val="18"/>
+          <w:szCs w:val="18"/>
+          <w:rFonts w:ascii="Courier New" w:cs="Courier New" w:eastAsia="Courier New" w:hAnsi="Courier New"/>
+        </w:rPr>
         <w:t xml:space="preserve">TIME → </w:t>
       </w:r>
       <w:r>
@@ -9303,32 +9329,6 @@
     </w:p>
     <w:p>
       <w:pPr>
-        <w:spacing w:after="14"/>
-        <w:ind w:left="280"/>
-      </w:pPr>
-      <w:r>
-        <w:rPr>
-          <w:b/>
-          <w:bCs/>
-          <w:color w:val="1a1d26"/>
-          <w:sz w:val="18"/>
-          <w:szCs w:val="18"/>
-          <w:rFonts w:ascii="Courier New" w:cs="Courier New" w:eastAsia="Courier New" w:hAnsi="Courier New"/>
-        </w:rPr>
-        <w:t xml:space="preserve">WALLPAPER — </w:t>
-      </w:r>
-      <w:r>
-        <w:rPr>
-          <w:color w:val="1a1d26"/>
-          <w:sz w:val="18"/>
-          <w:szCs w:val="18"/>
-          <w:rFonts w:ascii="Courier New" w:cs="Courier New" w:eastAsia="Courier New" w:hAnsi="Courier New"/>
-        </w:rPr>
-        <w:t xml:space="preserve">M23 — Christmas tree lights</w:t>
-      </w:r>
-    </w:p>
-    <w:p>
-      <w:pPr>
         <w:keepNext/>
         <w:spacing w:before="30" w:after="20"/>
       </w:pPr>
@@ -9356,194 +9356,67 @@
           <w:szCs w:val="18"/>
           <w:rFonts w:ascii="Georgia" w:cs="Georgia" w:eastAsia="Georgia" w:hAnsi="Georgia"/>
         </w:rPr>
-        <w:t xml:space="preserve">the iPhone shell appears — JAMIE’s screen</w:t>
-      </w:r>
-    </w:p>
-    <w:p>
-      <w:pPr>
+        <w:t xml:space="preserve">the device drops; the calendar takes center-stage (never black — true black is the curtain only)</w:t>
+      </w:r>
+    </w:p>
+    <w:p>
+      <w:pPr>
+        <w:keepNext/>
+        <w:spacing w:before="26" w:after="20"/>
+      </w:pPr>
+      <w:r>
+        <w:rPr>
+          <w:b/>
+          <w:bCs/>
+          <w:color w:val="6b7280"/>
+          <w:sz w:val="16"/>
+          <w:szCs w:val="16"/>
+          <w:rFonts w:ascii="Courier New" w:cs="Courier New" w:eastAsia="Courier New" w:hAnsi="Courier New"/>
+        </w:rPr>
+        <w:t xml:space="preserve">SOUND</w:t>
+      </w:r>
+    </w:p>
+    <w:p>
+      <w:pPr>
+        <w:spacing w:after="14"/>
+        <w:ind w:left="280"/>
+      </w:pPr>
+      <w:r>
+        <w:rPr>
+          <w:color w:val="6a5a20"/>
+          <w:sz w:val="18"/>
+          <w:szCs w:val="18"/>
+          <w:rFonts w:ascii="Georgia" w:cs="Georgia" w:eastAsia="Georgia" w:hAnsi="Georgia"/>
+        </w:rPr>
+        <w:t xml:space="preserve">room tone out</w:t>
+      </w:r>
+    </w:p>
+    <w:p>
+      <w:pPr>
+        <w:shd w:fill="faf3dc" w:val="clear"/>
         <w:spacing w:before="30" w:after="14"/>
       </w:pPr>
       <w:r>
         <w:rPr>
           <w:b/>
           <w:bCs/>
-          <w:color w:val="6b7280"/>
-          <w:sz w:val="16"/>
-          <w:szCs w:val="16"/>
-          <w:rFonts w:ascii="Courier New" w:cs="Courier New" w:eastAsia="Courier New" w:hAnsi="Courier New"/>
-        </w:rPr>
-        <w:t xml:space="preserve">PHONES  </w:t>
-      </w:r>
-      <w:r>
-        <w:rPr>
-          <w:color w:val="6b7280"/>
+          <w:color w:val="8a6d10"/>
           <w:sz w:val="17"/>
           <w:szCs w:val="17"/>
           <w:rFonts w:ascii="Courier New" w:cs="Courier New" w:eastAsia="Courier New" w:hAnsi="Courier New"/>
         </w:rPr>
-        <w:t xml:space="preserve">SL = Lock screen  ·  stamp “their second Christmas”  ·  clock 9:12</w:t>
-      </w:r>
-    </w:p>
-    <w:p>
-      <w:pPr>
-        <w:keepNext/>
-        <w:pBdr>
-          <w:top w:val="single" w:color="d8d2c2" w:sz="4"/>
-        </w:pBdr>
-        <w:spacing w:before="200" w:after="40"/>
-      </w:pPr>
-      <w:r>
-        <w:rPr>
-          <w:b/>
-          <w:bCs/>
-          <w:color w:val="1a1d26"/>
-          <w:sz w:val="22"/>
-          <w:szCs w:val="22"/>
-          <w:rFonts w:ascii="Courier New" w:cs="Courier New" w:eastAsia="Courier New" w:hAnsi="Courier New"/>
-        </w:rPr>
-        <w:t xml:space="preserve">6.2</w:t>
-      </w:r>
-      <w:r>
-        <w:rPr>
-          <w:color w:val="2a5db0"/>
-          <w:sz w:val="17"/>
-          <w:szCs w:val="17"/>
-          <w:rFonts w:ascii="Courier New" w:cs="Courier New" w:eastAsia="Courier New" w:hAnsi="Courier New"/>
-        </w:rPr>
-        <w:t xml:space="preserve">  SL · JAMIE</w:t>
+        <w:t xml:space="preserve">HOLD · </w:t>
       </w:r>
       <w:r>
         <w:rPr>
           <w:i/>
           <w:iCs/>
-          <w:color w:val="1a1d26"/>
-          <w:sz w:val="19"/>
-          <w:szCs w:val="19"/>
-          <w:rFonts w:ascii="Georgia" w:cs="Georgia" w:eastAsia="Georgia" w:hAnsi="Georgia"/>
-        </w:rPr>
-        <w:t xml:space="preserve">   —  FINAL CHORD — after the watch, the last note</w:t>
-      </w:r>
-    </w:p>
-    <w:p>
-      <w:pPr>
-        <w:keepNext/>
-        <w:spacing w:after="60"/>
-      </w:pPr>
-      <w:r>
-        <w:rPr>
-          <w:color w:val="3a3f4d"/>
-          <w:sz w:val="19"/>
-          <w:szCs w:val="19"/>
-          <w:rFonts w:ascii="Georgia" w:cs="Georgia" w:eastAsia="Georgia" w:hAnsi="Georgia"/>
-        </w:rPr>
-        <w:t xml:space="preserve">The phone drops; DECEMBER · YEAR 2 holds center.</w:t>
-      </w:r>
-    </w:p>
-    <w:p>
-      <w:pPr>
-        <w:keepNext/>
-        <w:spacing w:after="20"/>
-      </w:pPr>
-      <w:r>
-        <w:rPr>
-          <w:b/>
-          <w:bCs/>
-          <w:color w:val="6b7280"/>
-          <w:sz w:val="16"/>
-          <w:szCs w:val="16"/>
-          <w:rFonts w:ascii="Courier New" w:cs="Courier New" w:eastAsia="Courier New" w:hAnsi="Courier New"/>
-        </w:rPr>
-        <w:t xml:space="preserve">ON SCREEN</w:t>
-      </w:r>
-    </w:p>
-    <w:p>
-      <w:pPr>
-        <w:spacing w:after="14"/>
-        <w:ind w:left="280"/>
-      </w:pPr>
-      <w:r>
-        <w:rPr>
-          <w:b/>
-          <w:bCs/>
-          <w:color w:val="1a1d26"/>
-          <w:sz w:val="18"/>
-          <w:szCs w:val="18"/>
-          <w:rFonts w:ascii="Courier New" w:cs="Courier New" w:eastAsia="Courier New" w:hAnsi="Courier New"/>
-        </w:rPr>
-        <w:t xml:space="preserve">PHONE AWAY — </w:t>
-      </w:r>
-      <w:r>
-        <w:rPr>
-          <w:color w:val="1a1d26"/>
-          <w:sz w:val="18"/>
-          <w:szCs w:val="18"/>
-          <w:rFonts w:ascii="Courier New" w:cs="Courier New" w:eastAsia="Courier New" w:hAnsi="Courier New"/>
-        </w:rPr>
-        <w:t xml:space="preserve">the phone drops; the calendar returns to center-stage</w:t>
-      </w:r>
-    </w:p>
-    <w:p>
-      <w:pPr>
-        <w:keepNext/>
-        <w:spacing w:before="30" w:after="20"/>
-      </w:pPr>
-      <w:r>
-        <w:rPr>
-          <w:b/>
-          <w:bCs/>
-          <w:color w:val="6b7280"/>
-          <w:sz w:val="16"/>
-          <w:szCs w:val="16"/>
-          <w:rFonts w:ascii="Courier New" w:cs="Courier New" w:eastAsia="Courier New" w:hAnsi="Courier New"/>
-        </w:rPr>
-        <w:t xml:space="preserve">PLAYS</w:t>
-      </w:r>
-    </w:p>
-    <w:p>
-      <w:pPr>
-        <w:spacing w:after="14"/>
-        <w:ind w:left="280"/>
-      </w:pPr>
-      <w:r>
-        <w:rPr>
-          <w:color w:val="3a3f4d"/>
-          <w:sz w:val="18"/>
-          <w:szCs w:val="18"/>
-          <w:rFonts w:ascii="Georgia" w:cs="Georgia" w:eastAsia="Georgia" w:hAnsi="Georgia"/>
-        </w:rPr>
-        <w:t xml:space="preserve">the device drops; the calendar takes center-stage (never black — true black is the curtain only)</w:t>
-      </w:r>
-    </w:p>
-    <w:p>
-      <w:pPr>
-        <w:keepNext/>
-        <w:spacing w:before="26" w:after="20"/>
-      </w:pPr>
-      <w:r>
-        <w:rPr>
-          <w:b/>
-          <w:bCs/>
-          <w:color w:val="6b7280"/>
-          <w:sz w:val="16"/>
-          <w:szCs w:val="16"/>
-          <w:rFonts w:ascii="Courier New" w:cs="Courier New" w:eastAsia="Courier New" w:hAnsi="Courier New"/>
-        </w:rPr>
-        <w:t xml:space="preserve">SOUND</w:t>
-      </w:r>
-    </w:p>
-    <w:p>
-      <w:pPr>
-        <w:spacing w:after="14"/>
-        <w:ind w:left="280"/>
-      </w:pPr>
-      <w:r>
-        <w:rPr>
-          <w:color w:val="6a5a20"/>
-          <w:sz w:val="18"/>
-          <w:szCs w:val="18"/>
-          <w:rFonts w:ascii="Georgia" w:cs="Georgia" w:eastAsia="Georgia" w:hAnsi="Georgia"/>
-        </w:rPr>
-        <w:t xml:space="preserve">room tone out</w:t>
+          <w:color w:val="8a6d10"/>
+          <w:sz w:val="18"/>
+          <w:szCs w:val="18"/>
+          <w:rFonts w:ascii="Georgia" w:cs="Georgia" w:eastAsia="Georgia" w:hAnsi="Georgia"/>
+        </w:rPr>
+        <w:t xml:space="preserve">Nothing else fires in this song. The next GO is the top of song 7.</w:t>
       </w:r>
     </w:p>
     <w:p>

</xml_diff>

<commit_message>
Song 10: the Casting Networks mail arrives with its tone three seconds before his text; the flashback paragraph holds on the lock screen for 18 s with no unlock and no thread
Co-Authored-By: Claude Opus 5 <noreply@anthropic.com>
Claude-Session: https://claude.ai/code/session_01Y6sUkZbYffNPeDjzCChZiy
</commit_message>
<xml_diff>
--- a/L5Y-Cue-Bible.docx
+++ b/L5Y-Cue-Bible.docx
@@ -10229,7 +10229,7 @@
           <w:szCs w:val="18"/>
           <w:rFonts w:ascii="Courier New" w:cs="Courier New" w:eastAsia="Courier New" w:hAnsi="Courier New"/>
         </w:rPr>
-        <w:t xml:space="preserve">“the rowboat”</w:t>
+        <w:t xml:space="preserve">“the engagement”</w:t>
       </w:r>
     </w:p>
     <w:p>
@@ -10541,7 +10541,7 @@
           <w:szCs w:val="18"/>
           <w:rFonts w:ascii="Courier New" w:cs="Courier New" w:eastAsia="Courier New" w:hAnsi="Courier New"/>
         </w:rPr>
-        <w:t xml:space="preserve">“the rowboat”</w:t>
+        <w:t xml:space="preserve">“the engagement”</w:t>
       </w:r>
     </w:p>
     <w:p>
@@ -12276,7 +12276,33 @@
           <w:szCs w:val="18"/>
           <w:rFonts w:ascii="Courier New" w:cs="Courier New" w:eastAsia="Courier New" w:hAnsi="Courier New"/>
         </w:rPr>
-        <w:t xml:space="preserve">NOTIFICATION — Mail · Casting Networks (8:14 AM): </w:t>
+        <w:t xml:space="preserve">  … a beat (auto-timed, </w:t>
+      </w:r>
+      <w:r>
+        <w:rPr>
+          <w:color w:val="1a1d26"/>
+          <w:sz w:val="18"/>
+          <w:szCs w:val="18"/>
+          <w:rFonts w:ascii="Courier New" w:cs="Courier New" w:eastAsia="Courier New" w:hAnsi="Courier New"/>
+        </w:rPr>
+        <w:t xml:space="preserve">0.7 s)</w:t>
+      </w:r>
+    </w:p>
+    <w:p>
+      <w:pPr>
+        <w:spacing w:after="14"/>
+        <w:ind w:left="280"/>
+      </w:pPr>
+      <w:r>
+        <w:rPr>
+          <w:b/>
+          <w:bCs/>
+          <w:color w:val="1a1d26"/>
+          <w:sz w:val="18"/>
+          <w:szCs w:val="18"/>
+          <w:rFonts w:ascii="Courier New" w:cs="Courier New" w:eastAsia="Courier New" w:hAnsi="Courier New"/>
+        </w:rPr>
+        <w:t xml:space="preserve">NOTIFICATION — Mail · Casting Networks (now): </w:t>
       </w:r>
       <w:r>
         <w:rPr>
@@ -12311,7 +12337,7 @@
           <w:szCs w:val="18"/>
           <w:rFonts w:ascii="Courier New" w:cs="Courier New" w:eastAsia="Courier New" w:hAnsi="Courier New"/>
         </w:rPr>
-        <w:t xml:space="preserve">1.1 s)</w:t>
+        <w:t xml:space="preserve">3.0 s)</w:t>
       </w:r>
     </w:p>
     <w:p>
@@ -12956,7 +12982,7 @@
           <w:szCs w:val="17"/>
           <w:rFonts w:ascii="Courier New" w:cs="Courier New" w:eastAsia="Courier New" w:hAnsi="Courier New"/>
         </w:rPr>
-        <w:t xml:space="preserve">  SR · CATHY · Messages</w:t>
+        <w:t xml:space="preserve">  SR · CATHY · Lock screen</w:t>
       </w:r>
       <w:r>
         <w:rPr>
@@ -12982,7 +13008,7 @@
           <w:szCs w:val="19"/>
           <w:rFonts w:ascii="Georgia" w:cs="Georgia" w:eastAsia="Georgia" w:hAnsi="Georgia"/>
         </w:rPr>
-        <w:t xml:space="preserve">FLASHBACK, AUTO-PLAYS from this GO. The pages settle BACK three months — FEBRUARY → NOVEMBER · YEAR 3 — and dock; her phone rises: a text from him, long and thoughtful, the night before an earlier callback. She opens it; the thread shows the man he was three months ago.</w:t>
+        <w:t xml:space="preserve">FLASHBACK, AUTO-PLAYS from this GO. The pages settle BACK three months — FEBRUARY → NOVEMBER · YEAR 3 — and dock; her phone rises, LOCKED, and his paragraph lands on the lock screen and stays there. She never unlocks it (David, Sept 20 — the unlock is cut); the words are the whole point, so the card simply holds long enough to read every line.</w:t>
       </w:r>
     </w:p>
     <w:p>
@@ -13129,188 +13155,7 @@
           <w:szCs w:val="18"/>
           <w:rFonts w:ascii="Courier New" w:cs="Courier New" w:eastAsia="Courier New" w:hAnsi="Courier New"/>
         </w:rPr>
-        <w:t xml:space="preserve">4.2 s)</w:t>
-      </w:r>
-    </w:p>
-    <w:p>
-      <w:pPr>
-        <w:spacing w:after="14"/>
-        <w:ind w:left="280"/>
-      </w:pPr>
-      <w:r>
-        <w:rPr>
-          <w:b/>
-          <w:bCs/>
-          <w:color w:val="1a1d26"/>
-          <w:sz w:val="18"/>
-          <w:szCs w:val="18"/>
-          <w:rFonts w:ascii="Courier New" w:cs="Courier New" w:eastAsia="Courier New" w:hAnsi="Courier New"/>
-        </w:rPr>
-        <w:t xml:space="preserve">THREAD HISTORY — loads whole with the thread: </w:t>
-      </w:r>
-      <w:r>
-        <w:rPr>
-          <w:color w:val="1a1d26"/>
-          <w:sz w:val="18"/>
-          <w:szCs w:val="18"/>
-          <w:rFonts w:ascii="Courier New" w:cs="Courier New" w:eastAsia="Courier New" w:hAnsi="Courier New"/>
-        </w:rPr>
-      </w:r>
-    </w:p>
-    <w:p>
-      <w:pPr>
-        <w:spacing w:after="14"/>
-        <w:ind w:left="280"/>
-      </w:pPr>
-      <w:r>
-        <w:rPr>
-          <w:b/>
-          <w:bCs/>
-          <w:color w:val="1a1d26"/>
-          <w:sz w:val="18"/>
-          <w:szCs w:val="18"/>
-          <w:rFonts w:ascii="Courier New" w:cs="Courier New" w:eastAsia="Courier New" w:hAnsi="Courier New"/>
-        </w:rPr>
-        <w:t xml:space="preserve">   — </w:t>
-      </w:r>
-      <w:r>
-        <w:rPr>
-          <w:color w:val="1a1d26"/>
-          <w:sz w:val="18"/>
-          <w:szCs w:val="18"/>
-          <w:rFonts w:ascii="Courier New" w:cs="Courier New" w:eastAsia="Courier New" w:hAnsi="Courier New"/>
-        </w:rPr>
-        <w:t xml:space="preserve">Tuesday · 8:15 PM</w:t>
-      </w:r>
-    </w:p>
-    <w:p>
-      <w:pPr>
-        <w:spacing w:after="14"/>
-        <w:ind w:left="280"/>
-      </w:pPr>
-      <w:r>
-        <w:rPr>
-          <w:b/>
-          <w:bCs/>
-          <w:color w:val="1a1d26"/>
-          <w:sz w:val="18"/>
-          <w:szCs w:val="18"/>
-          <w:rFonts w:ascii="Courier New" w:cs="Courier New" w:eastAsia="Courier New" w:hAnsi="Courier New"/>
-        </w:rPr>
-        <w:t xml:space="preserve">   SENT (blue): </w:t>
-      </w:r>
-      <w:r>
-        <w:rPr>
-          <w:color w:val="1a1d26"/>
-          <w:sz w:val="18"/>
-          <w:szCs w:val="18"/>
-          <w:rFonts w:ascii="Courier New" w:cs="Courier New" w:eastAsia="Courier New" w:hAnsi="Courier New"/>
-        </w:rPr>
-        <w:t xml:space="preserve">“callback thursday. 9am. help”</w:t>
-      </w:r>
-    </w:p>
-    <w:p>
-      <w:pPr>
-        <w:spacing w:after="14"/>
-        <w:ind w:left="280"/>
-      </w:pPr>
-      <w:r>
-        <w:rPr>
-          <w:b/>
-          <w:bCs/>
-          <w:color w:val="1a1d26"/>
-          <w:sz w:val="18"/>
-          <w:szCs w:val="18"/>
-          <w:rFonts w:ascii="Courier New" w:cs="Courier New" w:eastAsia="Courier New" w:hAnsi="Courier New"/>
-        </w:rPr>
-        <w:t xml:space="preserve">   RECEIVED (gray): </w:t>
-      </w:r>
-      <w:r>
-        <w:rPr>
-          <w:color w:val="1a1d26"/>
-          <w:sz w:val="18"/>
-          <w:szCs w:val="18"/>
-          <w:rFonts w:ascii="Courier New" w:cs="Courier New" w:eastAsia="Courier New" w:hAnsi="Courier New"/>
-        </w:rPr>
-        <w:t xml:space="preserve">“you’ve got this. what are you singing?”</w:t>
-      </w:r>
-    </w:p>
-    <w:p>
-      <w:pPr>
-        <w:spacing w:after="14"/>
-        <w:ind w:left="280"/>
-      </w:pPr>
-      <w:r>
-        <w:rPr>
-          <w:b/>
-          <w:bCs/>
-          <w:color w:val="1a1d26"/>
-          <w:sz w:val="18"/>
-          <w:szCs w:val="18"/>
-          <w:rFonts w:ascii="Courier New" w:cs="Courier New" w:eastAsia="Courier New" w:hAnsi="Courier New"/>
-        </w:rPr>
-        <w:t xml:space="preserve">   SENT (blue): </w:t>
-      </w:r>
-      <w:r>
-        <w:rPr>
-          <w:color w:val="1a1d26"/>
-          <w:sz w:val="18"/>
-          <w:szCs w:val="18"/>
-          <w:rFonts w:ascii="Courier New" w:cs="Courier New" w:eastAsia="Courier New" w:hAnsi="Courier New"/>
-        </w:rPr>
-        <w:t xml:space="preserve">“the one you like”</w:t>
-      </w:r>
-    </w:p>
-    <w:p>
-      <w:pPr>
-        <w:spacing w:after="14"/>
-        <w:ind w:left="280"/>
-      </w:pPr>
-      <w:r>
-        <w:rPr>
-          <w:b/>
-          <w:bCs/>
-          <w:color w:val="1a1d26"/>
-          <w:sz w:val="18"/>
-          <w:szCs w:val="18"/>
-          <w:rFonts w:ascii="Courier New" w:cs="Courier New" w:eastAsia="Courier New" w:hAnsi="Courier New"/>
-        </w:rPr>
-        <w:t xml:space="preserve">   — </w:t>
-      </w:r>
-      <w:r>
-        <w:rPr>
-          <w:color w:val="1a1d26"/>
-          <w:sz w:val="18"/>
-          <w:szCs w:val="18"/>
-          <w:rFonts w:ascii="Courier New" w:cs="Courier New" w:eastAsia="Courier New" w:hAnsi="Courier New"/>
-        </w:rPr>
-        <w:t xml:space="preserve">Today · 9:48 PM</w:t>
-      </w:r>
-    </w:p>
-    <w:p>
-      <w:pPr>
-        <w:spacing w:after="14"/>
-        <w:ind w:left="280"/>
-      </w:pPr>
-      <w:r>
-        <w:rPr>
-          <w:b/>
-          <w:bCs/>
-          <w:color w:val="1a1d26"/>
-          <w:sz w:val="18"/>
-          <w:szCs w:val="18"/>
-          <w:rFonts w:ascii="Courier New" w:cs="Courier New" w:eastAsia="Courier New" w:hAnsi="Courier New"/>
-        </w:rPr>
-        <w:t xml:space="preserve">   RECEIVED (gray): </w:t>
-      </w:r>
-      <w:r>
-        <w:rPr>
-          <w:color w:val="1a1d26"/>
-          <w:sz w:val="18"/>
-          <w:szCs w:val="18"/>
-          <w:rFonts w:ascii="Courier New" w:cs="Courier New" w:eastAsia="Courier New" w:hAnsi="Courier New"/>
-        </w:rPr>
-        <w:t xml:space="preserve">“You are going to walk in there tomorrow and be the best thing they see all week. I mean it. Whatever happens in that room, you are already the real thing — I have known that since the first night. Go get it, and call me the second you are out. I love you.”</w:t>
+        <w:t xml:space="preserve">11.0 s)</w:t>
       </w:r>
     </w:p>
     <w:p>
@@ -13362,21 +13207,6 @@
     </w:p>
     <w:p>
       <w:pPr>
-        <w:spacing w:after="14"/>
-        <w:ind w:left="280"/>
-      </w:pPr>
-      <w:r>
-        <w:rPr>
-          <w:color w:val="3a3f4d"/>
-          <w:sz w:val="18"/>
-          <w:szCs w:val="18"/>
-          <w:rFonts w:ascii="Georgia" w:cs="Georgia" w:eastAsia="Georgia" w:hAnsi="Georgia"/>
-        </w:rPr>
-        <w:t xml:space="preserve">TAP THE NOTIFICATION — a beat on the banner, Face ID passes, and the app opens DIRECTLY onto Messages. One motion. No home screen. (No touch dot anywhere in the show — cut by direction; the screen’s own feedback carries every tap.)</w:t>
-      </w:r>
-    </w:p>
-    <w:p>
-      <w:pPr>
         <w:keepNext/>
         <w:spacing w:before="26" w:after="20"/>
       </w:pPr>
@@ -13405,21 +13235,6 @@
           <w:rFonts w:ascii="Georgia" w:cs="Georgia" w:eastAsia="Georgia" w:hAnsi="Georgia"/>
         </w:rPr>
         <w:t xml:space="preserve">notification tri-tone (soft)</w:t>
-      </w:r>
-    </w:p>
-    <w:p>
-      <w:pPr>
-        <w:spacing w:after="14"/>
-        <w:ind w:left="280"/>
-      </w:pPr>
-      <w:r>
-        <w:rPr>
-          <w:color w:val="6a5a20"/>
-          <w:sz w:val="18"/>
-          <w:szCs w:val="18"/>
-          <w:rFonts w:ascii="Georgia" w:cs="Georgia" w:eastAsia="Georgia" w:hAnsi="Georgia"/>
-        </w:rPr>
-        <w:t xml:space="preserve">tap thock</w:t>
       </w:r>
     </w:p>
     <w:p>
@@ -13444,7 +13259,7 @@
           <w:szCs w:val="17"/>
           <w:rFonts w:ascii="Courier New" w:cs="Courier New" w:eastAsia="Courier New" w:hAnsi="Courier New"/>
         </w:rPr>
-        <w:t xml:space="preserve">SR = Messages  ·  stamp “three months earlier”  ·  clock 9:48</w:t>
+        <w:t xml:space="preserve">SR = Lock screen  ·  stamp “three months earlier”  ·  clock 9:48</w:t>
       </w:r>
     </w:p>
     <w:p>
@@ -13472,7 +13287,7 @@
           <w:szCs w:val="18"/>
           <w:rFonts w:ascii="Georgia" w:cs="Georgia" w:eastAsia="Georgia" w:hAnsi="Georgia"/>
         </w:rPr>
-        <w:t xml:space="preserve">The contrast IS the cue: three seconds of effort in February, a paragraph in November.</w:t>
+        <w:t xml:space="preserve">The contrast IS the cue: three seconds of effort in February, a paragraph in November. Every pause here is tunable in tech.</w:t>
       </w:r>
     </w:p>
     <w:p>

</xml_diff>

<commit_message>
Regenerate the Cue Bible against the true 69-cue show, carrying the CONFIRM markers the team's copy had been dropping. Record the era-zone gutter as a measured post-run recommendation rather than a change made two days out — it feeds camFill and every framing number in the show was tuned against it.
Co-Authored-By: Claude Opus 5 <noreply@anthropic.com>
Claude-Session: https://claude.ai/code/session_01Y6sUkZbYffNPeDjzCChZiy
</commit_message>
<xml_diff>
--- a/L5Y-Cue-Bible.docx
+++ b/L5Y-Cue-Bible.docx
@@ -65,7 +65,7 @@
           <w:szCs w:val="19"/>
           <w:rFonts w:ascii="Georgia" w:cs="Georgia" w:eastAsia="Georgia" w:hAnsi="Georgia"/>
         </w:rPr>
-        <w:t xml:space="preserve">68 cues · 14 songs · generated from the live show build, so this document cannot drift from what the phones actually do</w:t>
+        <w:t xml:space="preserve">69 cues · 14 songs · generated from the live show build, so this document cannot drift from what the phones actually do</w:t>
       </w:r>
     </w:p>
     <w:p>
@@ -2328,7 +2328,7 @@
           <w:szCs w:val="19"/>
           <w:rFonts w:ascii="Georgia" w:cs="Georgia" w:eastAsia="Georgia" w:hAnsi="Georgia"/>
         </w:rPr>
-        <w:t xml:space="preserve">AUTO-PLAYS from this GO (~40 s — slowed by direction: each card’s caption centers, then the eye drifts down into the photograph). She leaves the thread and opens the Memories the notification offered: four cards scroll past — the dressing-room mirror (last year, Ohio round 2 day 1), the wedding, the ring, and the bear he brought at nine months — and she stays on the bear.</w:t>
+        <w:t xml:space="preserve">AUTO-PLAYS from this GO (~46 s — 15% slower by direction, Sept 20: each card’s caption centers, then the eye drifts down into the photograph). She leaves the thread and opens the Memories the notification offered: four cards scroll past — the dressing-room mirror (last year, Ohio round 2 day 1), the wedding, the ring, and the bear he brought at nine months — and she stays on the bear.</w:t>
       </w:r>
     </w:p>
     <w:p>
@@ -2371,7 +2371,7 @@
           <w:szCs w:val="18"/>
           <w:rFonts w:ascii="Courier New" w:cs="Courier New" w:eastAsia="Courier New" w:hAnsi="Courier New"/>
         </w:rPr>
-        <w:t xml:space="preserve">1.8 s)</w:t>
+        <w:t xml:space="preserve">2.1 s)</w:t>
       </w:r>
     </w:p>
     <w:p>
@@ -2501,7 +2501,7 @@
           <w:szCs w:val="18"/>
           <w:rFonts w:ascii="Courier New" w:cs="Courier New" w:eastAsia="Courier New" w:hAnsi="Courier New"/>
         </w:rPr>
-        <w:t xml:space="preserve">5.0 s)</w:t>
+        <w:t xml:space="preserve">5.8 s)</w:t>
       </w:r>
     </w:p>
     <w:p>
@@ -2631,7 +2631,7 @@
           <w:szCs w:val="18"/>
           <w:rFonts w:ascii="Courier New" w:cs="Courier New" w:eastAsia="Courier New" w:hAnsi="Courier New"/>
         </w:rPr>
-        <w:t xml:space="preserve">5.0 s)</w:t>
+        <w:t xml:space="preserve">5.8 s)</w:t>
       </w:r>
     </w:p>
     <w:p>
@@ -2761,7 +2761,7 @@
           <w:szCs w:val="18"/>
           <w:rFonts w:ascii="Courier New" w:cs="Courier New" w:eastAsia="Courier New" w:hAnsi="Courier New"/>
         </w:rPr>
-        <w:t xml:space="preserve">5.0 s)</w:t>
+        <w:t xml:space="preserve">5.8 s)</w:t>
       </w:r>
     </w:p>
     <w:p>
@@ -2891,7 +2891,7 @@
           <w:szCs w:val="18"/>
           <w:rFonts w:ascii="Courier New" w:cs="Courier New" w:eastAsia="Courier New" w:hAnsi="Courier New"/>
         </w:rPr>
-        <w:t xml:space="preserve">1.8 s)</w:t>
+        <w:t xml:space="preserve">2.1 s)</w:t>
       </w:r>
     </w:p>
     <w:p>
@@ -3276,7 +3276,7 @@
           <w:szCs w:val="19"/>
           <w:rFonts w:ascii="Georgia" w:cs="Georgia" w:eastAsia="Georgia" w:hAnsi="Georgia"/>
         </w:rPr>
-        <w:t xml:space="preserve">The calendar rolls BACK five years, page by page — JUNE · YEAR 5 → SEPTEMBER · YEAR 1 — then docks, and HIS phone rises, locked, walking home: three unread on the lock screen, her number on top.</w:t>
+        <w:t xml:space="preserve">The calendar rolls BACK five years, page by page — JUNE · YEAR 5 → SEPTEMBER · YEAR 1 — then docks, and HIS phone rises, locked, walking home: three unread on the lock screen, hers on top — an unsaved number Siri has already put a name to: “Maybe: Cathy”.</w:t>
       </w:r>
     </w:p>
     <w:p>
@@ -3414,7 +3414,7 @@
           <w:szCs w:val="18"/>
           <w:rFonts w:ascii="Courier New" w:cs="Courier New" w:eastAsia="Courier New" w:hAnsi="Courier New"/>
         </w:rPr>
-        <w:t xml:space="preserve">NOTIFICATION — Messages · +1 (917) 555-0148 (56m ago): </w:t>
+        <w:t xml:space="preserve">NOTIFICATION — Messages · Maybe: Cathy (56m ago): </w:t>
       </w:r>
       <w:r>
         <w:rPr>
@@ -3582,7 +3582,7 @@
           <w:szCs w:val="19"/>
           <w:rFonts w:ascii="Georgia" w:cs="Georgia" w:eastAsia="Georgia" w:hAnsi="Georgia"/>
         </w:rPr>
-        <w:t xml:space="preserve">ONE PIECE, AUTO-PLAYS from this GO (~50 s). Unlock, Messages, her thread — one message in it: her number. Three drafts die under the backspace key (the overwrought one, the bold one, the honest one) before two words survive: “home safe?” — typed, SENT, Delivered. Then her typing bubble rises… and stays up.</w:t>
+        <w:t xml:space="preserve">ONE PIECE, AUTO-PLAYS from this GO (~50 s). Unlock, Messages (the camera goes down to the dock and we watch the icon go in), her thread — one message in it, from “Maybe: Cathy”, and his eye keeps going back to it while he types. Three drafts die under the backspace key (the overwrought one, the bold one, the honest one) before two words survive: “home safe?” — typed, SENT, Delivered. Then her typing bubble rises… and stays up.</w:t>
       </w:r>
     </w:p>
     <w:p>
@@ -3650,7 +3650,7 @@
           <w:szCs w:val="18"/>
           <w:rFonts w:ascii="Courier New" w:cs="Courier New" w:eastAsia="Courier New" w:hAnsi="Courier New"/>
         </w:rPr>
-        <w:t xml:space="preserve">+1 (917) 555-0148 ● — “it’s cathy 😊 — from tonight” (10:42 PM)</w:t>
+        <w:t xml:space="preserve">Maybe: Cathy ● — “it’s cathy 😊 — from tonight” (10:42 PM)</w:t>
       </w:r>
     </w:p>
     <w:p>
@@ -4606,7 +4606,7 @@
           <w:szCs w:val="18"/>
           <w:rFonts w:ascii="Georgia" w:cs="Georgia" w:eastAsia="Georgia" w:hAnsi="Georgia"/>
         </w:rPr>
-        <w:t xml:space="preserve">“+1 (917) 555-0148” takes the iOS pressed-gray under the finger</w:t>
+        <w:t xml:space="preserve">“Maybe: Cathy” takes the iOS pressed-gray under the finger</w:t>
       </w:r>
     </w:p>
     <w:p>
@@ -4636,7 +4636,7 @@
           <w:szCs w:val="18"/>
           <w:rFonts w:ascii="Georgia" w:cs="Georgia" w:eastAsia="Georgia" w:hAnsi="Georgia"/>
         </w:rPr>
-        <w:t xml:space="preserve">thread pushes in from the list — +1 (917) 555-0148</w:t>
+        <w:t xml:space="preserve">thread pushes in from the list — Maybe: Cathy</w:t>
       </w:r>
     </w:p>
     <w:p>
@@ -4866,7 +4866,7 @@
           <w:szCs w:val="19"/>
           <w:rFonts w:ascii="Georgia" w:cs="Georgia" w:eastAsia="Georgia" w:hAnsi="Georgia"/>
         </w:rPr>
-        <w:t xml:space="preserve">The bubble never resolves as a text — she called instead. Incoming, then connected; the timer ticks.</w:t>
+        <w:t xml:space="preserve">The bubble never resolves as a text — she called instead. Incoming (Decline · Answer), then connected: the camera pulls out to the whole call UI as the buttons become mute · end · speaker, then comes back in on “Maybe: Cathy”. The timer ticks.</w:t>
       </w:r>
     </w:p>
     <w:p>
@@ -4909,7 +4909,7 @@
           <w:szCs w:val="18"/>
           <w:rFonts w:ascii="Courier New" w:cs="Courier New" w:eastAsia="Courier New" w:hAnsi="Courier New"/>
         </w:rPr>
-        <w:t xml:space="preserve">+1 (917) 555-0148 · incoming call · incoming</w:t>
+        <w:t xml:space="preserve">Maybe: Cathy · incoming call · incoming</w:t>
       </w:r>
     </w:p>
     <w:p>
@@ -11109,7 +11109,7 @@
           <w:szCs w:val="19"/>
           <w:rFonts w:ascii="Georgia" w:cs="Georgia" w:eastAsia="Georgia" w:hAnsi="Georgia"/>
         </w:rPr>
-        <w:t xml:space="preserve">   —  “…suddenly finds you attractive”</w:t>
+        <w:t xml:space="preserve">   —  ⚠CONFIRM · “…suddenly finds you attractive”</w:t>
       </w:r>
     </w:p>
     <w:p>
@@ -11433,7 +11433,7 @@
           <w:szCs w:val="19"/>
           <w:rFonts w:ascii="Georgia" w:cs="Georgia" w:eastAsia="Georgia" w:hAnsi="Georgia"/>
         </w:rPr>
-        <w:t xml:space="preserve">   —  “I’m the grand fromage”</w:t>
+        <w:t xml:space="preserve">   —  ⚠CONFIRM · “I’m the grand fromage”</w:t>
       </w:r>
     </w:p>
     <w:p>
@@ -11621,7 +11621,7 @@
           <w:szCs w:val="19"/>
           <w:rFonts w:ascii="Georgia" w:cs="Georgia" w:eastAsia="Georgia" w:hAnsi="Georgia"/>
         </w:rPr>
-        <w:t xml:space="preserve">   —  “Let’s get a cup of coffee.”</w:t>
+        <w:t xml:space="preserve">   —  ⚠CONFIRM · “Let’s get a cup of coffee.”</w:t>
       </w:r>
     </w:p>
     <w:p>
@@ -11783,7 +11783,7 @@
           <w:szCs w:val="19"/>
           <w:rFonts w:ascii="Georgia" w:cs="Georgia" w:eastAsia="Georgia" w:hAnsi="Georgia"/>
         </w:rPr>
-        <w:t xml:space="preserve">   —  “It’s a challenge to resist temptation” — THE SECOND TIME (after the party)</w:t>
+        <w:t xml:space="preserve">   —  ⚠CONFIRM · “It’s a challenge to resist temptation” — THE SECOND TIME (after the party)</w:t>
       </w:r>
     </w:p>
     <w:p>
@@ -14060,7 +14060,7 @@
           <w:szCs w:val="18"/>
           <w:rFonts w:ascii="Georgia" w:cs="Georgia" w:eastAsia="Georgia" w:hAnsi="Georgia"/>
         </w:rPr>
-        <w:t xml:space="preserve">`rate` (trip minutes per real minute; 1 = real time) and `startAt` (fraction of the trip at GO) live on this cue — tune in tech. At rate:1 she never arrives during the song; that is the point.</w:t>
+        <w:t xml:space="preserve">`rate` (trip minutes per real minute; 1 = real time) and `startAt` (fraction of the trip at GO) live on this cue — tune in tech. At rate:1 she never arrives during the song; that is the point. startAt .5 puts the bridge maneuver at 2:12, mid-song (David, Sept 20): seconds = (.51 − startAt) × 214 ÷ 58.4 × 3600.</w:t>
       </w:r>
     </w:p>
     <w:p>
@@ -14559,7 +14559,7 @@
           <w:szCs w:val="19"/>
           <w:rFonts w:ascii="Georgia" w:cs="Georgia" w:eastAsia="Georgia" w:hAnsi="Georgia"/>
         </w:rPr>
-        <w:t xml:space="preserve">AUTO-PLAYS from this GO. The calendar docks; his phone lights on the nightstand — 9% battery — with her good-morning text. He swipes it away immediately, unread, and the phone drops again. JUNE · YEAR 5 holds.</w:t>
+        <w:t xml:space="preserve">AUTO-PLAYS from this GO. The calendar docks; his phone lights on the nightstand — 9% battery — with her good-morning text. It sits there, readable, for four seconds. Then he pushes it off the screen — slowly, the whole width of the glass, a deliberate erasure and not a flick — unread, and the phone drops again. JUNE · YEAR 5 holds.</w:t>
       </w:r>
     </w:p>
     <w:p>
@@ -14628,7 +14628,7 @@
           <w:szCs w:val="18"/>
           <w:rFonts w:ascii="Courier New" w:cs="Courier New" w:eastAsia="Courier New" w:hAnsi="Courier New"/>
         </w:rPr>
-        <w:t xml:space="preserve">1.5 s)</w:t>
+        <w:t xml:space="preserve">3.5 s)</w:t>
       </w:r>
     </w:p>
     <w:p>
@@ -14654,7 +14654,7 @@
           <w:szCs w:val="18"/>
           <w:rFonts w:ascii="Courier New" w:cs="Courier New" w:eastAsia="Courier New" w:hAnsi="Courier New"/>
         </w:rPr>
-        <w:t xml:space="preserve">slides off and is gone</w:t>
+        <w:t xml:space="preserve">it travels the whole width of the glass over 1.88 s and is gone (a deliberate erasure, not a flick)</w:t>
       </w:r>
     </w:p>
     <w:p>
@@ -14816,6 +14816,34 @@
           <w:rFonts w:ascii="Georgia" w:cs="Georgia" w:eastAsia="Georgia" w:hAnsi="Georgia"/>
         </w:rPr>
         <w:t xml:space="preserve">room tone out</w:t>
+      </w:r>
+    </w:p>
+    <w:p>
+      <w:pPr>
+        <w:shd w:fill="faf3dc" w:val="clear"/>
+        <w:spacing w:before="30" w:after="14"/>
+      </w:pPr>
+      <w:r>
+        <w:rPr>
+          <w:b/>
+          <w:bCs/>
+          <w:color w:val="8a6d10"/>
+          <w:sz w:val="17"/>
+          <w:szCs w:val="17"/>
+          <w:rFonts w:ascii="Courier New" w:cs="Courier New" w:eastAsia="Courier New" w:hAnsi="Courier New"/>
+        </w:rPr>
+        <w:t xml:space="preserve">HOLD · </w:t>
+      </w:r>
+      <w:r>
+        <w:rPr>
+          <w:i/>
+          <w:iCs/>
+          <w:color w:val="8a6d10"/>
+          <w:sz w:val="18"/>
+          <w:szCs w:val="18"/>
+          <w:rFonts w:ascii="Georgia" w:cs="Georgia" w:eastAsia="Georgia" w:hAnsi="Georgia"/>
+        </w:rPr>
+        <w:t xml:space="preserve">The two pauses (3500 before, 900 after) and the swipe length (`ms` on notifDismiss) are the tuning knobs — David, Sept 20: two more seconds to read it, and a swipe a second and a half longer.</w:t>
       </w:r>
     </w:p>
     <w:p>
@@ -14855,7 +14883,7 @@
           <w:szCs w:val="19"/>
           <w:rFonts w:ascii="Georgia" w:cs="Georgia" w:eastAsia="Georgia" w:hAnsi="Georgia"/>
         </w:rPr>
-        <w:t xml:space="preserve">   —  “…in love with someone like you” — his last line; Find My, location back ON</w:t>
+        <w:t xml:space="preserve">   —  “…in love with someone like you” — his last line; Find My, the location device swapped</w:t>
       </w:r>
     </w:p>
     <w:p>
@@ -14870,7 +14898,7 @@
           <w:szCs w:val="19"/>
           <w:rFonts w:ascii="Georgia" w:cs="Georgia" w:eastAsia="Georgia" w:hAnsi="Georgia"/>
         </w:rPr>
-        <w:t xml:space="preserve">The calendar docks; his phone rises: unlock, Find My, her card — she is in Ohio, and he has not been sharing back. Share My Location → Share Indefinitely. The green check is the last image of the song: the cover-up, filed as devotion.</w:t>
+        <w:t xml:space="preserve">THE WHOLE PHONE, so the house watches him unlock it. Find My opens on People: Cathy, Mount Orab, OH — she is exactly where she says she is. He taps ME. His own card reads Share My Location ON, Sharing From: Jamie’s iPad — the iPad on the desk at home, where she thinks HE is. One blue row: “Use This iPhone as My Location.” He taps it, and Sharing From becomes Jamie’s iPhone. The map now follows his body. Nothing turns on, nothing turns off — he just moves the dot into his pocket.</w:t>
       </w:r>
     </w:p>
     <w:p>
@@ -14930,32 +14958,6 @@
           <w:szCs w:val="18"/>
           <w:rFonts w:ascii="Courier New" w:cs="Courier New" w:eastAsia="Courier New" w:hAnsi="Courier New"/>
         </w:rPr>
-        <w:t xml:space="preserve">FIND MY — her card: </w:t>
-      </w:r>
-      <w:r>
-        <w:rPr>
-          <w:color w:val="1a1d26"/>
-          <w:sz w:val="18"/>
-          <w:szCs w:val="18"/>
-          <w:rFonts w:ascii="Courier New" w:cs="Courier New" w:eastAsia="Courier New" w:hAnsi="Courier New"/>
-        </w:rPr>
-        <w:t xml:space="preserve">Cathy 💛 · Mount Orab, OH · [Share My Location] (blue)</w:t>
-      </w:r>
-    </w:p>
-    <w:p>
-      <w:pPr>
-        <w:spacing w:after="14"/>
-        <w:ind w:left="280"/>
-      </w:pPr>
-      <w:r>
-        <w:rPr>
-          <w:b/>
-          <w:bCs/>
-          <w:color w:val="1a1d26"/>
-          <w:sz w:val="18"/>
-          <w:szCs w:val="18"/>
-          <w:rFonts w:ascii="Courier New" w:cs="Courier New" w:eastAsia="Courier New" w:hAnsi="Courier New"/>
-        </w:rPr>
         <w:t xml:space="preserve">  … a beat (auto-timed, </w:t>
       </w:r>
       <w:r>
@@ -14965,7 +14967,137 @@
           <w:szCs w:val="18"/>
           <w:rFonts w:ascii="Courier New" w:cs="Courier New" w:eastAsia="Courier New" w:hAnsi="Courier New"/>
         </w:rPr>
-        <w:t xml:space="preserve">0.8 s)</w:t>
+        <w:t xml:space="preserve">0.9 s)</w:t>
+      </w:r>
+    </w:p>
+    <w:p>
+      <w:pPr>
+        <w:spacing w:after="14"/>
+        <w:ind w:left="280"/>
+      </w:pPr>
+      <w:r>
+        <w:rPr>
+          <w:b/>
+          <w:bCs/>
+          <w:color w:val="1a1d26"/>
+          <w:sz w:val="18"/>
+          <w:szCs w:val="18"/>
+          <w:rFonts w:ascii="Courier New" w:cs="Courier New" w:eastAsia="Courier New" w:hAnsi="Courier New"/>
+        </w:rPr>
+        <w:t xml:space="preserve">FIND MY — People: </w:t>
+      </w:r>
+      <w:r>
+        <w:rPr>
+          <w:color w:val="1a1d26"/>
+          <w:sz w:val="18"/>
+          <w:szCs w:val="18"/>
+          <w:rFonts w:ascii="Courier New" w:cs="Courier New" w:eastAsia="Courier New" w:hAnsi="Courier New"/>
+        </w:rPr>
+        <w:t xml:space="preserve">Cathy 💛: Mount Orab, OH · now</w:t>
+      </w:r>
+    </w:p>
+    <w:p>
+      <w:pPr>
+        <w:spacing w:after="14"/>
+        <w:ind w:left="280"/>
+      </w:pPr>
+      <w:r>
+        <w:rPr>
+          <w:b/>
+          <w:bCs/>
+          <w:color w:val="1a1d26"/>
+          <w:sz w:val="18"/>
+          <w:szCs w:val="18"/>
+          <w:rFonts w:ascii="Courier New" w:cs="Courier New" w:eastAsia="Courier New" w:hAnsi="Courier New"/>
+        </w:rPr>
+        <w:t xml:space="preserve">PRESSES </w:t>
+      </w:r>
+      <w:r>
+        <w:rPr>
+          <w:color w:val="1a1d26"/>
+          <w:sz w:val="18"/>
+          <w:szCs w:val="18"/>
+          <w:rFonts w:ascii="Courier New" w:cs="Courier New" w:eastAsia="Courier New" w:hAnsi="Courier New"/>
+        </w:rPr>
+        <w:t xml:space="preserve">[Me]</w:t>
+      </w:r>
+    </w:p>
+    <w:p>
+      <w:pPr>
+        <w:spacing w:after="14"/>
+        <w:ind w:left="280"/>
+      </w:pPr>
+      <w:r>
+        <w:rPr>
+          <w:b/>
+          <w:bCs/>
+          <w:color w:val="1a1d26"/>
+          <w:sz w:val="18"/>
+          <w:szCs w:val="18"/>
+          <w:rFonts w:ascii="Courier New" w:cs="Courier New" w:eastAsia="Courier New" w:hAnsi="Courier New"/>
+        </w:rPr>
+        <w:t xml:space="preserve">FIND MY — the ME tab: </w:t>
+      </w:r>
+      <w:r>
+        <w:rPr>
+          <w:color w:val="1a1d26"/>
+          <w:sz w:val="18"/>
+          <w:szCs w:val="18"/>
+          <w:rFonts w:ascii="Courier New" w:cs="Courier New" w:eastAsia="Courier New" w:hAnsi="Courier New"/>
+        </w:rPr>
+        <w:t xml:space="preserve">Jamie Wellerstein · Share My Location ON · Sharing From: Jamie’s iPad</w:t>
+      </w:r>
+    </w:p>
+    <w:p>
+      <w:pPr>
+        <w:spacing w:after="14"/>
+        <w:ind w:left="280"/>
+      </w:pPr>
+      <w:r>
+        <w:rPr>
+          <w:b/>
+          <w:bCs/>
+          <w:color w:val="1a1d26"/>
+          <w:sz w:val="18"/>
+          <w:szCs w:val="18"/>
+          <w:rFonts w:ascii="Courier New" w:cs="Courier New" w:eastAsia="Courier New" w:hAnsi="Courier New"/>
+        </w:rPr>
+        <w:t xml:space="preserve">  blue row: </w:t>
+      </w:r>
+      <w:r>
+        <w:rPr>
+          <w:color w:val="1a1d26"/>
+          <w:sz w:val="18"/>
+          <w:szCs w:val="18"/>
+          <w:rFonts w:ascii="Courier New" w:cs="Courier New" w:eastAsia="Courier New" w:hAnsi="Courier New"/>
+        </w:rPr>
+        <w:t xml:space="preserve">[Use This iPhone as My Location] — tapping it makes THIS iPhone the device that reports his location</w:t>
+      </w:r>
+    </w:p>
+    <w:p>
+      <w:pPr>
+        <w:spacing w:after="14"/>
+        <w:ind w:left="280"/>
+      </w:pPr>
+      <w:r>
+        <w:rPr>
+          <w:b/>
+          <w:bCs/>
+          <w:color w:val="1a1d26"/>
+          <w:sz w:val="18"/>
+          <w:szCs w:val="18"/>
+          <w:rFonts w:ascii="Courier New" w:cs="Courier New" w:eastAsia="Courier New" w:hAnsi="Courier New"/>
+        </w:rPr>
+        <w:t xml:space="preserve">  · </w:t>
+      </w:r>
+      <w:r>
+        <w:rPr>
+          <w:color w:val="1a1d26"/>
+          <w:sz w:val="18"/>
+          <w:szCs w:val="18"/>
+          <w:rFonts w:ascii="Courier New" w:cs="Courier New" w:eastAsia="Courier New" w:hAnsi="Courier New"/>
+        </w:rPr>
+        <w:t xml:space="preserve">Receive Location Updates — People You Share With</w:t>
       </w:r>
     </w:p>
     <w:p>
@@ -14991,85 +15123,7 @@
           <w:szCs w:val="18"/>
           <w:rFonts w:ascii="Courier New" w:cs="Courier New" w:eastAsia="Courier New" w:hAnsi="Courier New"/>
         </w:rPr>
-        <w:t xml:space="preserve">[Share My Location] — the button holds its pressed shade. Not pressing.</w:t>
-      </w:r>
-    </w:p>
-    <w:p>
-      <w:pPr>
-        <w:spacing w:after="14"/>
-        <w:ind w:left="280"/>
-      </w:pPr>
-      <w:r>
-        <w:rPr>
-          <w:b/>
-          <w:bCs/>
-          <w:color w:val="1a1d26"/>
-          <w:sz w:val="18"/>
-          <w:szCs w:val="18"/>
-          <w:rFonts w:ascii="Courier New" w:cs="Courier New" w:eastAsia="Courier New" w:hAnsi="Courier New"/>
-        </w:rPr>
-        <w:t xml:space="preserve">ACTION SHEET slides up over the app — </w:t>
-      </w:r>
-      <w:r>
-        <w:rPr>
-          <w:color w:val="1a1d26"/>
-          <w:sz w:val="18"/>
-          <w:szCs w:val="18"/>
-          <w:rFonts w:ascii="Courier New" w:cs="Courier New" w:eastAsia="Courier New" w:hAnsi="Courier New"/>
-        </w:rPr>
-        <w:t xml:space="preserve">“Share your location with Cathy 💛?”</w:t>
-      </w:r>
-    </w:p>
-    <w:p>
-      <w:pPr>
-        <w:spacing w:after="14"/>
-        <w:ind w:left="280"/>
-      </w:pPr>
-      <w:r>
-        <w:rPr>
-          <w:b/>
-          <w:bCs/>
-          <w:color w:val="1a1d26"/>
-          <w:sz w:val="18"/>
-          <w:szCs w:val="18"/>
-          <w:rFonts w:ascii="Courier New" w:cs="Courier New" w:eastAsia="Courier New" w:hAnsi="Courier New"/>
-        </w:rPr>
-        <w:t xml:space="preserve">  buttons: </w:t>
-      </w:r>
-      <w:r>
-        <w:rPr>
-          <w:color w:val="1a1d26"/>
-          <w:sz w:val="18"/>
-          <w:szCs w:val="18"/>
-          <w:rFonts w:ascii="Courier New" w:cs="Courier New" w:eastAsia="Courier New" w:hAnsi="Courier New"/>
-        </w:rPr>
-        <w:t xml:space="preserve">[Share for One Hour] · [Share Until End of Day] · [Share Indefinitely] · [Cancel]</w:t>
-      </w:r>
-    </w:p>
-    <w:p>
-      <w:pPr>
-        <w:spacing w:after="14"/>
-        <w:ind w:left="280"/>
-      </w:pPr>
-      <w:r>
-        <w:rPr>
-          <w:b/>
-          <w:bCs/>
-          <w:color w:val="1a1d26"/>
-          <w:sz w:val="18"/>
-          <w:szCs w:val="18"/>
-          <w:rFonts w:ascii="Courier New" w:cs="Courier New" w:eastAsia="Courier New" w:hAnsi="Courier New"/>
-        </w:rPr>
-        <w:t xml:space="preserve">FINGER RESTS ON </w:t>
-      </w:r>
-      <w:r>
-        <w:rPr>
-          <w:color w:val="1a1d26"/>
-          <w:sz w:val="18"/>
-          <w:szCs w:val="18"/>
-          <w:rFonts w:ascii="Courier New" w:cs="Courier New" w:eastAsia="Courier New" w:hAnsi="Courier New"/>
-        </w:rPr>
-        <w:t xml:space="preserve">[Share Indefinitely] — the button holds its pressed shade. Not pressing.</w:t>
+        <w:t xml:space="preserve">[Use This iPhone as My Location] — the button holds its pressed shade. Not pressing.</w:t>
       </w:r>
     </w:p>
     <w:p>
@@ -15095,33 +15149,85 @@
           <w:szCs w:val="18"/>
           <w:rFonts w:ascii="Courier New" w:cs="Courier New" w:eastAsia="Courier New" w:hAnsi="Courier New"/>
         </w:rPr>
-        <w:t xml:space="preserve">[Share Indefinitely]</w:t>
-      </w:r>
-    </w:p>
-    <w:p>
-      <w:pPr>
-        <w:spacing w:after="14"/>
-        <w:ind w:left="280"/>
-      </w:pPr>
-      <w:r>
-        <w:rPr>
-          <w:b/>
-          <w:bCs/>
-          <w:color w:val="1a1d26"/>
-          <w:sz w:val="18"/>
-          <w:szCs w:val="18"/>
-          <w:rFonts w:ascii="Courier New" w:cs="Courier New" w:eastAsia="Courier New" w:hAnsi="Courier New"/>
-        </w:rPr>
-        <w:t xml:space="preserve">FIND MY — her card: </w:t>
-      </w:r>
-      <w:r>
-        <w:rPr>
-          <w:color w:val="1a1d26"/>
-          <w:sz w:val="18"/>
-          <w:szCs w:val="18"/>
-          <w:rFonts w:ascii="Courier New" w:cs="Courier New" w:eastAsia="Courier New" w:hAnsi="Courier New"/>
-        </w:rPr>
-        <w:t xml:space="preserve">Cathy 💛 · Mount Orab, OH · Sharing My Location ✓ Indefinitely (green) · [Stop Sharing My Location] (red)</w:t>
+        <w:t xml:space="preserve">[Use This iPhone as My Location]</w:t>
+      </w:r>
+    </w:p>
+    <w:p>
+      <w:pPr>
+        <w:spacing w:after="14"/>
+        <w:ind w:left="280"/>
+      </w:pPr>
+      <w:r>
+        <w:rPr>
+          <w:b/>
+          <w:bCs/>
+          <w:color w:val="1a1d26"/>
+          <w:sz w:val="18"/>
+          <w:szCs w:val="18"/>
+          <w:rFonts w:ascii="Courier New" w:cs="Courier New" w:eastAsia="Courier New" w:hAnsi="Courier New"/>
+        </w:rPr>
+        <w:t xml:space="preserve">FIND MY — the ME tab: </w:t>
+      </w:r>
+      <w:r>
+        <w:rPr>
+          <w:color w:val="1a1d26"/>
+          <w:sz w:val="18"/>
+          <w:szCs w:val="18"/>
+          <w:rFonts w:ascii="Courier New" w:cs="Courier New" w:eastAsia="Courier New" w:hAnsi="Courier New"/>
+        </w:rPr>
+        <w:t xml:space="preserve">Jamie Wellerstein · Share My Location ON · Sharing From: Jamie’s iPhone</w:t>
+      </w:r>
+    </w:p>
+    <w:p>
+      <w:pPr>
+        <w:spacing w:after="14"/>
+        <w:ind w:left="280"/>
+      </w:pPr>
+      <w:r>
+        <w:rPr>
+          <w:b/>
+          <w:bCs/>
+          <w:color w:val="1a1d26"/>
+          <w:sz w:val="18"/>
+          <w:szCs w:val="18"/>
+          <w:rFonts w:ascii="Courier New" w:cs="Courier New" w:eastAsia="Courier New" w:hAnsi="Courier New"/>
+        </w:rPr>
+        <w:t xml:space="preserve">  </w:t>
+      </w:r>
+      <w:r>
+        <w:rPr>
+          <w:color w:val="1a1d26"/>
+          <w:sz w:val="18"/>
+          <w:szCs w:val="18"/>
+          <w:rFonts w:ascii="Courier New" w:cs="Courier New" w:eastAsia="Courier New" w:hAnsi="Courier New"/>
+        </w:rPr>
+        <w:t xml:space="preserve">no “Use This iPhone as My Location” row — this iPhone IS the location now</w:t>
+      </w:r>
+    </w:p>
+    <w:p>
+      <w:pPr>
+        <w:spacing w:after="14"/>
+        <w:ind w:left="280"/>
+      </w:pPr>
+      <w:r>
+        <w:rPr>
+          <w:b/>
+          <w:bCs/>
+          <w:color w:val="1a1d26"/>
+          <w:sz w:val="18"/>
+          <w:szCs w:val="18"/>
+          <w:rFonts w:ascii="Courier New" w:cs="Courier New" w:eastAsia="Courier New" w:hAnsi="Courier New"/>
+        </w:rPr>
+        <w:t xml:space="preserve">  · </w:t>
+      </w:r>
+      <w:r>
+        <w:rPr>
+          <w:color w:val="1a1d26"/>
+          <w:sz w:val="18"/>
+          <w:szCs w:val="18"/>
+          <w:rFonts w:ascii="Courier New" w:cs="Courier New" w:eastAsia="Courier New" w:hAnsi="Courier New"/>
+        </w:rPr>
+        <w:t xml:space="preserve">Receive Location Updates — People You Share With</w:t>
       </w:r>
     </w:p>
     <w:p>
@@ -15153,7 +15259,7 @@
           <w:szCs w:val="18"/>
           <w:rFonts w:ascii="Georgia" w:cs="Georgia" w:eastAsia="Georgia" w:hAnsi="Georgia"/>
         </w:rPr>
-        <w:t xml:space="preserve">the iPhone shell appears — JAMIE’s screen</w:t>
+        <w:t xml:space="preserve">the iPhone shell appears — JAMIE’s screen · THE WHOLE PHONE IS IN FRAME (nothing cropped) so the house watches him unlock it</w:t>
       </w:r>
     </w:p>
     <w:p>
@@ -15268,7 +15374,7 @@
           <w:szCs w:val="18"/>
           <w:rFonts w:ascii="Georgia" w:cs="Georgia" w:eastAsia="Georgia" w:hAnsi="Georgia"/>
         </w:rPr>
-        <w:t xml:space="preserve">Location was OFF before the song (we never see him turn it off). Hold on this screen through the final chord; 14.1 takes it away.</w:t>
+        <w:t xml:space="preserve">He has been “sharing” with her all along; only the DEVICE changes. This iPhone was never the source and we never see him make the iPad one. Inside Find My there is not one waiting beat — he does not hesitate (David, Sept 20); the only held beat is the locked phone before the unlock (`pause` 900). Hold on the settled card through the final chord; 14.1 takes it away.</w:t>
       </w:r>
     </w:p>
     <w:p>
@@ -15295,7 +15401,7 @@
           <w:szCs w:val="18"/>
           <w:rFonts w:ascii="Courier New" w:cs="Courier New" w:eastAsia="Courier New" w:hAnsi="Courier New"/>
         </w:rPr>
-        <w:t xml:space="preserve">   BOTH SING · 6 FIRES</w:t>
+        <w:t xml:space="preserve">   BOTH SING · 7 FIRES</w:t>
       </w:r>
     </w:p>
     <w:p>
@@ -15827,7 +15933,7 @@
           <w:szCs w:val="19"/>
           <w:rFonts w:ascii="Georgia" w:cs="Georgia" w:eastAsia="Georgia" w:hAnsi="Georgia"/>
         </w:rPr>
-        <w:t xml:space="preserve">THE ONE ANIMATION. The calendar docks; her phone lights on the steps: “home safe?” — the text the house watched him send in Shiksa Goddess. She opens it and starts to answer. SHE IS STILL TYPING when his last verse takes the stage.</w:t>
+        <w:t xml:space="preserve">THE ONE ANIMATION. The calendar docks; her phone lights on the steps: “home safe?” — the text the house watched him send in Shiksa Goddess. She opens it and answers it, slowly, and then she SENDS it — we hear the send. The bubble lands, and her screen goes dark in her hand. Black, inside the phone, as the last thing the audience has of her.</w:t>
       </w:r>
     </w:p>
     <w:p>
@@ -15887,7 +15993,7 @@
           <w:szCs w:val="18"/>
           <w:rFonts w:ascii="Courier New" w:cs="Courier New" w:eastAsia="Courier New" w:hAnsi="Courier New"/>
         </w:rPr>
-        <w:t xml:space="preserve">NOTIFICATION — Messages · Jamie (now): </w:t>
+        <w:t xml:space="preserve">NOTIFICATION — Messages · Jamie ✨ (now): </w:t>
       </w:r>
       <w:r>
         <w:rPr>
@@ -16103,7 +16209,163 @@
           <w:szCs w:val="18"/>
           <w:rFonts w:ascii="Courier New" w:cs="Courier New" w:eastAsia="Courier New" w:hAnsi="Courier New"/>
         </w:rPr>
-        <w:t xml:space="preserve">“safe 😊 tonight was”</w:t>
+        <w:t xml:space="preserve">“safe 😊 tonight was amazing”</w:t>
+      </w:r>
+    </w:p>
+    <w:p>
+      <w:pPr>
+        <w:spacing w:after="14"/>
+        <w:ind w:left="280"/>
+      </w:pPr>
+      <w:r>
+        <w:rPr>
+          <w:b/>
+          <w:bCs/>
+          <w:color w:val="1a1d26"/>
+          <w:sz w:val="18"/>
+          <w:szCs w:val="18"/>
+          <w:rFonts w:ascii="Courier New" w:cs="Courier New" w:eastAsia="Courier New" w:hAnsi="Courier New"/>
+        </w:rPr>
+        <w:t xml:space="preserve">  … a beat (auto-timed, </w:t>
+      </w:r>
+      <w:r>
+        <w:rPr>
+          <w:color w:val="1a1d26"/>
+          <w:sz w:val="18"/>
+          <w:szCs w:val="18"/>
+          <w:rFonts w:ascii="Courier New" w:cs="Courier New" w:eastAsia="Courier New" w:hAnsi="Courier New"/>
+        </w:rPr>
+        <w:t xml:space="preserve">1.4 s)</w:t>
+      </w:r>
+    </w:p>
+    <w:p>
+      <w:pPr>
+        <w:spacing w:after="14"/>
+        <w:ind w:left="280"/>
+      </w:pPr>
+      <w:r>
+        <w:rPr>
+          <w:b/>
+          <w:bCs/>
+          <w:color w:val="1a1d26"/>
+          <w:sz w:val="18"/>
+          <w:szCs w:val="18"/>
+          <w:rFonts w:ascii="Courier New" w:cs="Courier New" w:eastAsia="Courier New" w:hAnsi="Courier New"/>
+        </w:rPr>
+        <w:t xml:space="preserve">TIME → </w:t>
+      </w:r>
+      <w:r>
+        <w:rPr>
+          <w:color w:val="1a1d26"/>
+          <w:sz w:val="18"/>
+          <w:szCs w:val="18"/>
+          <w:rFonts w:ascii="Courier New" w:cs="Courier New" w:eastAsia="Courier New" w:hAnsi="Courier New"/>
+        </w:rPr>
+        <w:t xml:space="preserve">11:51</w:t>
+      </w:r>
+    </w:p>
+    <w:p>
+      <w:pPr>
+        <w:spacing w:after="14"/>
+        <w:ind w:left="280"/>
+      </w:pPr>
+      <w:r>
+        <w:rPr>
+          <w:b/>
+          <w:bCs/>
+          <w:color w:val="1a1d26"/>
+          <w:sz w:val="18"/>
+          <w:szCs w:val="18"/>
+          <w:rFonts w:ascii="Courier New" w:cs="Courier New" w:eastAsia="Courier New" w:hAnsi="Courier New"/>
+        </w:rPr>
+        <w:t xml:space="preserve">SEND — </w:t>
+      </w:r>
+      <w:r>
+        <w:rPr>
+          <w:color w:val="1a1d26"/>
+          <w:sz w:val="18"/>
+          <w:szCs w:val="18"/>
+          <w:rFonts w:ascii="Courier New" w:cs="Courier New" w:eastAsia="Courier New" w:hAnsi="Courier New"/>
+        </w:rPr>
+        <w:t xml:space="preserve">the draft springs up into the thread as a blue bubble</w:t>
+      </w:r>
+    </w:p>
+    <w:p>
+      <w:pPr>
+        <w:spacing w:after="14"/>
+        <w:ind w:left="280"/>
+      </w:pPr>
+      <w:r>
+        <w:rPr>
+          <w:b/>
+          <w:bCs/>
+          <w:color w:val="1a1d26"/>
+          <w:sz w:val="18"/>
+          <w:szCs w:val="18"/>
+          <w:rFonts w:ascii="Courier New" w:cs="Courier New" w:eastAsia="Courier New" w:hAnsi="Courier New"/>
+        </w:rPr>
+        <w:t xml:space="preserve">delivery status: </w:t>
+      </w:r>
+      <w:r>
+        <w:rPr>
+          <w:color w:val="1a1d26"/>
+          <w:sz w:val="18"/>
+          <w:szCs w:val="18"/>
+          <w:rFonts w:ascii="Courier New" w:cs="Courier New" w:eastAsia="Courier New" w:hAnsi="Courier New"/>
+        </w:rPr>
+        <w:t xml:space="preserve">Delivered</w:t>
+      </w:r>
+    </w:p>
+    <w:p>
+      <w:pPr>
+        <w:spacing w:after="14"/>
+        <w:ind w:left="280"/>
+      </w:pPr>
+      <w:r>
+        <w:rPr>
+          <w:b/>
+          <w:bCs/>
+          <w:color w:val="1a1d26"/>
+          <w:sz w:val="18"/>
+          <w:szCs w:val="18"/>
+          <w:rFonts w:ascii="Courier New" w:cs="Courier New" w:eastAsia="Courier New" w:hAnsi="Courier New"/>
+        </w:rPr>
+        <w:t xml:space="preserve">  … a beat (auto-timed, </w:t>
+      </w:r>
+      <w:r>
+        <w:rPr>
+          <w:color w:val="1a1d26"/>
+          <w:sz w:val="18"/>
+          <w:szCs w:val="18"/>
+          <w:rFonts w:ascii="Courier New" w:cs="Courier New" w:eastAsia="Courier New" w:hAnsi="Courier New"/>
+        </w:rPr>
+        <w:t xml:space="preserve">2.4 s)</w:t>
+      </w:r>
+    </w:p>
+    <w:p>
+      <w:pPr>
+        <w:spacing w:after="14"/>
+        <w:ind w:left="280"/>
+      </w:pPr>
+      <w:r>
+        <w:rPr>
+          <w:b/>
+          <w:bCs/>
+          <w:color w:val="1a1d26"/>
+          <w:sz w:val="18"/>
+          <w:szCs w:val="18"/>
+          <w:rFonts w:ascii="Courier New" w:cs="Courier New" w:eastAsia="Courier New" w:hAnsi="Courier New"/>
+        </w:rPr>
+        <w:t xml:space="preserve">THE SCREEN GOES DARK — </w:t>
+      </w:r>
+      <w:r>
+        <w:rPr>
+          <w:color w:val="1a1d26"/>
+          <w:sz w:val="18"/>
+          <w:szCs w:val="18"/>
+          <w:rFonts w:ascii="Courier New" w:cs="Courier New" w:eastAsia="Courier New" w:hAnsi="Courier New"/>
+        </w:rPr>
+        <w:t xml:space="preserve">the display sleeps in her hand over ~1.6 s; the phone stays on stage, black</w:t>
       </w:r>
     </w:p>
     <w:p>
@@ -16185,6 +16447,36 @@
     </w:p>
     <w:p>
       <w:pPr>
+        <w:spacing w:after="14"/>
+        <w:ind w:left="280"/>
+      </w:pPr>
+      <w:r>
+        <w:rPr>
+          <w:color w:val="3a3f4d"/>
+          <w:sz w:val="18"/>
+          <w:szCs w:val="18"/>
+          <w:rFonts w:ascii="Georgia" w:cs="Georgia" w:eastAsia="Georgia" w:hAnsi="Georgia"/>
+        </w:rPr>
+        <w:t xml:space="preserve">sound: send swoosh</w:t>
+      </w:r>
+    </w:p>
+    <w:p>
+      <w:pPr>
+        <w:spacing w:after="14"/>
+        <w:ind w:left="280"/>
+      </w:pPr>
+      <w:r>
+        <w:rPr>
+          <w:color w:val="3a3f4d"/>
+          <w:sz w:val="18"/>
+          <w:szCs w:val="18"/>
+          <w:rFonts w:ascii="Georgia" w:cs="Georgia" w:eastAsia="Georgia" w:hAnsi="Georgia"/>
+        </w:rPr>
+        <w:t xml:space="preserve">the screen fades to black inside the bezel — status bar, thread and home bar with it. No sound: a display going to sleep is silent.</w:t>
+      </w:r>
+    </w:p>
+    <w:p>
+      <w:pPr>
         <w:keepNext/>
         <w:spacing w:before="26" w:after="20"/>
       </w:pPr>
@@ -16198,6 +16490,21 @@
           <w:rFonts w:ascii="Courier New" w:cs="Courier New" w:eastAsia="Courier New" w:hAnsi="Courier New"/>
         </w:rPr>
         <w:t xml:space="preserve">SOUND</w:t>
+      </w:r>
+    </w:p>
+    <w:p>
+      <w:pPr>
+        <w:spacing w:after="14"/>
+        <w:ind w:left="280"/>
+      </w:pPr>
+      <w:r>
+        <w:rPr>
+          <w:color w:val="6a5a20"/>
+          <w:sz w:val="18"/>
+          <w:szCs w:val="18"/>
+          <w:rFonts w:ascii="Georgia" w:cs="Georgia" w:eastAsia="Georgia" w:hAnsi="Georgia"/>
+        </w:rPr>
+        <w:t xml:space="preserve">send whoosh</w:t>
       </w:r>
     </w:p>
     <w:p>
@@ -16267,7 +16574,7 @@
           <w:szCs w:val="17"/>
           <w:rFonts w:ascii="Courier New" w:cs="Courier New" w:eastAsia="Courier New" w:hAnsi="Courier New"/>
         </w:rPr>
-        <w:t xml:space="preserve">BOTH = Messages  ·  stamp “the first night”  ·  clock 11:48</w:t>
+        <w:t xml:space="preserve">BOTH = Messages  ·  stamp “the first night”  ·  clock 11:51</w:t>
       </w:r>
     </w:p>
     <w:p>
@@ -16295,7 +16602,7 @@
           <w:szCs w:val="18"/>
           <w:rFonts w:ascii="Georgia" w:cs="Georgia" w:eastAsia="Georgia" w:hAnsi="Georgia"/>
         </w:rPr>
-        <w:t xml:space="preserve">Do not send. It is the payoff of Shiksa Goddess, two hours ago.</w:t>
+        <w:t xml:space="preserve">David, Sept 20 — SHE SENDS (this reverses the earlier “do not send”). The send is stamped 11:51, after the call the house watched him take in Shiksa Goddess, so his phone in Song 2 is not contradicted. Hold the dark phone through his line; 14.5 takes it away.</w:t>
       </w:r>
     </w:p>
     <w:p>
@@ -16350,7 +16657,7 @@
           <w:szCs w:val="19"/>
           <w:rFonts w:ascii="Georgia" w:cs="Georgia" w:eastAsia="Georgia" w:hAnsi="Georgia"/>
         </w:rPr>
-        <w:t xml:space="preserve">The phone drops mid-word; the pages tear FORWARD to JUNE · YEAR 5 — the breakup — and hold as the last image while he sings his goodbye.</w:t>
+        <w:t xml:space="preserve">The dark phone goes; the pages tear FORWARD to JUNE · YEAR 5 — the breakup — and hold as the last image while he sings his goodbye.</w:t>
       </w:r>
     </w:p>
     <w:p>
@@ -16636,6 +16943,164 @@
           <w:rFonts w:ascii="Courier New" w:cs="Courier New" w:eastAsia="Courier New" w:hAnsi="Courier New"/>
         </w:rPr>
         <w:t xml:space="preserve">true black; the calendar goes</w:t>
+      </w:r>
+    </w:p>
+    <w:p>
+      <w:pPr>
+        <w:keepNext/>
+        <w:pBdr>
+          <w:top w:val="single" w:color="d8d2c2" w:sz="4"/>
+        </w:pBdr>
+        <w:spacing w:before="200" w:after="40"/>
+      </w:pPr>
+      <w:r>
+        <w:rPr>
+          <w:b/>
+          <w:bCs/>
+          <w:color w:val="1a1d26"/>
+          <w:sz w:val="22"/>
+          <w:szCs w:val="22"/>
+          <w:rFonts w:ascii="Courier New" w:cs="Courier New" w:eastAsia="Courier New" w:hAnsi="Courier New"/>
+        </w:rPr>
+        <w:t xml:space="preserve">14.7</w:t>
+      </w:r>
+      <w:r>
+        <w:rPr>
+          <w:color w:val="2a5db0"/>
+          <w:sz w:val="17"/>
+          <w:szCs w:val="17"/>
+          <w:rFonts w:ascii="Courier New" w:cs="Courier New" w:eastAsia="Courier New" w:hAnsi="Courier New"/>
+        </w:rPr>
+        <w:t xml:space="preserve">  BOTH · CATHY</w:t>
+      </w:r>
+      <w:r>
+        <w:rPr>
+          <w:i/>
+          <w:iCs/>
+          <w:color w:val="1a1d26"/>
+          <w:sz w:val="19"/>
+          <w:szCs w:val="19"/>
+          <w:rFonts w:ascii="Georgia" w:cs="Georgia" w:eastAsia="Georgia" w:hAnsi="Georgia"/>
+        </w:rPr>
+        <w:t xml:space="preserve">   —  BOWS — the company comes back on</w:t>
+      </w:r>
+    </w:p>
+    <w:p>
+      <w:pPr>
+        <w:keepNext/>
+        <w:spacing w:after="60"/>
+      </w:pPr>
+      <w:r>
+        <w:rPr>
+          <w:color w:val="3a3f4d"/>
+          <w:sz w:val="19"/>
+          <w:szCs w:val="19"/>
+          <w:rFonts w:ascii="Georgia" w:cs="Georgia" w:eastAsia="Georgia" w:hAnsi="Georgia"/>
+        </w:rPr>
+        <w:t xml:space="preserve">The house comes back: the title page center-stage with the photographs flooding behind it, faster than they fell before the show. It holds for as long as the bows run — it never empties and it never ends. The operator’s questionnaire waits until the house lights are up and the show is left.</w:t>
+      </w:r>
+    </w:p>
+    <w:p>
+      <w:pPr>
+        <w:keepNext/>
+        <w:spacing w:after="20"/>
+      </w:pPr>
+      <w:r>
+        <w:rPr>
+          <w:b/>
+          <w:bCs/>
+          <w:color w:val="6b7280"/>
+          <w:sz w:val="16"/>
+          <w:szCs w:val="16"/>
+          <w:rFonts w:ascii="Courier New" w:cs="Courier New" w:eastAsia="Courier New" w:hAnsi="Courier New"/>
+        </w:rPr>
+        <w:t xml:space="preserve">ON SCREEN</w:t>
+      </w:r>
+    </w:p>
+    <w:p>
+      <w:pPr>
+        <w:spacing w:after="14"/>
+        <w:ind w:left="280"/>
+      </w:pPr>
+      <w:r>
+        <w:rPr>
+          <w:b/>
+          <w:bCs/>
+          <w:color w:val="1a1d26"/>
+          <w:sz w:val="18"/>
+          <w:szCs w:val="18"/>
+          <w:rFonts w:ascii="Courier New" w:cs="Courier New" w:eastAsia="Courier New" w:hAnsi="Courier New"/>
+        </w:rPr>
+        <w:t xml:space="preserve">BOWS — </w:t>
+      </w:r>
+      <w:r>
+        <w:rPr>
+          <w:color w:val="1a1d26"/>
+          <w:sz w:val="18"/>
+          <w:szCs w:val="18"/>
+          <w:rFonts w:ascii="Courier New" w:cs="Courier New" w:eastAsia="Courier New" w:hAnsi="Courier New"/>
+        </w:rPr>
+        <w:t xml:space="preserve">the house comes back: the title page center-stage with the photographs flooding behind it, faster than before the show. It holds until the operator comes off the show.</w:t>
+      </w:r>
+    </w:p>
+    <w:p>
+      <w:pPr>
+        <w:keepNext/>
+        <w:spacing w:before="30" w:after="20"/>
+      </w:pPr>
+      <w:r>
+        <w:rPr>
+          <w:b/>
+          <w:bCs/>
+          <w:color w:val="6b7280"/>
+          <w:sz w:val="16"/>
+          <w:szCs w:val="16"/>
+          <w:rFonts w:ascii="Courier New" w:cs="Courier New" w:eastAsia="Courier New" w:hAnsi="Courier New"/>
+        </w:rPr>
+        <w:t xml:space="preserve">PLAYS</w:t>
+      </w:r>
+    </w:p>
+    <w:p>
+      <w:pPr>
+        <w:spacing w:after="14"/>
+        <w:ind w:left="280"/>
+      </w:pPr>
+      <w:r>
+        <w:rPr>
+          <w:color w:val="3a3f4d"/>
+          <w:sz w:val="18"/>
+          <w:szCs w:val="18"/>
+          <w:rFonts w:ascii="Georgia" w:cs="Georgia" w:eastAsia="Georgia" w:hAnsi="Georgia"/>
+        </w:rPr>
+        <w:t xml:space="preserve">the title page and the photo bed come back up and stay up; the operator’s questionnaire is held back until the show is left</w:t>
+      </w:r>
+    </w:p>
+    <w:p>
+      <w:pPr>
+        <w:shd w:fill="faf3dc" w:val="clear"/>
+        <w:spacing w:before="30" w:after="14"/>
+      </w:pPr>
+      <w:r>
+        <w:rPr>
+          <w:b/>
+          <w:bCs/>
+          <w:color w:val="8a6d10"/>
+          <w:sz w:val="17"/>
+          <w:szCs w:val="17"/>
+          <w:rFonts w:ascii="Courier New" w:cs="Courier New" w:eastAsia="Courier New" w:hAnsi="Courier New"/>
+        </w:rPr>
+        <w:t xml:space="preserve">HOLD · </w:t>
+      </w:r>
+      <w:r>
+        <w:rPr>
+          <w:i/>
+          <w:iCs/>
+          <w:color w:val="8a6d10"/>
+          <w:sz w:val="18"/>
+          <w:szCs w:val="18"/>
+          <w:rFonts w:ascii="Georgia" w:cs="Georgia" w:eastAsia="Georgia" w:hAnsi="Georgia"/>
+        </w:rPr>
+        <w:t xml:space="preserve">Nothing to fire after this. When the bows are over, ☰ MENU (or esc) comes off the show and the gate asks tonight’s questions again for the next performance.</w:t>
       </w:r>
     </w:p>
     <w:sectPr>

</xml_diff>

<commit_message>
Rebuild artifacts from 77d52ba
The gate's own build step: the stamped build, the STANDALONE, docs/index.html
and the two Bible renders. Source unchanged.

Co-Authored-By: Claude Opus 5 <noreply@anthropic.com>
Claude-Session: https://claude.ai/code/session_01Y6sUkZbYffNPeDjzCChZiy
</commit_message>
<xml_diff>
--- a/L5Y-Cue-Bible.docx
+++ b/L5Y-Cue-Bible.docx
@@ -65,7 +65,7 @@
           <w:szCs w:val="19"/>
           <w:rFonts w:ascii="Georgia" w:cs="Georgia" w:eastAsia="Georgia" w:hAnsi="Georgia"/>
         </w:rPr>
-        <w:t xml:space="preserve">67 cues · 14 songs · generated from the live show build, so this document cannot drift from what the phones actually do</w:t>
+        <w:t xml:space="preserve">68 cues · 14 songs · generated from the live show build, so this document cannot drift from what the phones actually do</w:t>
       </w:r>
     </w:p>
     <w:p>
@@ -10469,7 +10469,7 @@
           <w:szCs w:val="18"/>
           <w:rFonts w:ascii="Courier New" w:cs="Courier New" w:eastAsia="Courier New" w:hAnsi="Courier New"/>
         </w:rPr>
-        <w:t xml:space="preserve">   JAMIE SINGS · 8 FIRES</w:t>
+        <w:t xml:space="preserve">   JAMIE SINGS · 9 FIRES</w:t>
       </w:r>
     </w:p>
     <w:p>
@@ -10873,7 +10873,7 @@
           <w:szCs w:val="22"/>
           <w:rFonts w:ascii="Courier New" w:cs="Courier New" w:eastAsia="Courier New" w:hAnsi="Courier New"/>
         </w:rPr>
-        <w:t xml:space="preserve">9.3</w:t>
+        <w:t xml:space="preserve">9.2a</w:t>
       </w:r>
       <w:r>
         <w:rPr>
@@ -10893,7 +10893,7 @@
           <w:szCs w:val="19"/>
           <w:rFonts w:ascii="Georgia" w:cs="Georgia" w:eastAsia="Georgia" w:hAnsi="Georgia"/>
         </w:rPr>
-        <w:t xml:space="preserve">   —  “wouldn’t give you the time of day before” — GO</w:t>
+        <w:t xml:space="preserve">   —  ON THE NEXT PHRASE — GO (no specific line; the second card)</w:t>
       </w:r>
     </w:p>
     <w:p>
@@ -10908,7 +10908,7 @@
           <w:szCs w:val="19"/>
           <w:rFonts w:ascii="Georgia" w:cs="Georgia" w:eastAsia="Georgia" w:hAnsi="Georgia"/>
         </w:rPr>
-        <w:t xml:space="preserve">Two at once — a message request he cannot read, and one he can. paige.turner is not shy.</w:t>
+        <w:t xml:space="preserve">A message request from a stranger. It says only that she wants to send one — a real iPhone shows no preview text for a request from someone he does not follow.</w:t>
       </w:r>
     </w:p>
     <w:p>
@@ -10956,32 +10956,6 @@
     </w:p>
     <w:p>
       <w:pPr>
-        <w:spacing w:after="14"/>
-        <w:ind w:left="280"/>
-      </w:pPr>
-      <w:r>
-        <w:rPr>
-          <w:b/>
-          <w:bCs/>
-          <w:color w:val="1a1d26"/>
-          <w:sz w:val="18"/>
-          <w:szCs w:val="18"/>
-          <w:rFonts w:ascii="Courier New" w:cs="Courier New" w:eastAsia="Courier New" w:hAnsi="Courier New"/>
-        </w:rPr>
-        <w:t xml:space="preserve">NOTIFICATION — Instagram · paige.turner (now): </w:t>
-      </w:r>
-      <w:r>
-        <w:rPr>
-          <w:color w:val="1a1d26"/>
-          <w:sz w:val="18"/>
-          <w:szCs w:val="18"/>
-          <w:rFonts w:ascii="Courier New" w:cs="Courier New" w:eastAsia="Courier New" w:hAnsi="Courier New"/>
-        </w:rPr>
-        <w:t xml:space="preserve">“commented: Hey handsome, didn’t know an author could be so handsome ;)”</w:t>
-      </w:r>
-    </w:p>
-    <w:p>
-      <w:pPr>
         <w:keepNext/>
         <w:spacing w:before="30" w:after="20"/>
       </w:pPr>
@@ -11046,30 +11020,164 @@
     </w:p>
     <w:p>
       <w:pPr>
-        <w:shd w:fill="faf3dc" w:val="clear"/>
-        <w:spacing w:before="30" w:after="14"/>
-      </w:pPr>
-      <w:r>
-        <w:rPr>
-          <w:b/>
-          <w:bCs/>
-          <w:color w:val="8a6d10"/>
+        <w:keepNext/>
+        <w:pBdr>
+          <w:top w:val="single" w:color="d8d2c2" w:sz="4"/>
+        </w:pBdr>
+        <w:spacing w:before="200" w:after="40"/>
+      </w:pPr>
+      <w:r>
+        <w:rPr>
+          <w:b/>
+          <w:bCs/>
+          <w:color w:val="1a1d26"/>
+          <w:sz w:val="22"/>
+          <w:szCs w:val="22"/>
+          <w:rFonts w:ascii="Courier New" w:cs="Courier New" w:eastAsia="Courier New" w:hAnsi="Courier New"/>
+        </w:rPr>
+        <w:t xml:space="preserve">9.3</w:t>
+      </w:r>
+      <w:r>
+        <w:rPr>
+          <w:color w:val="2a5db0"/>
           <w:sz w:val="17"/>
           <w:szCs w:val="17"/>
           <w:rFonts w:ascii="Courier New" w:cs="Courier New" w:eastAsia="Courier New" w:hAnsi="Courier New"/>
         </w:rPr>
-        <w:t xml:space="preserve">HOLD · </w:t>
+        <w:t xml:space="preserve">  SL · JAMIE · Lock screen</w:t>
       </w:r>
       <w:r>
         <w:rPr>
           <w:i/>
           <w:iCs/>
-          <w:color w:val="8a6d10"/>
-          <w:sz w:val="18"/>
-          <w:szCs w:val="18"/>
-          <w:rFonts w:ascii="Georgia" w:cs="Georgia" w:eastAsia="Georgia" w:hAnsi="Georgia"/>
-        </w:rPr>
-        <w:t xml:space="preserve">Two cards land together. lit.with.lena is a message request, so it says only that she wants to send one; paige.turner is a comment, so hers carries its words. Paige arrives second, so she is the card on top.</w:t>
+          <w:color w:val="1a1d26"/>
+          <w:sz w:val="19"/>
+          <w:szCs w:val="19"/>
+          <w:rFonts w:ascii="Georgia" w:cs="Georgia" w:eastAsia="Georgia" w:hAnsi="Georgia"/>
+        </w:rPr>
+        <w:t xml:space="preserve">   —  “Every other woman in the world suddenly finds you attractive” — GO</w:t>
+      </w:r>
+    </w:p>
+    <w:p>
+      <w:pPr>
+        <w:keepNext/>
+        <w:spacing w:after="60"/>
+      </w:pPr>
+      <w:r>
+        <w:rPr>
+          <w:color w:val="3a3f4d"/>
+          <w:sz w:val="19"/>
+          <w:szCs w:val="19"/>
+          <w:rFonts w:ascii="Georgia" w:cs="Georgia" w:eastAsia="Georgia" w:hAnsi="Georgia"/>
+        </w:rPr>
+        <w:t xml:space="preserve">And one who is not shy. Hers is a comment, so it carries its words; it lands on top.</w:t>
+      </w:r>
+    </w:p>
+    <w:p>
+      <w:pPr>
+        <w:keepNext/>
+        <w:spacing w:after="20"/>
+      </w:pPr>
+      <w:r>
+        <w:rPr>
+          <w:b/>
+          <w:bCs/>
+          <w:color w:val="6b7280"/>
+          <w:sz w:val="16"/>
+          <w:szCs w:val="16"/>
+          <w:rFonts w:ascii="Courier New" w:cs="Courier New" w:eastAsia="Courier New" w:hAnsi="Courier New"/>
+        </w:rPr>
+        <w:t xml:space="preserve">ON SCREEN</w:t>
+      </w:r>
+    </w:p>
+    <w:p>
+      <w:pPr>
+        <w:spacing w:after="14"/>
+        <w:ind w:left="280"/>
+      </w:pPr>
+      <w:r>
+        <w:rPr>
+          <w:b/>
+          <w:bCs/>
+          <w:color w:val="1a1d26"/>
+          <w:sz w:val="18"/>
+          <w:szCs w:val="18"/>
+          <w:rFonts w:ascii="Courier New" w:cs="Courier New" w:eastAsia="Courier New" w:hAnsi="Courier New"/>
+        </w:rPr>
+        <w:t xml:space="preserve">NOTIFICATION — Instagram · paige.turner (now): </w:t>
+      </w:r>
+      <w:r>
+        <w:rPr>
+          <w:color w:val="1a1d26"/>
+          <w:sz w:val="18"/>
+          <w:szCs w:val="18"/>
+          <w:rFonts w:ascii="Courier New" w:cs="Courier New" w:eastAsia="Courier New" w:hAnsi="Courier New"/>
+        </w:rPr>
+        <w:t xml:space="preserve">“commented: Hey handsome, didn’t know an author could be so handsome ;)”</w:t>
+      </w:r>
+    </w:p>
+    <w:p>
+      <w:pPr>
+        <w:keepNext/>
+        <w:spacing w:before="30" w:after="20"/>
+      </w:pPr>
+      <w:r>
+        <w:rPr>
+          <w:b/>
+          <w:bCs/>
+          <w:color w:val="6b7280"/>
+          <w:sz w:val="16"/>
+          <w:szCs w:val="16"/>
+          <w:rFonts w:ascii="Courier New" w:cs="Courier New" w:eastAsia="Courier New" w:hAnsi="Courier New"/>
+        </w:rPr>
+        <w:t xml:space="preserve">PLAYS</w:t>
+      </w:r>
+    </w:p>
+    <w:p>
+      <w:pPr>
+        <w:spacing w:after="14"/>
+        <w:ind w:left="280"/>
+      </w:pPr>
+      <w:r>
+        <w:rPr>
+          <w:color w:val="3a3f4d"/>
+          <w:sz w:val="18"/>
+          <w:szCs w:val="18"/>
+          <w:rFonts w:ascii="Georgia" w:cs="Georgia" w:eastAsia="Georgia" w:hAnsi="Georgia"/>
+        </w:rPr>
+        <w:t xml:space="preserve">sound: receive ding</w:t>
+      </w:r>
+    </w:p>
+    <w:p>
+      <w:pPr>
+        <w:keepNext/>
+        <w:spacing w:before="26" w:after="20"/>
+      </w:pPr>
+      <w:r>
+        <w:rPr>
+          <w:b/>
+          <w:bCs/>
+          <w:color w:val="6b7280"/>
+          <w:sz w:val="16"/>
+          <w:szCs w:val="16"/>
+          <w:rFonts w:ascii="Courier New" w:cs="Courier New" w:eastAsia="Courier New" w:hAnsi="Courier New"/>
+        </w:rPr>
+        <w:t xml:space="preserve">SOUND</w:t>
+      </w:r>
+    </w:p>
+    <w:p>
+      <w:pPr>
+        <w:spacing w:after="14"/>
+        <w:ind w:left="280"/>
+      </w:pPr>
+      <w:r>
+        <w:rPr>
+          <w:color w:val="6a5a20"/>
+          <w:sz w:val="18"/>
+          <w:szCs w:val="18"/>
+          <w:rFonts w:ascii="Georgia" w:cs="Georgia" w:eastAsia="Georgia" w:hAnsi="Georgia"/>
+        </w:rPr>
+        <w:t xml:space="preserve">notification tri-tone (soft)</w:t>
       </w:r>
     </w:p>
     <w:p>

</xml_diff>

<commit_message>
12.2: the missed exit; the house photo bed is a wall, not weather
The drive opens with an exit less than a mile ahead; fifty seconds in she
sails past it, Maps reroutes with the blue line gone for a beat, and the
trip card jumps: 45 minutes and 33 miles more, a later arrival. Nothing is
highlighted. The exit is cue data on 12.2 (secs, reroute, addMins, addMiles).

The preshow, intermission and bows bed no longer falls: six fixed places
beside the card, one print at a time fading up, sitting and fading away,
a few degrees of fixed tilt. The falling mode stays in the engine (PILE_MODE).

Co-Authored-By: Claude Fable 5.1 <noreply@anthropic.com>
Claude-Session: https://claude.ai/code/session_01Y6sUkZbYffNPeDjzCChZiy
</commit_message>
<xml_diff>
--- a/L5Y-Cue-Bible.docx
+++ b/L5Y-Cue-Bible.docx
@@ -14069,7 +14069,7 @@
           <w:szCs w:val="19"/>
           <w:rFonts w:ascii="Georgia" w:cs="Georgia" w:eastAsia="Georgia" w:hAnsi="Georgia"/>
         </w:rPr>
-        <w:t xml:space="preserve">THE DRIVE, ON THE DASH. The calendar rolls back and holds; then it docks and CarPlay takes the frame for the rest of the song: Apple Maps, the puck riding the route from New York to the Eastern Shore, the miles and minutes falling, each maneuver counting down, the drive in real time. The exit for the Delaware Memorial Bridge comes mid-song and she never arrives before the last chord (tune `rate`/`startAt` in tech). On the final chord the dash goes dark and NOVEMBER · YEAR 1 holds.</w:t>
+        <w:t xml:space="preserve">THE DRIVE, ON THE DASH, IN REAL TIME. CarPlay, Apple Maps, New York to the Eastern Shore, an exit less than a mile ahead. The banner counts it down for about fifty seconds and she sails past it: Maps reroutes, the blue line drops out for a beat, and the trip card jumps — forty-five minutes and thirty-three miles more, the arrival later. Nothing is highlighted; the numbers just change. The drive keeps running to the last chord and she never gets there.</w:t>
       </w:r>
     </w:p>
     <w:p>
@@ -14276,7 +14276,7 @@
           <w:szCs w:val="19"/>
           <w:rFonts w:ascii="Georgia" w:cs="Georgia" w:eastAsia="Georgia" w:hAnsi="Georgia"/>
         </w:rPr>
-        <w:t xml:space="preserve">The calendar docks to the right and the dash lights up — CarPlay, already navigating: Apple Maps, New York to the Eastern Shore, the head unit filling the frame. The drive runs in REAL TIME for the rest of the song: the puck rides the route, the miles and the minutes fall, and the Delaware Memorial Bridge exit arrives mid-song. She never gets there before the last chord; that is the point.</w:t>
+        <w:t xml:space="preserve">The calendar docks to the right and the dash lights up — CarPlay, already navigating: Apple Maps, New York to the Eastern Shore, the head unit filling the frame, an exit less than a mile ahead. The drive runs in REAL TIME: the banner counts the exit down for about fifty seconds and she sails past it. Maps goes to “Rerouting…”, the blue line drops out for a beat, then the next maneuver comes up and the trip card jumps — 45 minutes and 33 miles more, the arrival later. Nothing is highlighted; the numbers just change. The drive keeps running to the last chord and she never gets there; that is the point.</w:t>
       </w:r>
     </w:p>
     <w:p>
@@ -14430,7 +14430,7 @@
           <w:szCs w:val="18"/>
           <w:rFonts w:ascii="Georgia" w:cs="Georgia" w:eastAsia="Georgia" w:hAnsi="Georgia"/>
         </w:rPr>
-        <w:t xml:space="preserve">`rate` (trip minutes per real minute; 1 = real time) and `startAt` (fraction of the trip at GO) live on this cue — tune in tech.</w:t>
+        <w:t xml:space="preserve">`rate` (trip minutes per real minute; 1 = real time) and `startAt` (fraction of the trip at GO) live on this cue; the missed exit is `exit` — `secs` after GO it is missed, `reroute` seconds of thinking, `addMins` / `addMiles` the price. Tune in tech.</w:t>
       </w:r>
     </w:p>
     <w:p>

</xml_diff>

<commit_message>
Song 3: the lake bed 25% quieter; the foot line reads River in Ohio
Co-Authored-By: Claude Fable 5.1 <noreply@anthropic.com>
Claude-Session: https://claude.ai/code/session_01Y6sUkZbYffNPeDjzCChZiy
</commit_message>
<xml_diff>
--- a/L5Y-Cue-Bible.docx
+++ b/L5Y-Cue-Bible.docx
@@ -5436,7 +5436,7 @@
           <w:szCs w:val="18"/>
           <w:rFonts w:ascii="Courier New" w:cs="Courier New" w:eastAsia="Courier New" w:hAnsi="Courier New"/>
         </w:rPr>
-        <w:t xml:space="preserve">“Ohio · her birthday”</w:t>
+        <w:t xml:space="preserve">“River in Ohio · her birthday”</w:t>
       </w:r>
     </w:p>
     <w:p>
@@ -5941,7 +5941,7 @@
           <w:szCs w:val="18"/>
           <w:rFonts w:ascii="Courier New" w:cs="Courier New" w:eastAsia="Courier New" w:hAnsi="Courier New"/>
         </w:rPr>
-        <w:t xml:space="preserve">“Ohio · her birthday”</w:t>
+        <w:t xml:space="preserve">“River in Ohio · her birthday”</w:t>
       </w:r>
     </w:p>
     <w:p>
@@ -6446,7 +6446,7 @@
           <w:szCs w:val="18"/>
           <w:rFonts w:ascii="Courier New" w:cs="Courier New" w:eastAsia="Courier New" w:hAnsi="Courier New"/>
         </w:rPr>
-        <w:t xml:space="preserve">“Ohio · her birthday”</w:t>
+        <w:t xml:space="preserve">“River in Ohio · her birthday”</w:t>
       </w:r>
     </w:p>
     <w:p>

</xml_diff>

<commit_message>
9.6a is the card alone and 9.7 is gone; 10.1 runs about five seconds faster
- 9.6a rolls home to October Year 4 and holds. No phone comes up, so
  the final-chord cue that dropped it has nothing to do and is removed.
- 10.1: a clock op may carry its own roll length. The roll back to
  February Year 3 is 2.6 s, the two cards land 0.25 s and 0.9 s after the
  dock, so his text is on the lock screen about six seconds of schedule
  sooner than before.
- The mail-first check keeps its order but its gap floor follows the
  new pacing. The Bible prose for song 9 follows the cue.

Co-Authored-By: Claude Fable 5.1 <noreply@anthropic.com>
Claude-Session: https://claude.ai/code/session_01Y6sUkZbYffNPeDjzCChZiy
</commit_message>
<xml_diff>
--- a/L5Y-Cue-Bible.docx
+++ b/L5Y-Cue-Bible.docx
@@ -65,7 +65,7 @@
           <w:szCs w:val="19"/>
           <w:rFonts w:ascii="Georgia" w:cs="Georgia" w:eastAsia="Georgia" w:hAnsi="Georgia"/>
         </w:rPr>
-        <w:t xml:space="preserve">69 cues · 14 songs · generated from the live show build, so this document cannot drift from what the phones actually do</w:t>
+        <w:t xml:space="preserve">68 cues · 14 songs · generated from the live show build, so this document cannot drift from what the phones actually do</w:t>
       </w:r>
     </w:p>
     <w:p>
@@ -10572,7 +10572,7 @@
           <w:szCs w:val="18"/>
           <w:rFonts w:ascii="Courier New" w:cs="Courier New" w:eastAsia="Courier New" w:hAnsi="Courier New"/>
         </w:rPr>
-        <w:t xml:space="preserve">   JAMIE SINGS · 10 FIRES</w:t>
+        <w:t xml:space="preserve">   JAMIE SINGS · 9 FIRES</w:t>
       </w:r>
     </w:p>
     <w:p>
@@ -10587,7 +10587,7 @@
           <w:szCs w:val="19"/>
           <w:rFonts w:ascii="Georgia" w:cs="Georgia" w:eastAsia="Georgia" w:hAnsi="Georgia"/>
         </w:rPr>
-        <w:t xml:space="preserve">NOTIFICATIONS, AND HER AUDITION INSIDE HIS SONG. The Intermission page tears and the calendar rolls to OCTOBER · YEAR 4 on its own GO; his phone comes up on the next. His married year arrives as a stack he never touches — readers, the growing book, Elise, front row — and he never once interacts with it. Then his phone goes and the stage becomes hers: APRIL · YEAR 3, the Ohio audition, the one she gets. On her line about coming home it rolls forward again and his phone returns exactly as he left it.</w:t>
+        <w:t xml:space="preserve">NOTIFICATIONS, AND HER AUDITION INSIDE HIS SONG. The Intermission page tears and the calendar rolls to OCTOBER · YEAR 4 on its own GO; his phone comes up on the next. His married year arrives as a stack he never touches — readers, the growing book, Elise, front row — and he never once interacts with it. Then his phone goes and the stage becomes hers: APRIL · YEAR 3, the Ohio audition, the one she gets. On her line about coming home it rolls forward again to OCTOBER · YEAR 4 and holds there, the card alone, to the final chord.</w:t>
       </w:r>
     </w:p>
     <w:p>
@@ -12084,7 +12084,7 @@
           <w:szCs w:val="17"/>
           <w:rFonts w:ascii="Courier New" w:cs="Courier New" w:eastAsia="Courier New" w:hAnsi="Courier New"/>
         </w:rPr>
-        <w:t xml:space="preserve">  SL · JAMIE · Lock screen</w:t>
+        <w:t xml:space="preserve">  SL · JAMIE</w:t>
       </w:r>
       <w:r>
         <w:rPr>
@@ -12110,7 +12110,7 @@
           <w:szCs w:val="19"/>
           <w:rFonts w:ascii="Georgia" w:cs="Georgia" w:eastAsia="Georgia" w:hAnsi="Georgia"/>
         </w:rPr>
-        <w:t xml:space="preserve">The calendar rolls FORWARD home — APRIL · YEAR 3 to OCTOBER · YEAR 4 — and docks; his phone comes back exactly as he left it, the whole stack still on the lock screen.</w:t>
+        <w:t xml:space="preserve">The calendar rolls FORWARD home — APRIL · YEAR 3 to OCTOBER · YEAR 4 — and holds in the centre. No phone: the card alone, to the end of the song.</w:t>
       </w:r>
     </w:p>
     <w:p>
@@ -12184,59 +12184,72 @@
     </w:p>
     <w:p>
       <w:pPr>
-        <w:keepNext/>
-        <w:spacing w:before="30" w:after="20"/>
-      </w:pPr>
-      <w:r>
-        <w:rPr>
-          <w:b/>
-          <w:bCs/>
-          <w:color w:val="6b7280"/>
-          <w:sz w:val="16"/>
-          <w:szCs w:val="16"/>
-          <w:rFonts w:ascii="Courier New" w:cs="Courier New" w:eastAsia="Courier New" w:hAnsi="Courier New"/>
-        </w:rPr>
-        <w:t xml:space="preserve">PLAYS</w:t>
-      </w:r>
-    </w:p>
-    <w:p>
-      <w:pPr>
-        <w:spacing w:after="14"/>
-        <w:ind w:left="280"/>
-      </w:pPr>
-      <w:r>
-        <w:rPr>
-          <w:color w:val="3a3f4d"/>
-          <w:sz w:val="18"/>
-          <w:szCs w:val="18"/>
-          <w:rFonts w:ascii="Georgia" w:cs="Georgia" w:eastAsia="Georgia" w:hAnsi="Georgia"/>
-        </w:rPr>
-        <w:t xml:space="preserve">the iPhone shell appears — JAMIE’s screen</w:t>
-      </w:r>
-    </w:p>
-    <w:p>
-      <w:pPr>
+        <w:shd w:fill="faf3dc" w:val="clear"/>
         <w:spacing w:before="30" w:after="14"/>
       </w:pPr>
       <w:r>
         <w:rPr>
           <w:b/>
           <w:bCs/>
-          <w:color w:val="6b7280"/>
-          <w:sz w:val="16"/>
-          <w:szCs w:val="16"/>
-          <w:rFonts w:ascii="Courier New" w:cs="Courier New" w:eastAsia="Courier New" w:hAnsi="Courier New"/>
-        </w:rPr>
-        <w:t xml:space="preserve">PHONES  </w:t>
-      </w:r>
-      <w:r>
-        <w:rPr>
-          <w:color w:val="6b7280"/>
+          <w:color w:val="8a6d10"/>
           <w:sz w:val="17"/>
           <w:szCs w:val="17"/>
           <w:rFonts w:ascii="Courier New" w:cs="Courier New" w:eastAsia="Courier New" w:hAnsi="Courier New"/>
         </w:rPr>
-        <w:t xml:space="preserve">SL = Lock screen  ·  stamp “five months married”  ·  clock 11:31</w:t>
+        <w:t xml:space="preserve">HOLD · </w:t>
+      </w:r>
+      <w:r>
+        <w:rPr>
+          <w:i/>
+          <w:iCs/>
+          <w:color w:val="8a6d10"/>
+          <w:sz w:val="18"/>
+          <w:szCs w:val="18"/>
+          <w:rFonts w:ascii="Georgia" w:cs="Georgia" w:eastAsia="Georgia" w:hAnsi="Georgia"/>
+        </w:rPr>
+        <w:t xml:space="preserve">Hold on the card through the final chord. The next GO is the top of Climbing Uphill.</w:t>
+      </w:r>
+    </w:p>
+    <w:p>
+      <w:pPr>
+        <w:pStyle w:val="Heading1"/>
+        <w:pageBreakBefore/>
+        <w:spacing w:before="200" w:after="60"/>
+      </w:pPr>
+      <w:r>
+        <w:rPr>
+          <w:b/>
+          <w:bCs/>
+          <w:color w:val="1a1d26"/>
+          <w:sz w:val="40"/>
+          <w:szCs w:val="40"/>
+          <w:rFonts w:ascii="Georgia" w:cs="Georgia" w:eastAsia="Georgia" w:hAnsi="Georgia"/>
+        </w:rPr>
+        <w:t xml:space="preserve">10 · Climbing Uphill</w:t>
+      </w:r>
+      <w:r>
+        <w:rPr>
+          <w:color w:val="c2447a"/>
+          <w:sz w:val="18"/>
+          <w:szCs w:val="18"/>
+          <w:rFonts w:ascii="Courier New" w:cs="Courier New" w:eastAsia="Courier New" w:hAnsi="Courier New"/>
+        </w:rPr>
+        <w:t xml:space="preserve">   CATHY SINGS · 6 FIRES</w:t>
+      </w:r>
+    </w:p>
+    <w:p>
+      <w:pPr>
+        <w:shd w:fill="eef0f4" w:val="clear"/>
+        <w:spacing w:after="200"/>
+      </w:pPr>
+      <w:r>
+        <w:rPr>
+          <w:color w:val="1a1d26"/>
+          <w:sz w:val="19"/>
+          <w:szCs w:val="19"/>
+          <w:rFonts w:ascii="Georgia" w:cs="Georgia" w:eastAsia="Georgia" w:hAnsi="Georgia"/>
+        </w:rPr>
+        <w:t xml:space="preserve">THE AUDITION SEQUENCE, AND WHAT HE IS DOING MEANWHILE. “break a leg” lands before her first note — lowercase, three seconds of effort — then a rejection over the lock screen. From there the calendar carries it: her phone drops and time jumps forward to JANUARY · YEAR 5, where his phone rises already on the call with her, the timer running from 0:10; back to FEBRUARY · YEAR 3, audition season, where we left her; forward to FEBRUARY · YEAR 5 and his book reading; and back to NOVEMBER · YEAR 3 — her audition prep, the first time the card says so — to hold to the end of the song.</w:t>
       </w:r>
     </w:p>
     <w:p>
@@ -12256,7 +12269,7 @@
           <w:szCs w:val="22"/>
           <w:rFonts w:ascii="Courier New" w:cs="Courier New" w:eastAsia="Courier New" w:hAnsi="Courier New"/>
         </w:rPr>
-        <w:t xml:space="preserve">9.7</w:t>
+        <w:t xml:space="preserve">10.1</w:t>
       </w:r>
       <w:r>
         <w:rPr>
@@ -12265,7 +12278,7 @@
           <w:szCs w:val="17"/>
           <w:rFonts w:ascii="Courier New" w:cs="Courier New" w:eastAsia="Courier New" w:hAnsi="Courier New"/>
         </w:rPr>
-        <w:t xml:space="preserve">  SL · JAMIE</w:t>
+        <w:t xml:space="preserve">  SR · CATHY · Lock screen</w:t>
       </w:r>
       <w:r>
         <w:rPr>
@@ -12276,7 +12289,7 @@
           <w:szCs w:val="19"/>
           <w:rFonts w:ascii="Georgia" w:cs="Georgia" w:eastAsia="Georgia" w:hAnsi="Georgia"/>
         </w:rPr>
-        <w:t xml:space="preserve">   —  FINAL CHORD — the last note of the song</w:t>
+        <w:t xml:space="preserve">   —  “I swear I will” — the last words of A Miracle Would Happen</w:t>
       </w:r>
     </w:p>
     <w:p>
@@ -12291,7 +12304,7 @@
           <w:szCs w:val="19"/>
           <w:rFonts w:ascii="Georgia" w:cs="Georgia" w:eastAsia="Georgia" w:hAnsi="Georgia"/>
         </w:rPr>
-        <w:t xml:space="preserve">The phone drops; OCTOBER · YEAR 4 holds center.</w:t>
+        <w:t xml:space="preserve">The calendar rolls BACK — OCTOBER · YEAR 4 → FEBRUARY · YEAR 3 — and docks; her phone rises, locked, in the audition hallway. A sign-in reminder sits on the lock screen; then his text lands on top: “break a leg” — lowercase, three seconds of effort.</w:t>
       </w:r>
     </w:p>
     <w:p>
@@ -12325,210 +12338,6 @@
           <w:szCs w:val="18"/>
           <w:rFonts w:ascii="Courier New" w:cs="Courier New" w:eastAsia="Courier New" w:hAnsi="Courier New"/>
         </w:rPr>
-        <w:t xml:space="preserve">PHONE AWAY — </w:t>
-      </w:r>
-      <w:r>
-        <w:rPr>
-          <w:color w:val="1a1d26"/>
-          <w:sz w:val="18"/>
-          <w:szCs w:val="18"/>
-          <w:rFonts w:ascii="Courier New" w:cs="Courier New" w:eastAsia="Courier New" w:hAnsi="Courier New"/>
-        </w:rPr>
-        <w:t xml:space="preserve">the phone drops; the calendar returns to center-stage</w:t>
-      </w:r>
-    </w:p>
-    <w:p>
-      <w:pPr>
-        <w:keepNext/>
-        <w:spacing w:before="30" w:after="20"/>
-      </w:pPr>
-      <w:r>
-        <w:rPr>
-          <w:b/>
-          <w:bCs/>
-          <w:color w:val="6b7280"/>
-          <w:sz w:val="16"/>
-          <w:szCs w:val="16"/>
-          <w:rFonts w:ascii="Courier New" w:cs="Courier New" w:eastAsia="Courier New" w:hAnsi="Courier New"/>
-        </w:rPr>
-        <w:t xml:space="preserve">PLAYS</w:t>
-      </w:r>
-    </w:p>
-    <w:p>
-      <w:pPr>
-        <w:spacing w:after="14"/>
-        <w:ind w:left="280"/>
-      </w:pPr>
-      <w:r>
-        <w:rPr>
-          <w:color w:val="3a3f4d"/>
-          <w:sz w:val="18"/>
-          <w:szCs w:val="18"/>
-          <w:rFonts w:ascii="Georgia" w:cs="Georgia" w:eastAsia="Georgia" w:hAnsi="Georgia"/>
-        </w:rPr>
-        <w:t xml:space="preserve">the device drops; the calendar takes center-stage (never black — true black is the curtain only)</w:t>
-      </w:r>
-    </w:p>
-    <w:p>
-      <w:pPr>
-        <w:keepNext/>
-        <w:spacing w:before="26" w:after="20"/>
-      </w:pPr>
-      <w:r>
-        <w:rPr>
-          <w:b/>
-          <w:bCs/>
-          <w:color w:val="6b7280"/>
-          <w:sz w:val="16"/>
-          <w:szCs w:val="16"/>
-          <w:rFonts w:ascii="Courier New" w:cs="Courier New" w:eastAsia="Courier New" w:hAnsi="Courier New"/>
-        </w:rPr>
-        <w:t xml:space="preserve">SOUND</w:t>
-      </w:r>
-    </w:p>
-    <w:p>
-      <w:pPr>
-        <w:spacing w:after="14"/>
-        <w:ind w:left="280"/>
-      </w:pPr>
-      <w:r>
-        <w:rPr>
-          <w:color w:val="6a5a20"/>
-          <w:sz w:val="18"/>
-          <w:szCs w:val="18"/>
-          <w:rFonts w:ascii="Georgia" w:cs="Georgia" w:eastAsia="Georgia" w:hAnsi="Georgia"/>
-        </w:rPr>
-        <w:t xml:space="preserve">room tone out</w:t>
-      </w:r>
-    </w:p>
-    <w:p>
-      <w:pPr>
-        <w:pStyle w:val="Heading1"/>
-        <w:pageBreakBefore/>
-        <w:spacing w:before="200" w:after="60"/>
-      </w:pPr>
-      <w:r>
-        <w:rPr>
-          <w:b/>
-          <w:bCs/>
-          <w:color w:val="1a1d26"/>
-          <w:sz w:val="40"/>
-          <w:szCs w:val="40"/>
-          <w:rFonts w:ascii="Georgia" w:cs="Georgia" w:eastAsia="Georgia" w:hAnsi="Georgia"/>
-        </w:rPr>
-        <w:t xml:space="preserve">10 · Climbing Uphill</w:t>
-      </w:r>
-      <w:r>
-        <w:rPr>
-          <w:color w:val="c2447a"/>
-          <w:sz w:val="18"/>
-          <w:szCs w:val="18"/>
-          <w:rFonts w:ascii="Courier New" w:cs="Courier New" w:eastAsia="Courier New" w:hAnsi="Courier New"/>
-        </w:rPr>
-        <w:t xml:space="preserve">   CATHY SINGS · 6 FIRES</w:t>
-      </w:r>
-    </w:p>
-    <w:p>
-      <w:pPr>
-        <w:shd w:fill="eef0f4" w:val="clear"/>
-        <w:spacing w:after="200"/>
-      </w:pPr>
-      <w:r>
-        <w:rPr>
-          <w:color w:val="1a1d26"/>
-          <w:sz w:val="19"/>
-          <w:szCs w:val="19"/>
-          <w:rFonts w:ascii="Georgia" w:cs="Georgia" w:eastAsia="Georgia" w:hAnsi="Georgia"/>
-        </w:rPr>
-        <w:t xml:space="preserve">THE AUDITION SEQUENCE, AND WHAT HE IS DOING MEANWHILE. “break a leg” lands before her first note — lowercase, three seconds of effort — then a rejection over the lock screen. From there the calendar carries it: her phone drops and time jumps forward to JANUARY · YEAR 5, where his phone rises already on the call with her, the timer running from 0:10; back to FEBRUARY · YEAR 3, audition season, where we left her; forward to FEBRUARY · YEAR 5 and his book reading; and back to NOVEMBER · YEAR 3 — her audition prep, the first time the card says so — to hold to the end of the song.</w:t>
-      </w:r>
-    </w:p>
-    <w:p>
-      <w:pPr>
-        <w:keepNext/>
-        <w:pBdr>
-          <w:top w:val="single" w:color="d8d2c2" w:sz="4"/>
-        </w:pBdr>
-        <w:spacing w:before="200" w:after="40"/>
-      </w:pPr>
-      <w:r>
-        <w:rPr>
-          <w:b/>
-          <w:bCs/>
-          <w:color w:val="1a1d26"/>
-          <w:sz w:val="22"/>
-          <w:szCs w:val="22"/>
-          <w:rFonts w:ascii="Courier New" w:cs="Courier New" w:eastAsia="Courier New" w:hAnsi="Courier New"/>
-        </w:rPr>
-        <w:t xml:space="preserve">10.1</w:t>
-      </w:r>
-      <w:r>
-        <w:rPr>
-          <w:color w:val="2a5db0"/>
-          <w:sz w:val="17"/>
-          <w:szCs w:val="17"/>
-          <w:rFonts w:ascii="Courier New" w:cs="Courier New" w:eastAsia="Courier New" w:hAnsi="Courier New"/>
-        </w:rPr>
-        <w:t xml:space="preserve">  SR · CATHY · Lock screen</w:t>
-      </w:r>
-      <w:r>
-        <w:rPr>
-          <w:i/>
-          <w:iCs/>
-          <w:color w:val="1a1d26"/>
-          <w:sz w:val="19"/>
-          <w:szCs w:val="19"/>
-          <w:rFonts w:ascii="Georgia" w:cs="Georgia" w:eastAsia="Georgia" w:hAnsi="Georgia"/>
-        </w:rPr>
-        <w:t xml:space="preserve">   —  “I swear I will” — the last words of A Miracle Would Happen</w:t>
-      </w:r>
-    </w:p>
-    <w:p>
-      <w:pPr>
-        <w:keepNext/>
-        <w:spacing w:after="60"/>
-      </w:pPr>
-      <w:r>
-        <w:rPr>
-          <w:color w:val="3a3f4d"/>
-          <w:sz w:val="19"/>
-          <w:szCs w:val="19"/>
-          <w:rFonts w:ascii="Georgia" w:cs="Georgia" w:eastAsia="Georgia" w:hAnsi="Georgia"/>
-        </w:rPr>
-        <w:t xml:space="preserve">The calendar rolls BACK — OCTOBER · YEAR 4 → FEBRUARY · YEAR 3 — and docks; her phone rises, locked, in the audition hallway. A sign-in reminder sits on the lock screen; then his text lands on top: “break a leg” — lowercase, three seconds of effort.</w:t>
-      </w:r>
-    </w:p>
-    <w:p>
-      <w:pPr>
-        <w:keepNext/>
-        <w:spacing w:after="20"/>
-      </w:pPr>
-      <w:r>
-        <w:rPr>
-          <w:b/>
-          <w:bCs/>
-          <w:color w:val="6b7280"/>
-          <w:sz w:val="16"/>
-          <w:szCs w:val="16"/>
-          <w:rFonts w:ascii="Courier New" w:cs="Courier New" w:eastAsia="Courier New" w:hAnsi="Courier New"/>
-        </w:rPr>
-        <w:t xml:space="preserve">ON SCREEN</w:t>
-      </w:r>
-    </w:p>
-    <w:p>
-      <w:pPr>
-        <w:spacing w:after="14"/>
-        <w:ind w:left="280"/>
-      </w:pPr>
-      <w:r>
-        <w:rPr>
-          <w:b/>
-          <w:bCs/>
-          <w:color w:val="1a1d26"/>
-          <w:sz w:val="18"/>
-          <w:szCs w:val="18"/>
-          <w:rFonts w:ascii="Courier New" w:cs="Courier New" w:eastAsia="Courier New" w:hAnsi="Courier New"/>
-        </w:rPr>
         <w:t xml:space="preserve">TIME → </w:t>
       </w:r>
       <w:r>
@@ -12590,7 +12399,7 @@
           <w:szCs w:val="18"/>
           <w:rFonts w:ascii="Courier New" w:cs="Courier New" w:eastAsia="Courier New" w:hAnsi="Courier New"/>
         </w:rPr>
-        <w:t xml:space="preserve">0.7 s)</w:t>
+        <w:t xml:space="preserve">0.2 s)</w:t>
       </w:r>
     </w:p>
     <w:p>
@@ -12642,7 +12451,7 @@
           <w:szCs w:val="18"/>
           <w:rFonts w:ascii="Courier New" w:cs="Courier New" w:eastAsia="Courier New" w:hAnsi="Courier New"/>
         </w:rPr>
-        <w:t xml:space="preserve">3.0 s)</w:t>
+        <w:t xml:space="preserve">0.9 s)</w:t>
       </w:r>
     </w:p>
     <w:p>

</xml_diff>